<commit_message>
doc-model and plot, draf1
</commit_message>
<xml_diff>
--- a/docs/glorieux-specif.docx
+++ b/docs/glorieux-specif.docx
@@ -6,11 +6,26 @@
       <w:pPr>
         <w:pStyle w:val="Title"/>
       </w:pPr>
-      <w:r>
-        <w:t>Calculer les spécificités d’un chapitre de roman</w:t>
-      </w:r>
-      <w:r>
-        <w:t xml:space="preserve">, évaluation </w:t>
+      <w:proofErr w:type="spellStart"/>
+      <w:r>
+        <w:rPr>
+          <w:i/>
+          <w:iCs/>
+        </w:rPr>
+        <w:t>Focalex</w:t>
+      </w:r>
+      <w:proofErr w:type="spellEnd"/>
+      <w:r>
+        <w:t> </w:t>
+      </w:r>
+      <w:r>
+        <w:t>: de la fréquence à l’exclusivité, un</w:t>
+      </w:r>
+      <w:r>
+        <w:t>e formule paramétrable</w:t>
+      </w:r>
+      <w:r>
+        <w:t xml:space="preserve"> de spécificité lexicale</w:t>
       </w:r>
     </w:p>
     <w:p>
@@ -32,7 +47,15 @@
         <w:t xml:space="preserve"> spécificité </w:t>
       </w:r>
       <w:r>
-        <w:t>mesure l’écart à une norme. Dans le cas particulier des moteurs de recherche plein texte (et de la textométrie en général), c’est une formule qui mesure à quel point un</w:t>
+        <w:t xml:space="preserve">mesure l’écart à une norme. Dans le cas particulier des moteurs de recherche plein texte (et de la </w:t>
+      </w:r>
+      <w:proofErr w:type="spellStart"/>
+      <w:r>
+        <w:t>textométrie</w:t>
+      </w:r>
+      <w:proofErr w:type="spellEnd"/>
+      <w:r>
+        <w:t xml:space="preserve"> en général), c’est une formule qui mesure à quel point un</w:t>
       </w:r>
       <w:r>
         <w:t xml:space="preserve"> élément </w:t>
@@ -41,8 +64,19 @@
         <w:t xml:space="preserve">textuel </w:t>
       </w:r>
       <w:r>
-        <w:t xml:space="preserve">(mot, lemme, expression…) est spécifique d’un texte. </w:t>
-      </w:r>
+        <w:t>(mot, lemme, expression…) est spécifique d’un texte</w:t>
+      </w:r>
+      <w:r>
+        <w:t xml:space="preserve"> relativement au reste d’une collection</w:t>
+      </w:r>
+      <w:r>
+        <w:t>.</w:t>
+      </w:r>
+    </w:p>
+    <w:p>
+      <w:pPr>
+        <w:ind w:firstLine="0"/>
+      </w:pPr>
       <w:r>
         <w:t>Depuis Salton (1965)</w:t>
       </w:r>
@@ -153,6 +187,7 @@
       <w:r>
         <w:t xml:space="preserve"> à retrouver (</w:t>
       </w:r>
+      <w:proofErr w:type="spellStart"/>
       <w:r>
         <w:rPr>
           <w:i/>
@@ -160,6 +195,7 @@
         </w:rPr>
         <w:t>retrieval</w:t>
       </w:r>
+      <w:proofErr w:type="spellEnd"/>
       <w:r>
         <w:t>) les documents les plus pertinents pour une requête</w:t>
       </w:r>
@@ -477,8 +513,13 @@
         <w:t>reprise</w:t>
       </w:r>
       <w:r>
-        <w:t xml:space="preserve"> du projet ebalzac</w:t>
-      </w:r>
+        <w:t xml:space="preserve"> du projet </w:t>
+      </w:r>
+      <w:proofErr w:type="spellStart"/>
+      <w:r>
+        <w:t>ebalzac</w:t>
+      </w:r>
+      <w:proofErr w:type="spellEnd"/>
       <w:r>
         <w:rPr>
           <w:rStyle w:val="FootnoteReference"/>
@@ -566,7 +607,11 @@
         <w:t xml:space="preserve"> ou</w:t>
       </w:r>
       <w:r>
-        <w:t xml:space="preserve"> théâtre</w:t>
+        <w:t xml:space="preserve"> </w:t>
+      </w:r>
+      <w:r>
+        <w:lastRenderedPageBreak/>
+        <w:t>théâtre</w:t>
       </w:r>
       <w:r>
         <w:t>…</w:t>
@@ -585,11 +630,7 @@
         <w:t>Les Rougon-Macquart</w:t>
       </w:r>
       <w:r>
-        <w:t xml:space="preserve">, car ils offrent une grande </w:t>
-      </w:r>
-      <w:r>
-        <w:lastRenderedPageBreak/>
-        <w:t>cohérence stylistique.</w:t>
+        <w:t>, car ils offrent une grande cohérence stylistique.</w:t>
       </w:r>
       <w:r>
         <w:t xml:space="preserve"> </w:t>
@@ -706,6 +747,7 @@
       <w:r>
         <w:t>(</w:t>
       </w:r>
+      <w:proofErr w:type="spellStart"/>
       <w:r>
         <w:rPr>
           <w:i/>
@@ -713,6 +755,7 @@
         </w:rPr>
         <w:t>MarkDown</w:t>
       </w:r>
+      <w:proofErr w:type="spellEnd"/>
       <w:r>
         <w:t>)</w:t>
       </w:r>
@@ -890,15 +933,33 @@
           <w:i/>
           <w:iCs/>
         </w:rPr>
-        <w:t>Apache OpenNLP</w:t>
-      </w:r>
-      <w:r>
-        <w:rPr>
-          <w:i/>
-          <w:iCs/>
-        </w:rPr>
-        <w:t xml:space="preserve"> POSTtagger</w:t>
-      </w:r>
+        <w:t xml:space="preserve">Apache </w:t>
+      </w:r>
+      <w:proofErr w:type="spellStart"/>
+      <w:r>
+        <w:rPr>
+          <w:i/>
+          <w:iCs/>
+        </w:rPr>
+        <w:t>OpenNLP</w:t>
+      </w:r>
+      <w:proofErr w:type="spellEnd"/>
+      <w:r>
+        <w:rPr>
+          <w:i/>
+          <w:iCs/>
+        </w:rPr>
+        <w:t xml:space="preserve"> </w:t>
+      </w:r>
+      <w:proofErr w:type="spellStart"/>
+      <w:r>
+        <w:rPr>
+          <w:i/>
+          <w:iCs/>
+        </w:rPr>
+        <w:t>POSTtagger</w:t>
+      </w:r>
+      <w:proofErr w:type="spellEnd"/>
       <w:r>
         <w:rPr>
           <w:rStyle w:val="FootnoteReference"/>
@@ -1031,6 +1092,7 @@
       <w:r>
         <w:t xml:space="preserve">Le </w:t>
       </w:r>
+      <w:proofErr w:type="spellStart"/>
       <w:r>
         <w:rPr>
           <w:i/>
@@ -1038,13 +1100,23 @@
         </w:rPr>
         <w:t>POSTtagger</w:t>
       </w:r>
-      <w:r>
-        <w:rPr>
-          <w:i/>
-          <w:iCs/>
-        </w:rPr>
-        <w:t xml:space="preserve"> OpenNLP</w:t>
-      </w:r>
+      <w:proofErr w:type="spellEnd"/>
+      <w:r>
+        <w:rPr>
+          <w:i/>
+          <w:iCs/>
+        </w:rPr>
+        <w:t xml:space="preserve"> </w:t>
+      </w:r>
+      <w:proofErr w:type="spellStart"/>
+      <w:r>
+        <w:rPr>
+          <w:i/>
+          <w:iCs/>
+        </w:rPr>
+        <w:t>OpenNLP</w:t>
+      </w:r>
+      <w:proofErr w:type="spellEnd"/>
       <w:r>
         <w:t xml:space="preserve"> </w:t>
       </w:r>
@@ -1087,6 +1159,7 @@
       <w:r>
         <w:t xml:space="preserve"> </w:t>
       </w:r>
+      <w:proofErr w:type="spellStart"/>
       <w:r>
         <w:rPr>
           <w:i/>
@@ -1094,6 +1167,7 @@
         </w:rPr>
         <w:t>spaCy</w:t>
       </w:r>
+      <w:proofErr w:type="spellEnd"/>
       <w:r>
         <w:rPr>
           <w:rStyle w:val="FootnoteReference"/>
@@ -1109,6 +1183,7 @@
       <w:r>
         <w:t xml:space="preserve"> </w:t>
       </w:r>
+      <w:proofErr w:type="spellStart"/>
       <w:r>
         <w:rPr>
           <w:i/>
@@ -1116,6 +1191,7 @@
         </w:rPr>
         <w:t>TreeTagger</w:t>
       </w:r>
+      <w:proofErr w:type="spellEnd"/>
       <w:r>
         <w:rPr>
           <w:rStyle w:val="FootnoteReference"/>
@@ -1140,6 +1216,7 @@
       <w:r>
         <w:t xml:space="preserve"> </w:t>
       </w:r>
+      <w:proofErr w:type="spellStart"/>
       <w:r>
         <w:rPr>
           <w:i/>
@@ -1147,6 +1224,7 @@
         </w:rPr>
         <w:t>OpenNLP</w:t>
       </w:r>
+      <w:proofErr w:type="spellEnd"/>
       <w:r>
         <w:t xml:space="preserve"> peuvent être informés par des dictionnaires utilisateurs</w:t>
       </w:r>
@@ -1283,6 +1361,8 @@
       <w:pPr>
         <w:ind w:firstLine="0"/>
       </w:pPr>
+      <w:proofErr w:type="spellStart"/>
+      <w:proofErr w:type="gramStart"/>
       <w:r>
         <w:rPr>
           <w:i/>
@@ -1290,6 +1370,8 @@
         </w:rPr>
         <w:t>tf</w:t>
       </w:r>
+      <w:proofErr w:type="spellEnd"/>
+      <w:proofErr w:type="gramEnd"/>
       <w:r>
         <w:t>, f</w:t>
       </w:r>
@@ -1304,12 +1386,15 @@
       <w:pPr>
         <w:ind w:firstLine="0"/>
       </w:pPr>
+      <w:proofErr w:type="spellStart"/>
       <w:r>
         <w:t>Tfidf</w:t>
       </w:r>
+      <w:proofErr w:type="spellEnd"/>
       <w:r>
         <w:t xml:space="preserve">, </w:t>
       </w:r>
+      <w:proofErr w:type="spellStart"/>
       <w:r>
         <w:rPr>
           <w:i/>
@@ -1317,9 +1402,11 @@
         </w:rPr>
         <w:t>tf</w:t>
       </w:r>
+      <w:proofErr w:type="spellEnd"/>
       <w:r>
         <w:t xml:space="preserve"> log (N / </w:t>
       </w:r>
+      <w:proofErr w:type="spellStart"/>
       <w:r>
         <w:rPr>
           <w:i/>
@@ -1327,17 +1414,31 @@
         </w:rPr>
         <w:t>df</w:t>
       </w:r>
+      <w:proofErr w:type="spellEnd"/>
       <w:r>
         <w:t>),</w:t>
       </w:r>
       <w:r>
         <w:t xml:space="preserve"> </w:t>
       </w:r>
-      <w:r>
-        <w:t>fréquenc d’un terme</w:t>
-      </w:r>
-      <w:r>
-        <w:t xml:space="preserve"> multipliée par l’inverse </w:t>
+      <w:proofErr w:type="spellStart"/>
+      <w:r>
+        <w:t>fréquenc</w:t>
+      </w:r>
+      <w:proofErr w:type="spellEnd"/>
+      <w:r>
+        <w:t xml:space="preserve"> </w:t>
+      </w:r>
+      <w:proofErr w:type="gramStart"/>
+      <w:r>
+        <w:t>d’un terme</w:t>
+      </w:r>
+      <w:r>
+        <w:t xml:space="preserve"> multipliée</w:t>
+      </w:r>
+      <w:proofErr w:type="gramEnd"/>
+      <w:r>
+        <w:t xml:space="preserve"> par l’inverse </w:t>
       </w:r>
     </w:p>
     <w:p>
@@ -1345,15 +1446,28 @@
         <w:ind w:firstLine="0"/>
       </w:pPr>
       <w:r>
-        <w:t>BM25 (lucene)</w:t>
+        <w:t>BM25 (</w:t>
+      </w:r>
+      <w:proofErr w:type="spellStart"/>
+      <w:r>
+        <w:t>lucene</w:t>
+      </w:r>
+      <w:proofErr w:type="spellEnd"/>
+      <w:r>
+        <w:t>)</w:t>
       </w:r>
     </w:p>
     <w:p>
       <w:pPr>
         <w:ind w:firstLine="0"/>
       </w:pPr>
-      <w:r>
-        <w:t>Lafon… no</w:t>
+      <w:proofErr w:type="spellStart"/>
+      <w:r>
+        <w:t>Lafon</w:t>
+      </w:r>
+      <w:proofErr w:type="spellEnd"/>
+      <w:r>
+        <w:t>… no</w:t>
       </w:r>
     </w:p>
     <w:p>
@@ -1703,6 +1817,8 @@
       <w:pPr>
         <w:ind w:firstLine="0"/>
       </w:pPr>
+      <w:proofErr w:type="spellStart"/>
+      <w:proofErr w:type="gramStart"/>
       <w:r>
         <w:rPr>
           <w:i/>
@@ -1710,6 +1826,8 @@
         </w:rPr>
         <w:t>tf</w:t>
       </w:r>
+      <w:proofErr w:type="spellEnd"/>
+      <w:proofErr w:type="gramEnd"/>
       <w:r>
         <w:t xml:space="preserve"> : </w:t>
       </w:r>
@@ -1738,12 +1856,21 @@
       <w:pPr>
         <w:ind w:firstLine="0"/>
       </w:pPr>
-      <w:r>
-        <w:rPr>
-          <w:i/>
-          <w:iCs/>
-        </w:rPr>
-        <w:t>g2</w:t>
+      <w:proofErr w:type="gramStart"/>
+      <w:r>
+        <w:rPr>
+          <w:i/>
+          <w:iCs/>
+        </w:rPr>
+        <w:t>g</w:t>
+      </w:r>
+      <w:proofErr w:type="gramEnd"/>
+      <w:r>
+        <w:rPr>
+          <w:i/>
+          <w:iCs/>
+        </w:rPr>
+        <w:t>2</w:t>
       </w:r>
       <w:r>
         <w:t xml:space="preserve"> : </w:t>
@@ -1759,6 +1886,8 @@
       <w:pPr>
         <w:ind w:firstLine="0"/>
       </w:pPr>
+      <w:proofErr w:type="spellStart"/>
+      <w:proofErr w:type="gramStart"/>
       <w:r>
         <w:rPr>
           <w:i/>
@@ -1766,6 +1895,8 @@
         </w:rPr>
         <w:t>lafon</w:t>
       </w:r>
+      <w:proofErr w:type="spellEnd"/>
+      <w:proofErr w:type="gramEnd"/>
       <w:r>
         <w:t xml:space="preserve"> : </w:t>
       </w:r>
@@ -1780,6 +1911,8 @@
       <w:pPr>
         <w:ind w:firstLine="0"/>
       </w:pPr>
+      <w:proofErr w:type="spellStart"/>
+      <w:proofErr w:type="gramStart"/>
       <w:r>
         <w:rPr>
           <w:i/>
@@ -1794,6 +1927,8 @@
         </w:rPr>
         <w:t>log</w:t>
       </w:r>
+      <w:proofErr w:type="spellEnd"/>
+      <w:proofErr w:type="gramEnd"/>
       <w:r>
         <w:t xml:space="preserve"> : </w:t>
       </w:r>
@@ -1818,12 +1953,21 @@
       <w:pPr>
         <w:ind w:firstLine="0"/>
       </w:pPr>
-      <w:r>
-        <w:rPr>
-          <w:i/>
-          <w:iCs/>
-        </w:rPr>
-        <w:t>bm25</w:t>
+      <w:proofErr w:type="gramStart"/>
+      <w:r>
+        <w:rPr>
+          <w:i/>
+          <w:iCs/>
+        </w:rPr>
+        <w:t>bm</w:t>
+      </w:r>
+      <w:proofErr w:type="gramEnd"/>
+      <w:r>
+        <w:rPr>
+          <w:i/>
+          <w:iCs/>
+        </w:rPr>
+        <w:t>25</w:t>
       </w:r>
       <w:r>
         <w:t xml:space="preserve"> : </w:t>
@@ -1849,12 +1993,21 @@
       <w:pPr>
         <w:ind w:firstLine="0"/>
       </w:pPr>
-      <w:r>
-        <w:rPr>
-          <w:i/>
-          <w:iCs/>
-        </w:rPr>
-        <w:t>chi2</w:t>
+      <w:proofErr w:type="gramStart"/>
+      <w:r>
+        <w:rPr>
+          <w:i/>
+          <w:iCs/>
+        </w:rPr>
+        <w:t>chi</w:t>
+      </w:r>
+      <w:proofErr w:type="gramEnd"/>
+      <w:r>
+        <w:rPr>
+          <w:i/>
+          <w:iCs/>
+        </w:rPr>
+        <w:t>2</w:t>
       </w:r>
       <w:r>
         <w:t xml:space="preserve"> : </w:t>
@@ -1906,6 +2059,8 @@
       <w:pPr>
         <w:ind w:firstLine="0"/>
       </w:pPr>
+      <w:proofErr w:type="spellStart"/>
+      <w:proofErr w:type="gramStart"/>
       <w:r>
         <w:rPr>
           <w:i/>
@@ -1913,6 +2068,8 @@
         </w:rPr>
         <w:t>simplemaths</w:t>
       </w:r>
+      <w:proofErr w:type="spellEnd"/>
+      <w:proofErr w:type="gramEnd"/>
       <w:r>
         <w:t xml:space="preserve"> : </w:t>
       </w:r>
@@ -1988,7 +2145,31 @@
         <w:t>quenotte,</w:t>
       </w:r>
       <w:r>
-        <w:t xml:space="preserve"> Berghem, suceur, Bos, Nidros, brachioures, clupanodons, corégone</w:t>
+        <w:t xml:space="preserve"> Berghem, suceur, Bos, </w:t>
+      </w:r>
+      <w:proofErr w:type="spellStart"/>
+      <w:r>
+        <w:t>Nidros</w:t>
+      </w:r>
+      <w:proofErr w:type="spellEnd"/>
+      <w:r>
+        <w:t xml:space="preserve">, </w:t>
+      </w:r>
+      <w:proofErr w:type="spellStart"/>
+      <w:r>
+        <w:t>brachioures</w:t>
+      </w:r>
+      <w:proofErr w:type="spellEnd"/>
+      <w:r>
+        <w:t xml:space="preserve">, </w:t>
+      </w:r>
+      <w:proofErr w:type="spellStart"/>
+      <w:r>
+        <w:t>clupanodons</w:t>
+      </w:r>
+      <w:proofErr w:type="spellEnd"/>
+      <w:r>
+        <w:t>, corégone</w:t>
       </w:r>
     </w:p>
     <w:p>
@@ -2033,6 +2214,7 @@
       <w:r>
         <w:t xml:space="preserve"> </w:t>
       </w:r>
+      <w:proofErr w:type="spellStart"/>
       <w:r>
         <w:rPr>
           <w:i/>
@@ -2040,6 +2222,7 @@
         </w:rPr>
         <w:t>tf</w:t>
       </w:r>
+      <w:proofErr w:type="spellEnd"/>
       <w:r>
         <w:t xml:space="preserve">, assez peu </w:t>
       </w:r>
@@ -2130,6 +2313,7 @@
       <w:r>
         <w:t xml:space="preserve">oit être identique à </w:t>
       </w:r>
+      <w:proofErr w:type="spellStart"/>
       <w:r>
         <w:rPr>
           <w:i/>
@@ -2137,14 +2321,12 @@
         </w:rPr>
         <w:t>tf</w:t>
       </w:r>
+      <w:proofErr w:type="spellEnd"/>
       <w:r>
         <w:t>.</w:t>
       </w:r>
       <w:r>
-        <w:t xml:space="preserve"> </w:t>
-      </w:r>
-      <w:r>
-        <w:t>Constatons d’abord que toutes les formules habituelles savent sortir les mots grammaticaux largement fréquents par ailleurs.</w:t>
+        <w:t xml:space="preserve"> Constatons d’abord que toutes les formules habituelles savent sortir les mots grammaticaux largement fréquents par ailleurs.</w:t>
       </w:r>
       <w:r>
         <w:t xml:space="preserve"> </w:t>
@@ -2301,10 +2483,7 @@
         <w:t>présents que dans ce seul chapitre</w:t>
       </w:r>
       <w:r>
-        <w:t xml:space="preserve"> (voir</w:t>
-      </w:r>
-      <w:r>
-        <w:t xml:space="preserve"> </w:t>
+        <w:t xml:space="preserve"> (voir </w:t>
       </w:r>
       <w:r>
         <w:rPr>
@@ -2314,138 +2493,335 @@
         <w:t>g2s2.0</w:t>
       </w:r>
       <w:r>
+        <w:t>,)</w:t>
+      </w:r>
+      <w:r>
+        <w:t xml:space="preserve">. </w:t>
+      </w:r>
+      <w:r>
+        <w:t xml:space="preserve">À cette échelle, le </w:t>
+      </w:r>
+      <w:r>
+        <w:rPr>
+          <w:i/>
+          <w:iCs/>
+        </w:rPr>
+        <w:t>chi2</w:t>
+      </w:r>
+      <w:r>
+        <w:t xml:space="preserve"> est trop spécifique.</w:t>
+      </w:r>
+      <w:r>
+        <w:t xml:space="preserve"> </w:t>
+      </w:r>
+      <w:proofErr w:type="spellStart"/>
+      <w:r>
+        <w:rPr>
+          <w:i/>
+          <w:iCs/>
+        </w:rPr>
+        <w:t>Tfidf</w:t>
+      </w:r>
+      <w:r>
+        <w:rPr>
+          <w:i/>
+          <w:iCs/>
+        </w:rPr>
+        <w:t>log</w:t>
+      </w:r>
+      <w:proofErr w:type="spellEnd"/>
+      <w:r>
+        <w:t xml:space="preserve"> et </w:t>
+      </w:r>
+      <w:r>
+        <w:rPr>
+          <w:i/>
+          <w:iCs/>
+        </w:rPr>
+        <w:t>bm25</w:t>
+      </w:r>
+      <w:r>
+        <w:t xml:space="preserve">, les classiques des moteurs de recherche, </w:t>
+      </w:r>
+      <w:r>
+        <w:t>ne promeuvent pas</w:t>
+      </w:r>
+      <w:r>
+        <w:t xml:space="preserve"> les </w:t>
+      </w:r>
+      <w:proofErr w:type="spellStart"/>
+      <w:r>
+        <w:t>happax</w:t>
+      </w:r>
+      <w:proofErr w:type="spellEnd"/>
+      <w:r>
+        <w:t xml:space="preserve"> qui de toute façon seront trouvés,</w:t>
+      </w:r>
+      <w:r>
+        <w:t xml:space="preserve"> mais </w:t>
+      </w:r>
+      <w:r>
+        <w:t xml:space="preserve">les mots-clés </w:t>
+      </w:r>
+      <w:r>
+        <w:t>sont</w:t>
+      </w:r>
+      <w:r>
+        <w:t xml:space="preserve"> tout de même des mots assez rares</w:t>
+      </w:r>
+      <w:r>
         <w:t>,</w:t>
       </w:r>
       <w:r>
+        <w:t xml:space="preserve"> comme le nom propre </w:t>
+      </w:r>
+      <w:r>
+        <w:rPr>
+          <w:i/>
+          <w:iCs/>
+        </w:rPr>
+        <w:t>Bouguer</w:t>
+      </w:r>
+      <w:r>
+        <w:t>, présent à 7 occurrences dans tous Verne, 4 dans ce chapitre, et 3 autres</w:t>
+      </w:r>
+      <w:r>
+        <w:t xml:space="preserve"> dans 3</w:t>
+      </w:r>
+      <w:r>
+        <w:t xml:space="preserve"> chapitres d’autres romans.</w:t>
+      </w:r>
+      <w:r>
+        <w:t xml:space="preserve"> Ces formules sont réglées pour des collections documentaires plus homogènes que des romans, cette précision </w:t>
+      </w:r>
+      <w:r>
+        <w:t>a été jugée utile</w:t>
+      </w:r>
+      <w:r>
+        <w:t>, mais pour une description sémantique, le mot-clé est très peu éclairant</w:t>
+      </w:r>
+      <w:r>
+        <w:t>. L</w:t>
+      </w:r>
+      <w:r>
+        <w:t xml:space="preserve">’espérance log </w:t>
+      </w:r>
+      <w:r>
+        <w:rPr>
+          <w:i/>
+          <w:iCs/>
+        </w:rPr>
+        <w:t>g2</w:t>
+      </w:r>
+      <w:r>
+        <w:t xml:space="preserve"> donne ici un résultat identique à la spécificité hypergéométrique de </w:t>
+      </w:r>
+      <w:proofErr w:type="spellStart"/>
+      <w:r>
+        <w:rPr>
+          <w:i/>
+          <w:iCs/>
+        </w:rPr>
+        <w:t>l</w:t>
+      </w:r>
+      <w:r>
+        <w:rPr>
+          <w:i/>
+          <w:iCs/>
+        </w:rPr>
+        <w:t>afon</w:t>
+      </w:r>
+      <w:proofErr w:type="spellEnd"/>
+      <w:r>
+        <w:t>.</w:t>
+      </w:r>
+    </w:p>
+    <w:p>
+      <w:pPr>
+        <w:ind w:firstLine="708"/>
+      </w:pPr>
+      <w:r>
+        <w:t xml:space="preserve">Les noms </w:t>
+      </w:r>
+      <w:r>
+        <w:t>de personnes</w:t>
+      </w:r>
+      <w:r>
+        <w:t xml:space="preserve"> n</w:t>
+      </w:r>
+      <w:r>
+        <w:t>e sont pas traités spécialement</w:t>
+      </w:r>
+      <w:r>
+        <w:t>, si</w:t>
+      </w:r>
+      <w:r>
+        <w:t xml:space="preserve"> bien </w:t>
+      </w:r>
+      <w:r>
+        <w:t xml:space="preserve">que </w:t>
+      </w:r>
+      <w:proofErr w:type="gramStart"/>
+      <w:r>
+        <w:t>le harponneur</w:t>
+      </w:r>
+      <w:proofErr w:type="gramEnd"/>
+      <w:r>
+        <w:t xml:space="preserve"> </w:t>
+      </w:r>
+      <w:r>
+        <w:rPr>
+          <w:i/>
+          <w:iCs/>
+        </w:rPr>
+        <w:t>Ned Land</w:t>
+      </w:r>
+      <w:r>
+        <w:t xml:space="preserve"> se trouve tristement divisé</w:t>
+      </w:r>
+      <w:r>
+        <w:t xml:space="preserve"> ; toutefois un traitement </w:t>
+      </w:r>
+      <w:r>
+        <w:t xml:space="preserve">soigneux </w:t>
+      </w:r>
+      <w:r>
+        <w:t xml:space="preserve">des majuscules permet de </w:t>
+      </w:r>
+      <w:r>
+        <w:t>le retrouver sous son surnom</w:t>
+      </w:r>
+      <w:r>
+        <w:t xml:space="preserve"> </w:t>
+      </w:r>
+      <w:r>
+        <w:rPr>
+          <w:i/>
+          <w:iCs/>
+        </w:rPr>
+        <w:t xml:space="preserve">le </w:t>
+      </w:r>
+      <w:r>
+        <w:rPr>
+          <w:i/>
+          <w:iCs/>
+        </w:rPr>
+        <w:t>Canadien</w:t>
+      </w:r>
+      <w:r>
+        <w:t xml:space="preserve">, </w:t>
+      </w:r>
+      <w:r>
+        <w:t xml:space="preserve">et </w:t>
+      </w:r>
+      <w:r>
+        <w:t xml:space="preserve">de </w:t>
+      </w:r>
+      <w:r>
+        <w:t>ne pas</w:t>
+      </w:r>
+      <w:r>
+        <w:t xml:space="preserve"> confondre </w:t>
+      </w:r>
+      <w:r>
+        <w:rPr>
+          <w:i/>
+          <w:iCs/>
+        </w:rPr>
+        <w:t>un conseil</w:t>
+      </w:r>
+      <w:r>
+        <w:t xml:space="preserve"> et</w:t>
+      </w:r>
+      <w:r>
+        <w:t xml:space="preserve"> </w:t>
+      </w:r>
+      <w:r>
+        <w:rPr>
+          <w:i/>
+          <w:iCs/>
+        </w:rPr>
+        <w:t>Conseil</w:t>
+      </w:r>
+      <w:r>
+        <w:t>,</w:t>
+      </w:r>
+      <w:r>
+        <w:t xml:space="preserve"> le valet du narrateur (</w:t>
+      </w:r>
+      <w:r>
+        <w:t>Pierre Aronnax</w:t>
+      </w:r>
+      <w:r>
         <w:t>)</w:t>
       </w:r>
       <w:r>
         <w:t xml:space="preserve">. </w:t>
       </w:r>
       <w:r>
-        <w:t xml:space="preserve">À cette échelle, le </w:t>
-      </w:r>
-      <w:r>
-        <w:rPr>
-          <w:i/>
-          <w:iCs/>
-        </w:rPr>
-        <w:t>chi2</w:t>
-      </w:r>
-      <w:r>
-        <w:t xml:space="preserve"> est trop spécifique.</w:t>
-      </w:r>
-      <w:r>
-        <w:t xml:space="preserve"> </w:t>
-      </w:r>
-      <w:r>
-        <w:rPr>
-          <w:i/>
-          <w:iCs/>
-        </w:rPr>
-        <w:t>Tfidf</w:t>
-      </w:r>
-      <w:r>
-        <w:rPr>
-          <w:i/>
-          <w:iCs/>
-        </w:rPr>
-        <w:t>log</w:t>
-      </w:r>
-      <w:r>
-        <w:t xml:space="preserve"> et </w:t>
-      </w:r>
-      <w:r>
-        <w:rPr>
-          <w:i/>
-          <w:iCs/>
-        </w:rPr>
-        <w:t>bm25</w:t>
-      </w:r>
-      <w:r>
-        <w:t xml:space="preserve">, les classiques des moteurs de recherche, </w:t>
-      </w:r>
-      <w:r>
-        <w:t>ne promeuvent pas</w:t>
-      </w:r>
-      <w:r>
-        <w:t xml:space="preserve"> les happax</w:t>
-      </w:r>
-      <w:r>
-        <w:t xml:space="preserve"> qui de toute façon seront trouvés,</w:t>
-      </w:r>
-      <w:r>
-        <w:t xml:space="preserve"> mais </w:t>
-      </w:r>
-      <w:r>
-        <w:t xml:space="preserve">les mots-clés </w:t>
-      </w:r>
-      <w:r>
-        <w:t>sont</w:t>
-      </w:r>
-      <w:r>
-        <w:t xml:space="preserve"> tout de même des mots assez rares</w:t>
+        <w:t>Dans</w:t>
+      </w:r>
+      <w:r>
+        <w:t xml:space="preserve"> un texte informatif,</w:t>
+      </w:r>
+      <w:r>
+        <w:t xml:space="preserve"> les noms propres, notamment les auteurs ou les lieux, peuvent avoir une forte valeur sémantique. Dans</w:t>
+      </w:r>
+      <w:r>
+        <w:t xml:space="preserve"> un </w:t>
+      </w:r>
+      <w:r>
+        <w:t>récit</w:t>
+      </w:r>
+      <w:r>
+        <w:t>, ce sont en général les</w:t>
+      </w:r>
+      <w:r>
+        <w:t xml:space="preserve"> personnages</w:t>
       </w:r>
       <w:r>
         <w:t>,</w:t>
       </w:r>
       <w:r>
-        <w:t xml:space="preserve"> comme le nom propre </w:t>
-      </w:r>
-      <w:r>
-        <w:rPr>
-          <w:i/>
-          <w:iCs/>
-        </w:rPr>
-        <w:t>Bouguer</w:t>
-      </w:r>
-      <w:r>
-        <w:t>, présent à 7 occurrences dans tous Verne, 4 dans ce chapitre, et 3 autres</w:t>
-      </w:r>
-      <w:r>
-        <w:t xml:space="preserve"> dans 3</w:t>
-      </w:r>
-      <w:r>
-        <w:t xml:space="preserve"> chapitres d’autres romans.</w:t>
-      </w:r>
-      <w:r>
-        <w:t xml:space="preserve"> Ces formules sont réglées pour des collections documentaires plus homogènes que des romans, cette précision </w:t>
-      </w:r>
-      <w:r>
-        <w:t>a été jugée utile</w:t>
-      </w:r>
-      <w:r>
-        <w:t>, mais pour une description sémantique, le mot-clé est très peu éclairant</w:t>
-      </w:r>
-      <w:r>
-        <w:t>. L</w:t>
-      </w:r>
-      <w:r>
-        <w:t xml:space="preserve">’espérance log </w:t>
-      </w:r>
-      <w:r>
-        <w:rPr>
-          <w:i/>
-          <w:iCs/>
-        </w:rPr>
-        <w:t>g2</w:t>
-      </w:r>
-      <w:r>
-        <w:t xml:space="preserve"> donne ici un résultat identique à la spécificité hypergéométrique de </w:t>
-      </w:r>
-      <w:r>
-        <w:rPr>
-          <w:i/>
-          <w:iCs/>
-        </w:rPr>
-        <w:t>l</w:t>
-      </w:r>
-      <w:r>
-        <w:rPr>
-          <w:i/>
-          <w:iCs/>
-        </w:rPr>
-        <w:t>afon</w:t>
+        <w:t xml:space="preserve"> le</w:t>
+      </w:r>
+      <w:r>
+        <w:t xml:space="preserve"> c</w:t>
+      </w:r>
+      <w:r>
+        <w:t>roise</w:t>
+      </w:r>
+      <w:r>
+        <w:t>ment statistique</w:t>
+      </w:r>
+      <w:r>
+        <w:t xml:space="preserve"> de leus noms</w:t>
+      </w:r>
+      <w:r>
+        <w:t xml:space="preserve"> n’amène qu’à rapprocher</w:t>
+      </w:r>
+      <w:r>
+        <w:t xml:space="preserve"> les </w:t>
+      </w:r>
+      <w:r>
+        <w:t>chapitres</w:t>
+      </w:r>
+      <w:r>
+        <w:t xml:space="preserve"> d’un même roman.</w:t>
+      </w:r>
+    </w:p>
+    <w:p>
+      <w:pPr>
+        <w:ind w:firstLine="708"/>
+      </w:pPr>
+      <w:r>
+        <w:t xml:space="preserve">Les résultats qui suivent </w:t>
+      </w:r>
+      <w:r>
+        <w:t>supprimeront</w:t>
+      </w:r>
+      <w:r>
+        <w:t xml:space="preserve"> désormais les mots grammaticaux et les noms propres</w:t>
       </w:r>
       <w:r>
         <w:t>.</w:t>
@@ -2455,194 +2831,13 @@
       <w:pPr>
         <w:ind w:firstLine="708"/>
       </w:pPr>
-      <w:r>
-        <w:t xml:space="preserve">Les noms </w:t>
-      </w:r>
-      <w:r>
-        <w:t>de personnes</w:t>
-      </w:r>
-      <w:r>
-        <w:t xml:space="preserve"> n</w:t>
-      </w:r>
-      <w:r>
-        <w:t>e sont pas traités spécialement</w:t>
-      </w:r>
-      <w:r>
-        <w:t>, si</w:t>
-      </w:r>
-      <w:r>
-        <w:t xml:space="preserve"> bien </w:t>
-      </w:r>
-      <w:r>
-        <w:t xml:space="preserve">que le harponneur </w:t>
-      </w:r>
-      <w:r>
-        <w:rPr>
-          <w:i/>
-          <w:iCs/>
-        </w:rPr>
-        <w:t>Ned Land</w:t>
-      </w:r>
-      <w:r>
-        <w:t xml:space="preserve"> se trouve tristement divisé</w:t>
-      </w:r>
-      <w:r>
-        <w:t xml:space="preserve"> ; toutefois un traitement </w:t>
-      </w:r>
-      <w:r>
-        <w:t xml:space="preserve">soigneux </w:t>
-      </w:r>
-      <w:r>
-        <w:t xml:space="preserve">des majuscules permet de </w:t>
-      </w:r>
-      <w:r>
-        <w:t>le retrouver sous son surnom</w:t>
-      </w:r>
-      <w:r>
-        <w:t xml:space="preserve"> </w:t>
-      </w:r>
-      <w:r>
-        <w:rPr>
-          <w:i/>
-          <w:iCs/>
-        </w:rPr>
-        <w:t xml:space="preserve">le </w:t>
-      </w:r>
-      <w:r>
-        <w:rPr>
-          <w:i/>
-          <w:iCs/>
-        </w:rPr>
-        <w:t>Canadien</w:t>
-      </w:r>
-      <w:r>
-        <w:t xml:space="preserve">, </w:t>
-      </w:r>
-      <w:r>
-        <w:t xml:space="preserve">et </w:t>
-      </w:r>
-      <w:r>
-        <w:t xml:space="preserve">de </w:t>
-      </w:r>
-      <w:r>
-        <w:t>ne pas</w:t>
-      </w:r>
-      <w:r>
-        <w:t xml:space="preserve"> confondre </w:t>
-      </w:r>
-      <w:r>
-        <w:rPr>
-          <w:i/>
-          <w:iCs/>
-        </w:rPr>
-        <w:t>un conseil</w:t>
-      </w:r>
-      <w:r>
-        <w:t xml:space="preserve"> et</w:t>
-      </w:r>
-      <w:r>
-        <w:t xml:space="preserve"> </w:t>
-      </w:r>
-      <w:r>
-        <w:rPr>
-          <w:i/>
-          <w:iCs/>
-        </w:rPr>
-        <w:t>Conseil</w:t>
-      </w:r>
-      <w:r>
-        <w:t>,</w:t>
-      </w:r>
-      <w:r>
-        <w:t xml:space="preserve"> le valet du narrateur (</w:t>
-      </w:r>
-      <w:r>
-        <w:t>Pierre Aronnax</w:t>
-      </w:r>
-      <w:r>
-        <w:t>)</w:t>
-      </w:r>
-      <w:r>
-        <w:t xml:space="preserve">. </w:t>
-      </w:r>
-      <w:r>
-        <w:t>Dans</w:t>
-      </w:r>
-      <w:r>
-        <w:t xml:space="preserve"> un texte informatif,</w:t>
-      </w:r>
-      <w:r>
-        <w:t xml:space="preserve"> les noms propres, notamment les auteurs ou les lieux, peuvent avoir une forte valeur sémantique. Dans</w:t>
-      </w:r>
-      <w:r>
-        <w:t xml:space="preserve"> un </w:t>
-      </w:r>
-      <w:r>
-        <w:t>récit</w:t>
-      </w:r>
-      <w:r>
-        <w:t>, ce sont en général les</w:t>
-      </w:r>
-      <w:r>
-        <w:t xml:space="preserve"> personnages</w:t>
-      </w:r>
-      <w:r>
-        <w:t>,</w:t>
-      </w:r>
-      <w:r>
-        <w:t xml:space="preserve"> le</w:t>
-      </w:r>
-      <w:r>
-        <w:t xml:space="preserve"> c</w:t>
-      </w:r>
-      <w:r>
-        <w:t>roise</w:t>
-      </w:r>
-      <w:r>
-        <w:t>ment statistique</w:t>
-      </w:r>
-      <w:r>
-        <w:t xml:space="preserve"> de leus noms</w:t>
-      </w:r>
-      <w:r>
-        <w:t xml:space="preserve"> n’amène qu’à rapprocher</w:t>
-      </w:r>
-      <w:r>
-        <w:t xml:space="preserve"> les </w:t>
-      </w:r>
-      <w:r>
-        <w:t>chapitres</w:t>
-      </w:r>
-      <w:r>
-        <w:t xml:space="preserve"> d’un même roman.</w:t>
-      </w:r>
-    </w:p>
-    <w:p>
-      <w:pPr>
-        <w:ind w:firstLine="708"/>
-      </w:pPr>
-      <w:r>
-        <w:t xml:space="preserve">Les résultats qui suivent </w:t>
-      </w:r>
-      <w:r>
-        <w:t>supprimeront</w:t>
-      </w:r>
-      <w:r>
-        <w:t xml:space="preserve"> désormais les mots grammaticaux et les noms propres</w:t>
-      </w:r>
-      <w:r>
-        <w:t>.</w:t>
-      </w:r>
-    </w:p>
-    <w:p>
-      <w:pPr>
-        <w:ind w:firstLine="708"/>
-      </w:pPr>
     </w:p>
     <w:p>
       <w:pPr>
         <w:ind w:firstLine="0"/>
       </w:pPr>
+      <w:proofErr w:type="spellStart"/>
+      <w:proofErr w:type="gramStart"/>
       <w:r>
         <w:rPr>
           <w:i/>
@@ -2650,6 +2845,8 @@
         </w:rPr>
         <w:t>tf</w:t>
       </w:r>
+      <w:proofErr w:type="spellEnd"/>
+      <w:proofErr w:type="gramEnd"/>
       <w:r>
         <w:t> :</w:t>
       </w:r>
@@ -2694,12 +2891,21 @@
       <w:pPr>
         <w:ind w:firstLine="0"/>
       </w:pPr>
-      <w:r>
-        <w:rPr>
-          <w:i/>
-          <w:iCs/>
-        </w:rPr>
-        <w:t>g2</w:t>
+      <w:proofErr w:type="gramStart"/>
+      <w:r>
+        <w:rPr>
+          <w:i/>
+          <w:iCs/>
+        </w:rPr>
+        <w:t>g</w:t>
+      </w:r>
+      <w:proofErr w:type="gramEnd"/>
+      <w:r>
+        <w:rPr>
+          <w:i/>
+          <w:iCs/>
+        </w:rPr>
+        <w:t>2</w:t>
       </w:r>
       <w:r>
         <w:t xml:space="preserve"> : </w:t>
@@ -2742,6 +2948,8 @@
       <w:pPr>
         <w:ind w:firstLine="0"/>
       </w:pPr>
+      <w:proofErr w:type="spellStart"/>
+      <w:proofErr w:type="gramStart"/>
       <w:r>
         <w:rPr>
           <w:i/>
@@ -2749,6 +2957,8 @@
         </w:rPr>
         <w:t>lafon</w:t>
       </w:r>
+      <w:proofErr w:type="spellEnd"/>
+      <w:proofErr w:type="gramEnd"/>
       <w:r>
         <w:t xml:space="preserve"> : </w:t>
       </w:r>
@@ -2790,6 +3000,8 @@
       <w:pPr>
         <w:ind w:firstLine="0"/>
       </w:pPr>
+      <w:proofErr w:type="spellStart"/>
+      <w:proofErr w:type="gramStart"/>
       <w:r>
         <w:rPr>
           <w:i/>
@@ -2804,6 +3016,8 @@
         </w:rPr>
         <w:t>log</w:t>
       </w:r>
+      <w:proofErr w:type="spellEnd"/>
+      <w:proofErr w:type="gramEnd"/>
       <w:r>
         <w:t xml:space="preserve"> : </w:t>
       </w:r>
@@ -2842,8 +3056,13 @@
       <w:pPr>
         <w:ind w:firstLine="0"/>
       </w:pPr>
-      <w:r>
-        <w:t xml:space="preserve">bm25 : </w:t>
+      <w:proofErr w:type="gramStart"/>
+      <w:r>
+        <w:t>bm</w:t>
+      </w:r>
+      <w:proofErr w:type="gramEnd"/>
+      <w:r>
+        <w:t xml:space="preserve">25 : </w:t>
       </w:r>
       <w:r>
         <w:rPr>
@@ -2873,12 +3092,21 @@
       <w:pPr>
         <w:ind w:firstLine="0"/>
       </w:pPr>
-      <w:r>
-        <w:rPr>
-          <w:i/>
-          <w:iCs/>
-        </w:rPr>
-        <w:t>chi2</w:t>
+      <w:proofErr w:type="gramStart"/>
+      <w:r>
+        <w:rPr>
+          <w:i/>
+          <w:iCs/>
+        </w:rPr>
+        <w:t>chi</w:t>
+      </w:r>
+      <w:proofErr w:type="gramEnd"/>
+      <w:r>
+        <w:rPr>
+          <w:i/>
+          <w:iCs/>
+        </w:rPr>
+        <w:t>2</w:t>
       </w:r>
       <w:r>
         <w:t xml:space="preserve"> : </w:t>
@@ -2908,84 +3136,75 @@
           <w:b/>
           <w:bCs/>
         </w:rPr>
-        <w:t>espalier, violacé, quenotte, suceur, brachioures</w:t>
-      </w:r>
-      <w:r>
-        <w:t>…</w:t>
-      </w:r>
-    </w:p>
-    <w:p>
-      <w:pPr>
-        <w:ind w:firstLine="0"/>
-      </w:pPr>
-      <w:r>
-        <w:rPr>
-          <w:i/>
-          <w:iCs/>
-        </w:rPr>
-        <w:t>simplemaths</w:t>
-      </w:r>
-      <w:r>
-        <w:t xml:space="preserve"> : </w:t>
-      </w:r>
+        <w:t xml:space="preserve">espalier, violacé, quenotte, suceur, </w:t>
+      </w:r>
+      <w:proofErr w:type="spellStart"/>
       <w:r>
         <w:rPr>
           <w:b/>
           <w:bCs/>
         </w:rPr>
-        <w:t>poulpe</w:t>
-      </w:r>
-      <w:r>
-        <w:t xml:space="preserve">, </w:t>
+        <w:t>brachioures</w:t>
+      </w:r>
+      <w:proofErr w:type="spellEnd"/>
+      <w:r>
+        <w:t>…</w:t>
+      </w:r>
+    </w:p>
+    <w:p>
+      <w:pPr>
+        <w:ind w:firstLine="0"/>
+      </w:pPr>
+      <w:proofErr w:type="spellStart"/>
+      <w:proofErr w:type="gramStart"/>
+      <w:r>
+        <w:rPr>
+          <w:i/>
+          <w:iCs/>
+        </w:rPr>
+        <w:t>simplemaths</w:t>
+      </w:r>
+      <w:proofErr w:type="spellEnd"/>
+      <w:proofErr w:type="gramEnd"/>
+      <w:r>
+        <w:t xml:space="preserve"> : </w:t>
       </w:r>
       <w:r>
         <w:rPr>
           <w:b/>
           <w:bCs/>
         </w:rPr>
-        <w:t>calmar</w:t>
-      </w:r>
-      <w:r>
-        <w:t xml:space="preserve">, ventouse, céphalopode, tentacule, </w:t>
+        <w:t>poulpe</w:t>
+      </w:r>
+      <w:r>
+        <w:t xml:space="preserve">, </w:t>
       </w:r>
       <w:r>
         <w:rPr>
           <w:b/>
           <w:bCs/>
         </w:rPr>
-        <w:t>espalier, violacé, quenotte, suceur, brachioures</w:t>
-      </w:r>
-      <w:r>
-        <w:t>…</w:t>
-      </w:r>
-    </w:p>
-    <w:p>
-      <w:pPr>
-        <w:ind w:firstLine="0"/>
-      </w:pPr>
-      <w:r>
-        <w:rPr>
-          <w:i/>
-          <w:iCs/>
-        </w:rPr>
-        <w:t>g2s2.0</w:t>
-      </w:r>
-      <w:r>
-        <w:t> :</w:t>
-      </w:r>
-      <w:r>
-        <w:t xml:space="preserve"> </w:t>
+        <w:t>calmar</w:t>
+      </w:r>
+      <w:r>
+        <w:t xml:space="preserve">, ventouse, céphalopode, tentacule, </w:t>
       </w:r>
       <w:r>
         <w:rPr>
           <w:b/>
           <w:bCs/>
         </w:rPr>
-        <w:t>espalier, violacé, quenotte, suceur, brachioures</w:t>
-      </w:r>
-      <w:r>
-        <w:t xml:space="preserve">, clupanodons, corégone, fissurelles, gobies-plumiers, krak </w:t>
-      </w:r>
+        <w:t xml:space="preserve">espalier, violacé, quenotte, suceur, </w:t>
+      </w:r>
+      <w:proofErr w:type="spellStart"/>
+      <w:r>
+        <w:rPr>
+          <w:b/>
+          <w:bCs/>
+        </w:rPr>
+        <w:t>brachioures</w:t>
+      </w:r>
+      <w:proofErr w:type="spellEnd"/>
       <w:r>
         <w:t>…</w:t>
       </w:r>
@@ -2994,11 +3213,59 @@
       <w:pPr>
         <w:ind w:firstLine="0"/>
       </w:pPr>
+      <w:r>
+        <w:rPr>
+          <w:i/>
+          <w:iCs/>
+        </w:rPr>
+        <w:t>g2s2.0</w:t>
+      </w:r>
+      <w:r>
+        <w:t> :</w:t>
+      </w:r>
+      <w:r>
+        <w:t xml:space="preserve"> </w:t>
+      </w:r>
+      <w:r>
+        <w:rPr>
+          <w:b/>
+          <w:bCs/>
+        </w:rPr>
+        <w:t xml:space="preserve">espalier, violacé, quenotte, suceur, </w:t>
+      </w:r>
+      <w:proofErr w:type="spellStart"/>
+      <w:r>
+        <w:rPr>
+          <w:b/>
+          <w:bCs/>
+        </w:rPr>
+        <w:t>brachioures</w:t>
+      </w:r>
+      <w:proofErr w:type="spellEnd"/>
+      <w:r>
+        <w:t xml:space="preserve">, </w:t>
+      </w:r>
+      <w:proofErr w:type="spellStart"/>
+      <w:r>
+        <w:t>clupanodons</w:t>
+      </w:r>
+      <w:proofErr w:type="spellEnd"/>
+      <w:r>
+        <w:t xml:space="preserve">, corégone, fissurelles, gobies-plumiers, krak </w:t>
+      </w:r>
+      <w:r>
+        <w:t>…</w:t>
+      </w:r>
     </w:p>
     <w:p>
       <w:pPr>
         <w:ind w:firstLine="0"/>
       </w:pPr>
+    </w:p>
+    <w:p>
+      <w:pPr>
+        <w:ind w:firstLine="0"/>
+      </w:pPr>
       <w:r>
         <w:t xml:space="preserve">Un fois filtrés </w:t>
       </w:r>
@@ -3026,6 +3293,7 @@
       <w:r>
         <w:t xml:space="preserve"> les plus fréquents d’un document (</w:t>
       </w:r>
+      <w:proofErr w:type="spellStart"/>
       <w:r>
         <w:rPr>
           <w:i/>
@@ -3033,6 +3301,7 @@
         </w:rPr>
         <w:t>tf</w:t>
       </w:r>
+      <w:proofErr w:type="spellEnd"/>
       <w:r>
         <w:t xml:space="preserve">) </w:t>
       </w:r>
@@ -3282,6 +3551,7 @@
       <w:r>
         <w:t xml:space="preserve"> et </w:t>
       </w:r>
+      <w:proofErr w:type="spellStart"/>
       <w:r>
         <w:rPr>
           <w:i/>
@@ -3289,6 +3559,7 @@
         </w:rPr>
         <w:t>lafon</w:t>
       </w:r>
+      <w:proofErr w:type="spellEnd"/>
       <w:r>
         <w:t>.</w:t>
       </w:r>
@@ -3535,13 +3806,23 @@
         <w:t xml:space="preserve"> tous les chapitres pour chaque couple d’algorithmes, on aura une distance entre 2 algorithmes</w:t>
       </w:r>
       <w:r>
-        <w:t xml:space="preserve"> pour ce corpus</w:t>
+        <w:t xml:space="preserve"> pour ce </w:t>
+      </w:r>
+      <w:proofErr w:type="spellStart"/>
+      <w:proofErr w:type="gramStart"/>
+      <w:r>
+        <w:t>corpus</w:t>
       </w:r>
       <w:r>
         <w:t>.U</w:t>
       </w:r>
       <w:r>
-        <w:t xml:space="preserve">ne même formule comparée avec elle-même, </w:t>
+        <w:t>ne</w:t>
+      </w:r>
+      <w:proofErr w:type="spellEnd"/>
+      <w:proofErr w:type="gramEnd"/>
+      <w:r>
+        <w:t xml:space="preserve"> même formule comparée avec elle-même, </w:t>
       </w:r>
       <w:r>
         <w:t>ainsi que</w:t>
@@ -3549,6 +3830,7 @@
       <w:r>
         <w:t xml:space="preserve"> </w:t>
       </w:r>
+      <w:proofErr w:type="spellStart"/>
       <w:r>
         <w:rPr>
           <w:i/>
@@ -3556,6 +3838,7 @@
         </w:rPr>
         <w:t>tf</w:t>
       </w:r>
+      <w:proofErr w:type="spellEnd"/>
       <w:r>
         <w:t xml:space="preserve"> et </w:t>
       </w:r>
@@ -3570,7 +3853,15 @@
         <w:t xml:space="preserve"> </w:t>
       </w:r>
       <w:r>
-        <w:t>par construction, ont un distance égale à 0</w:t>
+        <w:t xml:space="preserve">par construction, ont </w:t>
+      </w:r>
+      <w:proofErr w:type="gramStart"/>
+      <w:r>
+        <w:t>un distance égale</w:t>
+      </w:r>
+      <w:proofErr w:type="gramEnd"/>
+      <w:r>
+        <w:t xml:space="preserve"> à 0</w:t>
       </w:r>
       <w:r>
         <w:t>. Les algorithmes les plus distants</w:t>
@@ -3581,6 +3872,7 @@
       <w:r>
         <w:t xml:space="preserve"> sont </w:t>
       </w:r>
+      <w:proofErr w:type="spellStart"/>
       <w:r>
         <w:rPr>
           <w:i/>
@@ -3588,9 +3880,11 @@
         </w:rPr>
         <w:t>tf</w:t>
       </w:r>
+      <w:proofErr w:type="spellEnd"/>
       <w:r>
         <w:t xml:space="preserve"> et </w:t>
       </w:r>
+      <w:proofErr w:type="spellStart"/>
       <w:r>
         <w:rPr>
           <w:i/>
@@ -3598,6 +3892,7 @@
         </w:rPr>
         <w:t>simplemaths</w:t>
       </w:r>
+      <w:proofErr w:type="spellEnd"/>
       <w:r>
         <w:rPr>
           <w:i/>
@@ -3611,6 +3906,7 @@
       <w:r>
         <w:t xml:space="preserve">0,93 ; ils ont très peu de mots en communs. </w:t>
       </w:r>
+      <w:proofErr w:type="gramStart"/>
       <w:r>
         <w:rPr>
           <w:i/>
@@ -3619,10 +3915,11 @@
         <w:t>g2s2.0</w:t>
       </w:r>
       <w:r>
-        <w:t> </w:t>
-      </w:r>
-      <w:r>
-        <w:t xml:space="preserve"> a été sorti des calculs, car beaucoup de chapitres n’ont pas 100 mots spécifiques, les distances n’étaient plus comparables.</w:t>
+        <w:t>  a</w:t>
+      </w:r>
+      <w:proofErr w:type="gramEnd"/>
+      <w:r>
+        <w:t xml:space="preserve"> été sorti des calculs, car beaucoup de chapitres n’ont pas 100 mots spécifiques, les distances n’étaient plus comparables.</w:t>
       </w:r>
     </w:p>
     <w:p>
@@ -3675,8 +3972,23 @@
         <w:rPr>
           <w:lang w:val="fr-FR"/>
         </w:rPr>
-        <w:t xml:space="preserve"> » (eng : </w:t>
-      </w:r>
+        <w:t> » (</w:t>
+      </w:r>
+      <w:proofErr w:type="spellStart"/>
+      <w:r>
+        <w:rPr>
+          <w:lang w:val="fr-FR"/>
+        </w:rPr>
+        <w:t>eng</w:t>
+      </w:r>
+      <w:proofErr w:type="spellEnd"/>
+      <w:r>
+        <w:rPr>
+          <w:lang w:val="fr-FR"/>
+        </w:rPr>
+        <w:t xml:space="preserve"> : </w:t>
+      </w:r>
+      <w:proofErr w:type="spellStart"/>
       <w:r>
         <w:rPr>
           <w:i/>
@@ -3685,6 +3997,7 @@
         </w:rPr>
         <w:t>PCoA</w:t>
       </w:r>
+      <w:proofErr w:type="spellEnd"/>
       <w:r>
         <w:rPr>
           <w:lang w:val="fr-FR"/>
@@ -3981,6 +4294,7 @@
         </w:rPr>
         <w:t xml:space="preserve"> et les </w:t>
       </w:r>
+      <w:proofErr w:type="spellStart"/>
       <w:r>
         <w:rPr>
           <w:i/>
@@ -3989,6 +4303,7 @@
         </w:rPr>
         <w:t>tfidf</w:t>
       </w:r>
+      <w:proofErr w:type="spellEnd"/>
       <w:r>
         <w:rPr>
           <w:lang w:val="fr-FR"/>
@@ -4007,6 +4322,7 @@
         </w:rPr>
         <w:t xml:space="preserve"> la fréquence par document </w:t>
       </w:r>
+      <w:proofErr w:type="spellStart"/>
       <w:r>
         <w:rPr>
           <w:i/>
@@ -4015,6 +4331,7 @@
         </w:rPr>
         <w:t>df</w:t>
       </w:r>
+      <w:proofErr w:type="spellEnd"/>
       <w:r>
         <w:rPr>
           <w:lang w:val="fr-FR"/>
@@ -4075,6 +4392,7 @@
         </w:rPr>
         <w:t>linéaire (</w:t>
       </w:r>
+      <w:proofErr w:type="spellStart"/>
       <w:r>
         <w:rPr>
           <w:i/>
@@ -4083,12 +4401,14 @@
         </w:rPr>
         <w:t>tf</w:t>
       </w:r>
+      <w:proofErr w:type="spellEnd"/>
       <w:r>
         <w:rPr>
           <w:lang w:val="fr-FR"/>
         </w:rPr>
         <w:t xml:space="preserve">, </w:t>
       </w:r>
+      <w:proofErr w:type="spellStart"/>
       <w:r>
         <w:rPr>
           <w:i/>
@@ -4097,12 +4417,14 @@
         </w:rPr>
         <w:t>tfidf</w:t>
       </w:r>
+      <w:proofErr w:type="spellEnd"/>
       <w:r>
         <w:rPr>
           <w:lang w:val="fr-FR"/>
         </w:rPr>
         <w:t xml:space="preserve">, </w:t>
       </w:r>
+      <w:proofErr w:type="spellStart"/>
       <w:r>
         <w:rPr>
           <w:i/>
@@ -4111,6 +4433,7 @@
         </w:rPr>
         <w:t>simplemaths</w:t>
       </w:r>
+      <w:proofErr w:type="spellEnd"/>
       <w:r>
         <w:rPr>
           <w:lang w:val="fr-FR"/>
@@ -4151,6 +4474,7 @@
         </w:rPr>
         <w:t xml:space="preserve">, </w:t>
       </w:r>
+      <w:proofErr w:type="spellStart"/>
       <w:r>
         <w:rPr>
           <w:i/>
@@ -4159,6 +4483,7 @@
         </w:rPr>
         <w:t>tfidflog</w:t>
       </w:r>
+      <w:proofErr w:type="spellEnd"/>
       <w:r>
         <w:rPr>
           <w:lang w:val="fr-FR"/>
@@ -4171,6 +4496,7 @@
         </w:rPr>
         <w:t>, factorielle ou hypergéométrique (</w:t>
       </w:r>
+      <w:proofErr w:type="spellStart"/>
       <w:r>
         <w:rPr>
           <w:i/>
@@ -4179,6 +4505,7 @@
         </w:rPr>
         <w:t>lafon</w:t>
       </w:r>
+      <w:proofErr w:type="spellEnd"/>
       <w:r>
         <w:rPr>
           <w:lang w:val="fr-FR"/>
@@ -4623,15 +4950,28 @@
         <w:noBreakHyphen/>
         <w:t xml:space="preserve">398. </w:t>
       </w:r>
-      <w:hyperlink r:id="rId1" w:history="1">
-        <w:r>
-          <w:rPr>
-            <w:rStyle w:val="Hyperlink"/>
-            <w:lang w:val="en-US"/>
-          </w:rPr>
-          <w:t>https://doi.org/10.1145/364955.364990</w:t>
-        </w:r>
-      </w:hyperlink>
+      <w:r>
+        <w:fldChar w:fldCharType="begin"/>
+      </w:r>
+      <w:r>
+        <w:rPr>
+          <w:lang w:val="en-US"/>
+        </w:rPr>
+        <w:instrText>HYPERLINK "https://doi.org/10.1145/364955.364990"</w:instrText>
+      </w:r>
+      <w:r>
+        <w:fldChar w:fldCharType="separate"/>
+      </w:r>
+      <w:r>
+        <w:rPr>
+          <w:rStyle w:val="Hyperlink"/>
+          <w:lang w:val="en-US"/>
+        </w:rPr>
+        <w:t>https://doi.org/10.1145/364955.364990</w:t>
+      </w:r>
+      <w:r>
+        <w:fldChar w:fldCharType="end"/>
+      </w:r>
     </w:p>
   </w:footnote>
   <w:footnote w:id="2">
@@ -4669,7 +5009,7 @@
         </w:rPr>
         <w:t xml:space="preserve">. </w:t>
       </w:r>
-      <w:hyperlink r:id="rId2" w:history="1">
+      <w:hyperlink r:id="rId1" w:history="1">
         <w:r>
           <w:rPr>
             <w:rStyle w:val="Hyperlink"/>
@@ -4696,7 +5036,7 @@
       <w:r>
         <w:t xml:space="preserve"> L’auteur développe actuellement le moteur de recherche pour deux œuvres complètes à l’université de Genève : Jean Piaget </w:t>
       </w:r>
-      <w:hyperlink r:id="rId3" w:history="1">
+      <w:hyperlink r:id="rId2" w:history="1">
         <w:r>
           <w:rPr>
             <w:rStyle w:val="Hyperlink"/>
@@ -4707,7 +5047,7 @@
       <w:r>
         <w:t xml:space="preserve">, et Denis de Rougemont </w:t>
       </w:r>
-      <w:hyperlink r:id="rId4" w:history="1">
+      <w:hyperlink r:id="rId3" w:history="1">
         <w:r>
           <w:rPr>
             <w:rStyle w:val="Hyperlink"/>
@@ -4734,7 +5074,7 @@
       <w:r>
         <w:t xml:space="preserve"> </w:t>
       </w:r>
-      <w:hyperlink r:id="rId5" w:history="1">
+      <w:hyperlink r:id="rId4" w:history="1">
         <w:r>
           <w:rPr>
             <w:rStyle w:val="Hyperlink"/>
@@ -4761,7 +5101,7 @@
       <w:r>
         <w:t xml:space="preserve"> </w:t>
       </w:r>
-      <w:hyperlink r:id="rId6" w:history="1">
+      <w:hyperlink r:id="rId5" w:history="1">
         <w:r>
           <w:rPr>
             <w:rStyle w:val="Hyperlink"/>
@@ -4788,7 +5128,7 @@
       <w:r>
         <w:t xml:space="preserve"> </w:t>
       </w:r>
-      <w:hyperlink r:id="rId7" w:history="1">
+      <w:hyperlink r:id="rId6" w:history="1">
         <w:r>
           <w:rPr>
             <w:rStyle w:val="Hyperlink"/>
@@ -4799,7 +5139,7 @@
       <w:r>
         <w:br/>
       </w:r>
-      <w:hyperlink r:id="rId8" w:history="1">
+      <w:hyperlink r:id="rId7" w:history="1">
         <w:r>
           <w:rPr>
             <w:rStyle w:val="Hyperlink"/>
@@ -4810,7 +5150,7 @@
       <w:r>
         <w:br/>
       </w:r>
-      <w:hyperlink r:id="rId9" w:history="1">
+      <w:hyperlink r:id="rId8" w:history="1">
         <w:r>
           <w:rPr>
             <w:rStyle w:val="Hyperlink"/>
@@ -4821,7 +5161,7 @@
       <w:r>
         <w:br/>
       </w:r>
-      <w:hyperlink r:id="rId10" w:history="1">
+      <w:hyperlink r:id="rId9" w:history="1">
         <w:r>
           <w:rPr>
             <w:rStyle w:val="Hyperlink"/>
@@ -4848,7 +5188,7 @@
       <w:r>
         <w:t xml:space="preserve"> </w:t>
       </w:r>
-      <w:hyperlink r:id="rId11" w:history="1">
+      <w:hyperlink r:id="rId10" w:history="1">
         <w:r>
           <w:rPr>
             <w:rStyle w:val="Hyperlink"/>
@@ -4875,7 +5215,7 @@
       <w:r>
         <w:t xml:space="preserve"> </w:t>
       </w:r>
-      <w:hyperlink r:id="rId12" w:history="1">
+      <w:hyperlink r:id="rId11" w:history="1">
         <w:r>
           <w:rPr>
             <w:rStyle w:val="Hyperlink"/>
@@ -4891,7 +5231,7 @@
         <w:br/>
         <w:t xml:space="preserve">Lexique3 </w:t>
       </w:r>
-      <w:hyperlink r:id="rId13" w:history="1">
+      <w:hyperlink r:id="rId12" w:history="1">
         <w:r>
           <w:rPr>
             <w:rStyle w:val="Hyperlink"/>
@@ -4904,9 +5244,16 @@
       </w:r>
       <w:r>
         <w:br/>
-        <w:t xml:space="preserve">Dicollecte 7.7 </w:t>
-      </w:r>
-      <w:hyperlink r:id="rId14" w:history="1">
+      </w:r>
+      <w:proofErr w:type="spellStart"/>
+      <w:r>
+        <w:t>Dicollecte</w:t>
+      </w:r>
+      <w:proofErr w:type="spellEnd"/>
+      <w:r>
+        <w:t xml:space="preserve"> 7.7 </w:t>
+      </w:r>
+      <w:hyperlink r:id="rId13" w:history="1">
         <w:r>
           <w:rPr>
             <w:rStyle w:val="Hyperlink"/>
@@ -4919,9 +5266,16 @@
       </w:r>
       <w:r>
         <w:br/>
-        <w:t xml:space="preserve">Morphalou 3.1 </w:t>
-      </w:r>
-      <w:hyperlink r:id="rId15" w:history="1">
+      </w:r>
+      <w:proofErr w:type="spellStart"/>
+      <w:r>
+        <w:t>Morphalou</w:t>
+      </w:r>
+      <w:proofErr w:type="spellEnd"/>
+      <w:r>
+        <w:t xml:space="preserve"> 3.1 </w:t>
+      </w:r>
+      <w:hyperlink r:id="rId14" w:history="1">
         <w:r>
           <w:rPr>
             <w:rStyle w:val="Hyperlink"/>
@@ -4931,7 +5285,15 @@
       </w:hyperlink>
       <w:r>
         <w:br/>
-        <w:t>Chaque lexique a son orientation. Lexique3 intéresse les orthophonistes, il a de précieuses informations de fréquence par forme, mais il est très bruité. Dicollecte sert à la correction orthographique, il mélange la langue commune avec les noms propres, ses lemmes sont parfois inexacts ou incomplets car non nécessaires à la correction orthographique (ex : l</w:t>
+        <w:t xml:space="preserve">Chaque lexique a son orientation. Lexique3 intéresse les orthophonistes, il a de précieuses informations de fréquence par forme, mais il est très bruité. </w:t>
+      </w:r>
+      <w:proofErr w:type="spellStart"/>
+      <w:r>
+        <w:t>Dicollecte</w:t>
+      </w:r>
+      <w:proofErr w:type="spellEnd"/>
+      <w:r>
+        <w:t xml:space="preserve"> sert à la correction orthographique, il mélange la langue commune avec les noms propres, ses lemmes sont parfois inexacts ou incomplets car non nécessaires à la correction orthographique (ex : l</w:t>
       </w:r>
       <w:r>
         <w:t>es participes passé</w:t>
@@ -4946,7 +5308,15 @@
         <w:t xml:space="preserve"> verbe </w:t>
       </w:r>
       <w:r>
-        <w:t xml:space="preserve">suffisent à fournir les formes adjectives). Morphalou, en partie constitué sur le </w:t>
+        <w:t xml:space="preserve">suffisent à fournir les formes adjectives). </w:t>
+      </w:r>
+      <w:proofErr w:type="spellStart"/>
+      <w:r>
+        <w:t>Morphalou</w:t>
+      </w:r>
+      <w:proofErr w:type="spellEnd"/>
+      <w:r>
+        <w:t xml:space="preserve">, en partie constitué sur le </w:t>
       </w:r>
       <w:r>
         <w:rPr>
@@ -4976,7 +5346,11 @@
         <w:t>ommer</w:t>
       </w:r>
       <w:r>
-        <w:t xml:space="preserve"> plutôt que </w:t>
+        <w:t xml:space="preserve"> plutôt </w:t>
+      </w:r>
+      <w:proofErr w:type="gramStart"/>
+      <w:r>
+        <w:t xml:space="preserve">que </w:t>
       </w:r>
       <w:r>
         <w:rPr>
@@ -4985,6 +5359,7 @@
         </w:rPr>
         <w:t>être</w:t>
       </w:r>
+      <w:proofErr w:type="gramEnd"/>
       <w:r>
         <w:t>).</w:t>
       </w:r>
@@ -5004,7 +5379,7 @@
       <w:r>
         <w:t xml:space="preserve"> </w:t>
       </w:r>
-      <w:hyperlink r:id="rId16" w:history="1">
+      <w:hyperlink r:id="rId15" w:history="1">
         <w:r>
           <w:rPr>
             <w:rStyle w:val="Hyperlink"/>
@@ -5031,7 +5406,7 @@
       <w:r>
         <w:t xml:space="preserve"> </w:t>
       </w:r>
-      <w:hyperlink r:id="rId17" w:history="1">
+      <w:hyperlink r:id="rId16" w:history="1">
         <w:r>
           <w:rPr>
             <w:rStyle w:val="Hyperlink"/>
@@ -5058,7 +5433,7 @@
       <w:r>
         <w:t xml:space="preserve"> </w:t>
       </w:r>
-      <w:hyperlink r:id="rId18" w:history="1">
+      <w:hyperlink r:id="rId17" w:history="1">
         <w:r>
           <w:rPr>
             <w:rStyle w:val="Hyperlink"/>
@@ -5085,7 +5460,7 @@
       <w:r>
         <w:t xml:space="preserve"> </w:t>
       </w:r>
-      <w:hyperlink r:id="rId19" w:history="1">
+      <w:hyperlink r:id="rId18" w:history="1">
         <w:r>
           <w:rPr>
             <w:rStyle w:val="Hyperlink"/>
@@ -5112,7 +5487,7 @@
       <w:r>
         <w:t xml:space="preserve"> </w:t>
       </w:r>
-      <w:hyperlink r:id="rId20" w:history="1">
+      <w:hyperlink r:id="rId19" w:history="1">
         <w:r>
           <w:rPr>
             <w:rStyle w:val="Hyperlink"/>
@@ -5139,7 +5514,7 @@
       <w:r>
         <w:t xml:space="preserve"> </w:t>
       </w:r>
-      <w:hyperlink r:id="rId21" w:history="1">
+      <w:hyperlink r:id="rId20" w:history="1">
         <w:r>
           <w:rPr>
             <w:rStyle w:val="Hyperlink"/>
@@ -5166,7 +5541,7 @@
       <w:r>
         <w:t xml:space="preserve"> </w:t>
       </w:r>
-      <w:hyperlink r:id="rId22" w:history="1">
+      <w:hyperlink r:id="rId21" w:history="1">
         <w:r>
           <w:rPr>
             <w:rStyle w:val="Hyperlink"/>
@@ -5193,7 +5568,7 @@
       <w:r>
         <w:t xml:space="preserve"> </w:t>
       </w:r>
-      <w:hyperlink r:id="rId23" w:history="1">
+      <w:hyperlink r:id="rId22" w:history="1">
         <w:r>
           <w:rPr>
             <w:rStyle w:val="Hyperlink"/>

</xml_diff>

<commit_message>
Update scorers, try triangle heat
</commit_message>
<xml_diff>
--- a/docs/glorieux-specif.docx
+++ b/docs/glorieux-specif.docx
@@ -6,7 +6,6 @@
       <w:pPr>
         <w:pStyle w:val="Title"/>
       </w:pPr>
-      <w:proofErr w:type="spellStart"/>
       <w:r>
         <w:rPr>
           <w:i/>
@@ -14,7 +13,6 @@
         </w:rPr>
         <w:t>Focalex</w:t>
       </w:r>
-      <w:proofErr w:type="spellEnd"/>
       <w:r>
         <w:t> </w:t>
       </w:r>
@@ -77,15 +75,7 @@
         <w:t xml:space="preserve"> spécificité </w:t>
       </w:r>
       <w:r>
-        <w:t xml:space="preserve">mesure l’écart à une norme. Dans le cas particulier des moteurs de recherche plein texte (et de la </w:t>
-      </w:r>
-      <w:proofErr w:type="spellStart"/>
-      <w:r>
-        <w:t>textométrie</w:t>
-      </w:r>
-      <w:proofErr w:type="spellEnd"/>
-      <w:r>
-        <w:t xml:space="preserve"> en général), c’est une formule qui mesure à quel point un</w:t>
+        <w:t>mesure l’écart à une norme. Dans le cas particulier des moteurs de recherche plein texte (et de la textométrie en général), c’est une formule qui mesure à quel point un</w:t>
       </w:r>
       <w:r>
         <w:t xml:space="preserve"> élément </w:t>
@@ -157,15 +147,7 @@
         <w:t>Fisher</w:t>
       </w:r>
       <w:r>
-        <w:t xml:space="preserve"> utilisé en </w:t>
-      </w:r>
-      <w:proofErr w:type="spellStart"/>
-      <w:r>
-        <w:t>textométrie</w:t>
-      </w:r>
-      <w:proofErr w:type="spellEnd"/>
-      <w:r>
-        <w:t>,</w:t>
+        <w:t xml:space="preserve"> utilisé en textométrie,</w:t>
       </w:r>
       <w:r>
         <w:t xml:space="preserve"> </w:t>
@@ -182,7 +164,6 @@
       <w:r>
         <w:t xml:space="preserve">, baptisée </w:t>
       </w:r>
-      <w:proofErr w:type="spellStart"/>
       <w:r>
         <w:rPr>
           <w:i/>
@@ -190,7 +171,6 @@
         </w:rPr>
         <w:t>Focalex</w:t>
       </w:r>
-      <w:proofErr w:type="spellEnd"/>
       <w:r>
         <w:t xml:space="preserve">, </w:t>
       </w:r>
@@ -280,7 +260,6 @@
       <w:r>
         <w:t xml:space="preserve"> à retrouver (</w:t>
       </w:r>
-      <w:proofErr w:type="spellStart"/>
       <w:r>
         <w:rPr>
           <w:i/>
@@ -288,7 +267,6 @@
         </w:rPr>
         <w:t>retrieval</w:t>
       </w:r>
-      <w:proofErr w:type="spellEnd"/>
       <w:r>
         <w:t>) les documents les plus pertinents pour une requête</w:t>
       </w:r>
@@ -332,18 +310,16 @@
         <w:t>un auteur</w:t>
       </w:r>
       <w:r>
-        <w:t xml:space="preserve">, ou </w:t>
-      </w:r>
-      <w:proofErr w:type="spellStart"/>
-      <w:r>
-        <w:t>l</w:t>
-      </w:r>
-      <w:r>
-        <w:t>a</w:t>
-      </w:r>
-      <w:proofErr w:type="spellEnd"/>
-      <w:r>
-        <w:t xml:space="preserve"> variation</w:t>
+        <w:t>, ou</w:t>
+      </w:r>
+      <w:r>
+        <w:t xml:space="preserve"> avec</w:t>
+      </w:r>
+      <w:r>
+        <w:t xml:space="preserve"> l</w:t>
+      </w:r>
+      <w:r>
+        <w:t>a variation</w:t>
       </w:r>
       <w:r>
         <w:t xml:space="preserve"> d’une date</w:t>
@@ -651,13 +627,8 @@
         <w:t>reprise</w:t>
       </w:r>
       <w:r>
-        <w:t xml:space="preserve"> du projet </w:t>
-      </w:r>
-      <w:proofErr w:type="spellStart"/>
-      <w:r>
-        <w:t>ebalzac</w:t>
-      </w:r>
-      <w:proofErr w:type="spellEnd"/>
+        <w:t xml:space="preserve"> du projet ebalzac</w:t>
+      </w:r>
       <w:r>
         <w:rPr>
           <w:rStyle w:val="FootnoteReference"/>
@@ -807,7 +778,6 @@
       <w:r>
         <w:t>De ces sources normalisées, les chapitres ont été extraits dans un format textuel plus commode (</w:t>
       </w:r>
-      <w:proofErr w:type="spellStart"/>
       <w:r>
         <w:rPr>
           <w:i/>
@@ -815,7 +785,6 @@
         </w:rPr>
         <w:t>MarkDown</w:t>
       </w:r>
-      <w:proofErr w:type="spellEnd"/>
       <w:r>
         <w:t>)</w:t>
       </w:r>
@@ -1075,33 +1044,15 @@
           <w:i/>
           <w:iCs/>
         </w:rPr>
-        <w:t xml:space="preserve">Apache </w:t>
-      </w:r>
-      <w:proofErr w:type="spellStart"/>
-      <w:r>
-        <w:rPr>
-          <w:i/>
-          <w:iCs/>
-        </w:rPr>
-        <w:t>OpenNLP</w:t>
-      </w:r>
-      <w:proofErr w:type="spellEnd"/>
-      <w:r>
-        <w:rPr>
-          <w:i/>
-          <w:iCs/>
-        </w:rPr>
-        <w:t xml:space="preserve"> </w:t>
-      </w:r>
-      <w:proofErr w:type="spellStart"/>
-      <w:r>
-        <w:rPr>
-          <w:i/>
-          <w:iCs/>
-        </w:rPr>
-        <w:t>POSTtagger</w:t>
-      </w:r>
-      <w:proofErr w:type="spellEnd"/>
+        <w:t>Apache OpenNLP</w:t>
+      </w:r>
+      <w:r>
+        <w:rPr>
+          <w:i/>
+          <w:iCs/>
+        </w:rPr>
+        <w:t xml:space="preserve"> POSTtagger</w:t>
+      </w:r>
       <w:r>
         <w:rPr>
           <w:rStyle w:val="FootnoteReference"/>
@@ -1252,7 +1203,6 @@
       <w:pPr>
         <w:ind w:firstLine="0"/>
       </w:pPr>
-      <w:proofErr w:type="spellStart"/>
       <w:r>
         <w:rPr>
           <w:i/>
@@ -1260,7 +1210,6 @@
         </w:rPr>
         <w:t>tf</w:t>
       </w:r>
-      <w:proofErr w:type="spellEnd"/>
       <w:r>
         <w:t>, f</w:t>
       </w:r>
@@ -1275,15 +1224,12 @@
       <w:pPr>
         <w:ind w:firstLine="0"/>
       </w:pPr>
-      <w:proofErr w:type="spellStart"/>
       <w:r>
         <w:t>Tfidf</w:t>
       </w:r>
-      <w:proofErr w:type="spellEnd"/>
       <w:r>
         <w:t xml:space="preserve">, </w:t>
       </w:r>
-      <w:proofErr w:type="spellStart"/>
       <w:r>
         <w:rPr>
           <w:i/>
@@ -1291,11 +1237,9 @@
         </w:rPr>
         <w:t>tf</w:t>
       </w:r>
-      <w:proofErr w:type="spellEnd"/>
       <w:r>
         <w:t xml:space="preserve"> log (N / </w:t>
       </w:r>
-      <w:proofErr w:type="spellStart"/>
       <w:r>
         <w:rPr>
           <w:i/>
@@ -1303,20 +1247,14 @@
         </w:rPr>
         <w:t>df</w:t>
       </w:r>
-      <w:proofErr w:type="spellEnd"/>
       <w:r>
         <w:t>),</w:t>
       </w:r>
       <w:r>
         <w:t xml:space="preserve"> </w:t>
       </w:r>
-      <w:proofErr w:type="spellStart"/>
-      <w:r>
-        <w:t>fréquenc</w:t>
-      </w:r>
-      <w:proofErr w:type="spellEnd"/>
-      <w:r>
-        <w:t xml:space="preserve"> d’un terme</w:t>
+      <w:r>
+        <w:t>fréquenc d’un terme</w:t>
       </w:r>
       <w:r>
         <w:t xml:space="preserve"> multipliée par l’inverse </w:t>
@@ -1327,28 +1265,15 @@
         <w:ind w:firstLine="0"/>
       </w:pPr>
       <w:r>
-        <w:t>BM25 (</w:t>
-      </w:r>
-      <w:proofErr w:type="spellStart"/>
-      <w:r>
-        <w:t>lucene</w:t>
-      </w:r>
-      <w:proofErr w:type="spellEnd"/>
-      <w:r>
-        <w:t>)</w:t>
+        <w:t>BM25 (lucene)</w:t>
       </w:r>
     </w:p>
     <w:p>
       <w:pPr>
         <w:ind w:firstLine="0"/>
       </w:pPr>
-      <w:proofErr w:type="spellStart"/>
-      <w:r>
-        <w:t>Lafon</w:t>
-      </w:r>
-      <w:proofErr w:type="spellEnd"/>
-      <w:r>
-        <w:t>… no</w:t>
+      <w:r>
+        <w:t>Lafon… no</w:t>
       </w:r>
     </w:p>
     <w:p>
@@ -1412,28 +1337,19 @@
         <w:t>ces chapeaux</w:t>
       </w:r>
       <w:r>
-        <w:t xml:space="preserve"> écrit</w:t>
-      </w:r>
-      <w:r>
-        <w:t>s</w:t>
-      </w:r>
-      <w:r>
-        <w:t xml:space="preserve"> par l</w:t>
-      </w:r>
-      <w:r>
-        <w:t>es auteurs de romans picaresques</w:t>
+        <w:t xml:space="preserve"> </w:t>
+      </w:r>
+      <w:r>
+        <w:t xml:space="preserve">dans les </w:t>
+      </w:r>
+      <w:r>
+        <w:t xml:space="preserve"> romans picaresques</w:t>
       </w:r>
       <w:r>
         <w:t xml:space="preserve">, </w:t>
       </w:r>
       <w:r>
-        <w:t>que Dumas imite parfois</w:t>
-      </w:r>
-      <w:r>
-        <w:t>,</w:t>
-      </w:r>
-      <w:r>
-        <w:t xml:space="preserve"> </w:t>
+        <w:t xml:space="preserve">que Dumas imite </w:t>
       </w:r>
       <w:r>
         <w:t>par exemple</w:t>
@@ -1683,7 +1599,6 @@
       <w:pPr>
         <w:ind w:firstLine="0"/>
       </w:pPr>
-      <w:proofErr w:type="spellStart"/>
       <w:r>
         <w:rPr>
           <w:i/>
@@ -1691,7 +1606,6 @@
         </w:rPr>
         <w:t>tf</w:t>
       </w:r>
-      <w:proofErr w:type="spellEnd"/>
       <w:r>
         <w:t xml:space="preserve"> : </w:t>
       </w:r>
@@ -1744,15 +1658,13 @@
       <w:pPr>
         <w:ind w:firstLine="0"/>
       </w:pPr>
-      <w:proofErr w:type="spellStart"/>
-      <w:r>
-        <w:rPr>
-          <w:i/>
-          <w:iCs/>
-        </w:rPr>
-        <w:t>lafon</w:t>
-      </w:r>
-      <w:proofErr w:type="spellEnd"/>
+      <w:r>
+        <w:rPr>
+          <w:i/>
+          <w:iCs/>
+        </w:rPr>
+        <w:t>fisher</w:t>
+      </w:r>
       <w:r>
         <w:t xml:space="preserve"> : </w:t>
       </w:r>
@@ -1767,7 +1679,6 @@
       <w:pPr>
         <w:ind w:firstLine="0"/>
       </w:pPr>
-      <w:proofErr w:type="spellStart"/>
       <w:r>
         <w:rPr>
           <w:i/>
@@ -1782,7 +1693,6 @@
         </w:rPr>
         <w:t>log</w:t>
       </w:r>
-      <w:proofErr w:type="spellEnd"/>
       <w:r>
         <w:t xml:space="preserve"> : </w:t>
       </w:r>
@@ -1895,7 +1805,6 @@
       <w:pPr>
         <w:ind w:firstLine="0"/>
       </w:pPr>
-      <w:proofErr w:type="spellStart"/>
       <w:r>
         <w:rPr>
           <w:i/>
@@ -1903,7 +1812,6 @@
         </w:rPr>
         <w:t>simplemaths</w:t>
       </w:r>
-      <w:proofErr w:type="spellEnd"/>
       <w:r>
         <w:t xml:space="preserve"> : </w:t>
       </w:r>
@@ -1986,76 +1894,129 @@
         <w:t>quenotte,</w:t>
       </w:r>
       <w:r>
-        <w:t xml:space="preserve"> Berghem, suceur, Bos, </w:t>
-      </w:r>
-      <w:proofErr w:type="spellStart"/>
-      <w:r>
-        <w:t>Nidros</w:t>
-      </w:r>
-      <w:proofErr w:type="spellEnd"/>
+        <w:t xml:space="preserve"> Berghem, suceur, Bos, Nidros, brachioures, clupanodons, corégone</w:t>
+      </w:r>
+    </w:p>
+    <w:p>
+      <w:pPr>
+        <w:ind w:firstLine="0"/>
+      </w:pPr>
+    </w:p>
+    <w:p>
+      <w:pPr>
+        <w:ind w:firstLine="0"/>
+      </w:pPr>
+      <w:r>
+        <w:t>Les mots grammaticaux ont été volontairement conservés</w:t>
+      </w:r>
+      <w:r>
+        <w:t xml:space="preserve"> dans ce</w:t>
+      </w:r>
+      <w:r>
+        <w:t>s</w:t>
+      </w:r>
+      <w:r>
+        <w:t xml:space="preserve"> premiers</w:t>
+      </w:r>
+      <w:r>
+        <w:t xml:space="preserve"> résultats</w:t>
+      </w:r>
+      <w:r>
+        <w:t>, ce qui permet d</w:t>
+      </w:r>
+      <w:r>
+        <w:t>’observer</w:t>
+      </w:r>
+      <w:r>
+        <w:t xml:space="preserve"> le comportement de la fréquence brute</w:t>
+      </w:r>
+      <w:r>
+        <w:t xml:space="preserve"> des termes</w:t>
+      </w:r>
+      <w:r>
+        <w:t xml:space="preserve"> dans le document</w:t>
+      </w:r>
+      <w:r>
+        <w:t xml:space="preserve"> </w:t>
+      </w:r>
+      <w:r>
+        <w:rPr>
+          <w:i/>
+          <w:iCs/>
+        </w:rPr>
+        <w:t>tf</w:t>
+      </w:r>
+      <w:r>
+        <w:t xml:space="preserve">, assez peu </w:t>
+      </w:r>
+      <w:r>
+        <w:t xml:space="preserve">significative, car des mots comme </w:t>
+      </w:r>
+      <w:r>
+        <w:rPr>
+          <w:i/>
+          <w:iCs/>
+        </w:rPr>
+        <w:t>le</w:t>
+      </w:r>
       <w:r>
         <w:t xml:space="preserve">, </w:t>
       </w:r>
-      <w:proofErr w:type="spellStart"/>
-      <w:r>
-        <w:t>brachioures</w:t>
-      </w:r>
-      <w:proofErr w:type="spellEnd"/>
+      <w:r>
+        <w:rPr>
+          <w:i/>
+          <w:iCs/>
+        </w:rPr>
+        <w:t>de</w:t>
+      </w:r>
       <w:r>
         <w:t xml:space="preserve">, </w:t>
       </w:r>
-      <w:proofErr w:type="spellStart"/>
-      <w:r>
-        <w:t>clupanodons</w:t>
-      </w:r>
-      <w:proofErr w:type="spellEnd"/>
-      <w:r>
-        <w:t>, corégone</w:t>
-      </w:r>
-    </w:p>
-    <w:p>
-      <w:pPr>
-        <w:ind w:firstLine="0"/>
-      </w:pPr>
-    </w:p>
-    <w:p>
-      <w:pPr>
-        <w:ind w:firstLine="0"/>
-      </w:pPr>
-      <w:r>
-        <w:t>Les mots grammaticaux ont été volontairement conservés</w:t>
-      </w:r>
-      <w:r>
-        <w:t xml:space="preserve"> dans ce</w:t>
-      </w:r>
-      <w:r>
-        <w:t>s</w:t>
-      </w:r>
-      <w:r>
-        <w:t xml:space="preserve"> premiers</w:t>
-      </w:r>
-      <w:r>
-        <w:t xml:space="preserve"> résultats</w:t>
-      </w:r>
-      <w:r>
-        <w:t>, ce qui permet d</w:t>
-      </w:r>
-      <w:r>
-        <w:t>’observer</w:t>
-      </w:r>
-      <w:r>
-        <w:t xml:space="preserve"> le comportement de la fréquence brute</w:t>
-      </w:r>
-      <w:r>
-        <w:t xml:space="preserve"> des termes</w:t>
-      </w:r>
-      <w:r>
-        <w:t xml:space="preserve"> dans le document</w:t>
-      </w:r>
-      <w:r>
-        <w:t xml:space="preserve"> </w:t>
-      </w:r>
-      <w:proofErr w:type="spellStart"/>
+      <w:r>
+        <w:rPr>
+          <w:i/>
+          <w:iCs/>
+        </w:rPr>
+        <w:t>un</w:t>
+      </w:r>
+      <w:r>
+        <w:rPr>
+          <w:i/>
+          <w:iCs/>
+        </w:rPr>
+        <w:t>,</w:t>
+      </w:r>
+      <w:r>
+        <w:t xml:space="preserve"> sont également </w:t>
+      </w:r>
+      <w:r>
+        <w:t>très fréquents</w:t>
+      </w:r>
+      <w:r>
+        <w:t xml:space="preserve"> dans tous les documents</w:t>
+      </w:r>
+      <w:r>
+        <w:t>.</w:t>
+      </w:r>
+      <w:r>
+        <w:t xml:space="preserve"> </w:t>
+      </w:r>
+      <w:r>
+        <w:rPr>
+          <w:i/>
+          <w:iCs/>
+        </w:rPr>
+        <w:t>focalex0.0</w:t>
+      </w:r>
+      <w:r>
+        <w:t xml:space="preserve"> </w:t>
+      </w:r>
+      <w:r>
+        <w:t xml:space="preserve">est </w:t>
+      </w:r>
+      <w:r>
+        <w:t xml:space="preserve">identique à </w:t>
+      </w:r>
       <w:r>
         <w:rPr>
           <w:i/>
@@ -2063,29 +2024,144 @@
         </w:rPr>
         <w:t>tf</w:t>
       </w:r>
-      <w:proofErr w:type="spellEnd"/>
-      <w:r>
-        <w:t xml:space="preserve">, assez peu </w:t>
-      </w:r>
-      <w:r>
-        <w:t xml:space="preserve">significative, car des mots comme </w:t>
-      </w:r>
-      <w:r>
-        <w:rPr>
-          <w:i/>
-          <w:iCs/>
-        </w:rPr>
-        <w:t>le</w:t>
+      <w:r>
+        <w:t xml:space="preserve">, par construction, c’est la borne basse, sans aucune pondération de spécificité. </w:t>
+      </w:r>
+      <w:r>
+        <w:t>Constatons d’abord que toutes les formules habituelles savent sortir les mots grammaticaux largement fréquents par ailleurs.</w:t>
+      </w:r>
+      <w:r>
+        <w:t xml:space="preserve"> </w:t>
+      </w:r>
+      <w:r>
+        <w:t>À l’</w:t>
+      </w:r>
+      <w:r>
+        <w:t>autre extrême</w:t>
+      </w:r>
+      <w:r>
+        <w:t>,</w:t>
+      </w:r>
+      <w:r>
+        <w:t xml:space="preserve"> </w:t>
+      </w:r>
+      <w:r>
+        <w:rPr>
+          <w:i/>
+          <w:iCs/>
+        </w:rPr>
+        <w:t>focalex</w:t>
+      </w:r>
+      <w:r>
+        <w:rPr>
+          <w:i/>
+          <w:iCs/>
+        </w:rPr>
+        <w:t>2.0</w:t>
       </w:r>
       <w:r>
         <w:t xml:space="preserve">, </w:t>
       </w:r>
       <w:r>
-        <w:rPr>
-          <w:i/>
-          <w:iCs/>
-        </w:rPr>
-        <w:t>de</w:t>
+        <w:t>par construction,</w:t>
+      </w:r>
+      <w:r>
+        <w:t xml:space="preserve"> donne les mots </w:t>
+      </w:r>
+      <w:r>
+        <w:t xml:space="preserve">qui </w:t>
+      </w:r>
+      <w:r>
+        <w:t>sont exclusivement</w:t>
+      </w:r>
+      <w:r>
+        <w:t xml:space="preserve"> d</w:t>
+      </w:r>
+      <w:r>
+        <w:t>ans</w:t>
+      </w:r>
+      <w:r>
+        <w:t xml:space="preserve"> ce document (en ordre de fréquence)</w:t>
+      </w:r>
+      <w:r>
+        <w:t>. C</w:t>
+      </w:r>
+      <w:r>
+        <w:t>’est la spécificité maximale</w:t>
+      </w:r>
+      <w:r>
+        <w:t xml:space="preserve">, qui n’est pas non plus très significative (par exemple </w:t>
+      </w:r>
+      <w:r>
+        <w:rPr>
+          <w:i/>
+          <w:iCs/>
+        </w:rPr>
+        <w:t>poulpe</w:t>
+      </w:r>
+      <w:r>
+        <w:t xml:space="preserve"> est absent parce qu’il se trouve dans 1</w:t>
+      </w:r>
+      <w:r>
+        <w:t>3 autres</w:t>
+      </w:r>
+      <w:r>
+        <w:t xml:space="preserve"> chapitres de Verne).</w:t>
+      </w:r>
+    </w:p>
+    <w:p>
+      <w:pPr>
+        <w:ind w:firstLine="708"/>
+      </w:pPr>
+      <w:r>
+        <w:t>Pour être descriptif, u</w:t>
+      </w:r>
+      <w:r>
+        <w:t>n mot</w:t>
+      </w:r>
+      <w:r>
+        <w:t>-clé</w:t>
+      </w:r>
+      <w:r>
+        <w:t xml:space="preserve"> </w:t>
+      </w:r>
+      <w:r>
+        <w:t>ne doit pas être trop rare, ni trop fréquent</w:t>
+      </w:r>
+      <w:r>
+        <w:t>.</w:t>
+      </w:r>
+      <w:r>
+        <w:t xml:space="preserve"> </w:t>
+      </w:r>
+      <w:r>
+        <w:t>Les algorithmes de spécificité cherchent à trouver un équilibre mathématique entre généralité et rareté.</w:t>
+      </w:r>
+      <w:r>
+        <w:t xml:space="preserve"> </w:t>
+      </w:r>
+      <w:r>
+        <w:t>Remarquons</w:t>
+      </w:r>
+      <w:r>
+        <w:t xml:space="preserve"> que le </w:t>
+      </w:r>
+      <w:r>
+        <w:rPr>
+          <w:i/>
+          <w:iCs/>
+        </w:rPr>
+        <w:t>chi2</w:t>
+      </w:r>
+      <w:r>
+        <w:t xml:space="preserve">, assez classique en statistiques, relève des mots comme </w:t>
+      </w:r>
+      <w:r>
+        <w:rPr>
+          <w:i/>
+          <w:iCs/>
+        </w:rPr>
+        <w:t>espalier</w:t>
       </w:r>
       <w:r>
         <w:t xml:space="preserve">, </w:t>
@@ -2095,75 +2171,19 @@
           <w:i/>
           <w:iCs/>
         </w:rPr>
-        <w:t>un</w:t>
-      </w:r>
-      <w:r>
-        <w:rPr>
-          <w:i/>
-          <w:iCs/>
-        </w:rPr>
-        <w:t>,</w:t>
-      </w:r>
-      <w:r>
-        <w:t xml:space="preserve"> sont également </w:t>
-      </w:r>
-      <w:r>
-        <w:t>très fréquents</w:t>
-      </w:r>
-      <w:r>
-        <w:t xml:space="preserve"> dans tous les documents</w:t>
-      </w:r>
-      <w:r>
-        <w:t>.</w:t>
-      </w:r>
-      <w:r>
-        <w:t xml:space="preserve"> </w:t>
-      </w:r>
-      <w:r>
-        <w:rPr>
-          <w:i/>
-          <w:iCs/>
-        </w:rPr>
-        <w:t>focalex0.0</w:t>
-      </w:r>
-      <w:r>
-        <w:t xml:space="preserve"> </w:t>
-      </w:r>
-      <w:r>
-        <w:t xml:space="preserve">est </w:t>
-      </w:r>
-      <w:r>
-        <w:t xml:space="preserve">identique à </w:t>
-      </w:r>
-      <w:proofErr w:type="spellStart"/>
-      <w:r>
-        <w:rPr>
-          <w:i/>
-          <w:iCs/>
-        </w:rPr>
-        <w:t>tf</w:t>
-      </w:r>
-      <w:proofErr w:type="spellEnd"/>
-      <w:r>
-        <w:t xml:space="preserve">, par construction, c’est la borne basse, sans aucune pondération de spécificité. </w:t>
-      </w:r>
-      <w:r>
-        <w:t>Constatons d’abord que toutes les formules habituelles savent sortir les mots grammaticaux largement fréquents par ailleurs.</w:t>
-      </w:r>
-      <w:r>
-        <w:t xml:space="preserve"> </w:t>
-      </w:r>
-      <w:r>
-        <w:t>À l’</w:t>
-      </w:r>
-      <w:r>
-        <w:t>autre extrême</w:t>
-      </w:r>
-      <w:r>
-        <w:t>,</w:t>
-      </w:r>
-      <w:r>
-        <w:t xml:space="preserve"> </w:t>
+        <w:t>violacé</w:t>
+      </w:r>
+      <w:r>
+        <w:t xml:space="preserve"> </w:t>
+      </w:r>
+      <w:r>
+        <w:t xml:space="preserve">qui ne sont </w:t>
+      </w:r>
+      <w:r>
+        <w:t>présents que dans ce seul chapitre</w:t>
+      </w:r>
+      <w:r>
+        <w:t xml:space="preserve"> (voir </w:t>
       </w:r>
       <w:r>
         <w:rPr>
@@ -2180,91 +2200,13 @@
         <w:t>2.0</w:t>
       </w:r>
       <w:r>
-        <w:t xml:space="preserve">, </w:t>
-      </w:r>
-      <w:r>
-        <w:t>par construction,</w:t>
-      </w:r>
-      <w:r>
-        <w:t xml:space="preserve"> donne les mots </w:t>
-      </w:r>
-      <w:r>
-        <w:t xml:space="preserve">qui </w:t>
-      </w:r>
-      <w:r>
-        <w:t>sont exclusivement</w:t>
-      </w:r>
-      <w:r>
-        <w:t xml:space="preserve"> d</w:t>
-      </w:r>
-      <w:r>
-        <w:t>ans</w:t>
-      </w:r>
-      <w:r>
-        <w:t xml:space="preserve"> ce document (en ordre de fréquence)</w:t>
-      </w:r>
-      <w:r>
-        <w:t>. C</w:t>
-      </w:r>
-      <w:r>
-        <w:t>’est la spécificité maximale</w:t>
-      </w:r>
-      <w:r>
-        <w:t xml:space="preserve">, qui n’est pas non plus très significative (par exemple </w:t>
-      </w:r>
-      <w:r>
-        <w:rPr>
-          <w:i/>
-          <w:iCs/>
-        </w:rPr>
-        <w:t>poulpe</w:t>
-      </w:r>
-      <w:r>
-        <w:t xml:space="preserve"> est absent parce qu’il se trouve dans 1</w:t>
-      </w:r>
-      <w:r>
-        <w:t>3 autres</w:t>
-      </w:r>
-      <w:r>
-        <w:t xml:space="preserve"> chapitres de Verne).</w:t>
-      </w:r>
-    </w:p>
-    <w:p>
-      <w:pPr>
-        <w:ind w:firstLine="708"/>
-      </w:pPr>
-      <w:r>
-        <w:t>Pour être descriptif, u</w:t>
-      </w:r>
-      <w:r>
-        <w:t>n mot</w:t>
-      </w:r>
-      <w:r>
-        <w:t>-clé</w:t>
-      </w:r>
-      <w:r>
-        <w:t xml:space="preserve"> </w:t>
-      </w:r>
-      <w:r>
-        <w:t>ne doit pas être trop rare, ni trop fréquent</w:t>
-      </w:r>
-      <w:r>
-        <w:t>.</w:t>
-      </w:r>
-      <w:r>
-        <w:t xml:space="preserve"> </w:t>
-      </w:r>
-      <w:r>
-        <w:t>Les algorithmes de spécificité cherchent à trouver un équilibre mathématique entre généralité et rareté.</w:t>
-      </w:r>
-      <w:r>
-        <w:t xml:space="preserve"> </w:t>
-      </w:r>
-      <w:r>
-        <w:t>Remarquons</w:t>
-      </w:r>
-      <w:r>
-        <w:t xml:space="preserve"> que le </w:t>
+        <w:t>,)</w:t>
+      </w:r>
+      <w:r>
+        <w:t xml:space="preserve">. </w:t>
+      </w:r>
+      <w:r>
+        <w:t xml:space="preserve">À cette échelle, le </w:t>
       </w:r>
       <w:r>
         <w:rPr>
@@ -2274,74 +2216,11 @@
         <w:t>chi2</w:t>
       </w:r>
       <w:r>
-        <w:t xml:space="preserve">, assez classique en statistiques, relève des mots comme </w:t>
-      </w:r>
-      <w:r>
-        <w:rPr>
-          <w:i/>
-          <w:iCs/>
-        </w:rPr>
-        <w:t>espalier</w:t>
-      </w:r>
-      <w:r>
-        <w:t xml:space="preserve">, </w:t>
-      </w:r>
-      <w:r>
-        <w:rPr>
-          <w:i/>
-          <w:iCs/>
-        </w:rPr>
-        <w:t>violacé</w:t>
-      </w:r>
-      <w:r>
-        <w:t xml:space="preserve"> </w:t>
-      </w:r>
-      <w:r>
-        <w:t xml:space="preserve">qui ne sont </w:t>
-      </w:r>
-      <w:r>
-        <w:t>présents que dans ce seul chapitre</w:t>
-      </w:r>
-      <w:r>
-        <w:t xml:space="preserve"> (voir </w:t>
-      </w:r>
-      <w:r>
-        <w:rPr>
-          <w:i/>
-          <w:iCs/>
-        </w:rPr>
-        <w:t>focalex</w:t>
-      </w:r>
-      <w:r>
-        <w:rPr>
-          <w:i/>
-          <w:iCs/>
-        </w:rPr>
-        <w:t>2.0</w:t>
-      </w:r>
-      <w:r>
-        <w:t>,)</w:t>
-      </w:r>
-      <w:r>
-        <w:t xml:space="preserve">. </w:t>
-      </w:r>
-      <w:r>
-        <w:t xml:space="preserve">À cette échelle, le </w:t>
-      </w:r>
-      <w:r>
-        <w:rPr>
-          <w:i/>
-          <w:iCs/>
-        </w:rPr>
-        <w:t>chi2</w:t>
-      </w:r>
-      <w:r>
         <w:t xml:space="preserve"> est trop spécifique.</w:t>
       </w:r>
       <w:r>
         <w:t xml:space="preserve"> </w:t>
       </w:r>
-      <w:proofErr w:type="spellStart"/>
       <w:r>
         <w:rPr>
           <w:i/>
@@ -2356,7 +2235,6 @@
         </w:rPr>
         <w:t>log</w:t>
       </w:r>
-      <w:proofErr w:type="spellEnd"/>
       <w:r>
         <w:t xml:space="preserve"> et </w:t>
       </w:r>
@@ -2374,13 +2252,8 @@
         <w:t>ne promeuvent pas</w:t>
       </w:r>
       <w:r>
-        <w:t xml:space="preserve"> les </w:t>
-      </w:r>
-      <w:proofErr w:type="spellStart"/>
-      <w:r>
-        <w:t>happax</w:t>
-      </w:r>
-      <w:proofErr w:type="spellEnd"/>
+        <w:t xml:space="preserve"> les happax</w:t>
+      </w:r>
       <w:r>
         <w:t>,</w:t>
       </w:r>
@@ -2442,27 +2315,26 @@
           <w:i/>
           <w:iCs/>
         </w:rPr>
-        <w:t>g2</w:t>
+        <w:t>G</w:t>
+      </w:r>
+      <w:r>
+        <w:rPr>
+          <w:i/>
+          <w:iCs/>
+          <w:vertAlign w:val="superscript"/>
+        </w:rPr>
+        <w:t>2</w:t>
       </w:r>
       <w:r>
         <w:t xml:space="preserve"> donne ici un résultat identique à la spécificité hypergéométrique de </w:t>
       </w:r>
-      <w:proofErr w:type="spellStart"/>
-      <w:r>
-        <w:rPr>
-          <w:i/>
-          <w:iCs/>
-        </w:rPr>
-        <w:t>l</w:t>
-      </w:r>
-      <w:r>
-        <w:rPr>
-          <w:i/>
-          <w:iCs/>
-        </w:rPr>
-        <w:t>afon</w:t>
-      </w:r>
-      <w:proofErr w:type="spellEnd"/>
+      <w:r>
+        <w:rPr>
+          <w:i/>
+          <w:iCs/>
+        </w:rPr>
+        <w:t>Fisher</w:t>
+      </w:r>
       <w:r>
         <w:t>.</w:t>
       </w:r>
@@ -2662,7 +2534,6 @@
       <w:pPr>
         <w:ind w:firstLine="0"/>
       </w:pPr>
-      <w:proofErr w:type="spellStart"/>
       <w:r>
         <w:rPr>
           <w:i/>
@@ -2670,7 +2541,6 @@
         </w:rPr>
         <w:t>tf</w:t>
       </w:r>
-      <w:proofErr w:type="spellEnd"/>
       <w:r>
         <w:t> :</w:t>
       </w:r>
@@ -2763,15 +2633,13 @@
       <w:pPr>
         <w:ind w:firstLine="0"/>
       </w:pPr>
-      <w:proofErr w:type="spellStart"/>
-      <w:r>
-        <w:rPr>
-          <w:i/>
-          <w:iCs/>
-        </w:rPr>
-        <w:t>lafon</w:t>
-      </w:r>
-      <w:proofErr w:type="spellEnd"/>
+      <w:r>
+        <w:rPr>
+          <w:i/>
+          <w:iCs/>
+        </w:rPr>
+        <w:t>fisher</w:t>
+      </w:r>
       <w:r>
         <w:t xml:space="preserve"> : </w:t>
       </w:r>
@@ -2813,7 +2681,6 @@
       <w:pPr>
         <w:ind w:firstLine="0"/>
       </w:pPr>
-      <w:proofErr w:type="spellStart"/>
       <w:r>
         <w:rPr>
           <w:i/>
@@ -2828,7 +2695,6 @@
         </w:rPr>
         <w:t>log</w:t>
       </w:r>
-      <w:proofErr w:type="spellEnd"/>
       <w:r>
         <w:t xml:space="preserve"> : </w:t>
       </w:r>
@@ -2933,73 +2799,84 @@
           <w:b/>
           <w:bCs/>
         </w:rPr>
-        <w:t xml:space="preserve">espalier, violacé, quenotte, suceur, </w:t>
-      </w:r>
-      <w:proofErr w:type="spellStart"/>
+        <w:t>espalier, violacé, quenotte, suceur, brachioures</w:t>
+      </w:r>
+      <w:r>
+        <w:t>…</w:t>
+      </w:r>
+    </w:p>
+    <w:p>
+      <w:pPr>
+        <w:ind w:firstLine="0"/>
+      </w:pPr>
+      <w:r>
+        <w:rPr>
+          <w:i/>
+          <w:iCs/>
+        </w:rPr>
+        <w:t>simplemaths</w:t>
+      </w:r>
+      <w:r>
+        <w:t xml:space="preserve"> : </w:t>
+      </w:r>
       <w:r>
         <w:rPr>
           <w:b/>
           <w:bCs/>
         </w:rPr>
-        <w:t>brachioures</w:t>
-      </w:r>
-      <w:proofErr w:type="spellEnd"/>
-      <w:r>
-        <w:t>…</w:t>
-      </w:r>
-    </w:p>
-    <w:p>
-      <w:pPr>
-        <w:ind w:firstLine="0"/>
-      </w:pPr>
-      <w:proofErr w:type="spellStart"/>
-      <w:r>
-        <w:rPr>
-          <w:i/>
-          <w:iCs/>
-        </w:rPr>
-        <w:t>simplemaths</w:t>
-      </w:r>
-      <w:proofErr w:type="spellEnd"/>
-      <w:r>
-        <w:t xml:space="preserve"> : </w:t>
+        <w:t>poulpe</w:t>
+      </w:r>
+      <w:r>
+        <w:t xml:space="preserve">, </w:t>
       </w:r>
       <w:r>
         <w:rPr>
           <w:b/>
           <w:bCs/>
         </w:rPr>
-        <w:t>poulpe</w:t>
-      </w:r>
-      <w:r>
-        <w:t xml:space="preserve">, </w:t>
+        <w:t>calmar</w:t>
+      </w:r>
+      <w:r>
+        <w:t xml:space="preserve">, ventouse, céphalopode, tentacule, </w:t>
       </w:r>
       <w:r>
         <w:rPr>
           <w:b/>
           <w:bCs/>
         </w:rPr>
-        <w:t>calmar</w:t>
-      </w:r>
-      <w:r>
-        <w:t xml:space="preserve">, ventouse, céphalopode, tentacule, </w:t>
+        <w:t>espalier, violacé, quenotte, suceur, brachioures</w:t>
+      </w:r>
+      <w:r>
+        <w:t>…</w:t>
+      </w:r>
+    </w:p>
+    <w:p>
+      <w:pPr>
+        <w:ind w:firstLine="0"/>
+      </w:pPr>
+      <w:r>
+        <w:rPr>
+          <w:i/>
+          <w:iCs/>
+        </w:rPr>
+        <w:t>g2s2.0</w:t>
+      </w:r>
+      <w:r>
+        <w:t> :</w:t>
+      </w:r>
+      <w:r>
+        <w:t xml:space="preserve"> </w:t>
       </w:r>
       <w:r>
         <w:rPr>
           <w:b/>
           <w:bCs/>
         </w:rPr>
-        <w:t xml:space="preserve">espalier, violacé, quenotte, suceur, </w:t>
-      </w:r>
-      <w:proofErr w:type="spellStart"/>
-      <w:r>
-        <w:rPr>
-          <w:b/>
-          <w:bCs/>
-        </w:rPr>
-        <w:t>brachioures</w:t>
-      </w:r>
-      <w:proofErr w:type="spellEnd"/>
+        <w:t>espalier, violacé, quenotte, suceur, brachioures</w:t>
+      </w:r>
+      <w:r>
+        <w:t xml:space="preserve">, clupanodons, corégone, fissurelles, gobies-plumiers, krak </w:t>
+      </w:r>
       <w:r>
         <w:t>…</w:t>
       </w:r>
@@ -3008,365 +2885,330 @@
       <w:pPr>
         <w:ind w:firstLine="0"/>
       </w:pPr>
-      <w:r>
-        <w:rPr>
-          <w:i/>
-          <w:iCs/>
-        </w:rPr>
-        <w:t>g2s2.0</w:t>
-      </w:r>
-      <w:r>
-        <w:t> :</w:t>
-      </w:r>
-      <w:r>
-        <w:t xml:space="preserve"> </w:t>
-      </w:r>
-      <w:r>
-        <w:rPr>
-          <w:b/>
-          <w:bCs/>
-        </w:rPr>
-        <w:t xml:space="preserve">espalier, violacé, quenotte, suceur, </w:t>
-      </w:r>
-      <w:proofErr w:type="spellStart"/>
-      <w:r>
-        <w:rPr>
-          <w:b/>
-          <w:bCs/>
-        </w:rPr>
-        <w:t>brachioures</w:t>
-      </w:r>
-      <w:proofErr w:type="spellEnd"/>
+    </w:p>
+    <w:p>
+      <w:pPr>
+        <w:ind w:firstLine="0"/>
+      </w:pPr>
+      <w:r>
+        <w:t xml:space="preserve">Un fois filtrés </w:t>
+      </w:r>
+      <w:r>
+        <w:t>l</w:t>
+      </w:r>
+      <w:r>
+        <w:t>es mots grammaticaux</w:t>
+      </w:r>
       <w:r>
         <w:t xml:space="preserve">, </w:t>
       </w:r>
-      <w:proofErr w:type="spellStart"/>
-      <w:r>
-        <w:t>clupanodons</w:t>
-      </w:r>
-      <w:proofErr w:type="spellEnd"/>
-      <w:r>
-        <w:t xml:space="preserve">, corégone, fissurelles, gobies-plumiers, krak </w:t>
-      </w:r>
-      <w:r>
-        <w:t>…</w:t>
-      </w:r>
+      <w:r>
+        <w:t>ainsi qu</w:t>
+      </w:r>
+      <w:r>
+        <w:t>e</w:t>
+      </w:r>
+      <w:r>
+        <w:t xml:space="preserve"> </w:t>
+      </w:r>
+      <w:r>
+        <w:t>l</w:t>
+      </w:r>
+      <w:r>
+        <w:t xml:space="preserve">es noms propres, les </w:t>
+      </w:r>
+      <w:r>
+        <w:t>termes</w:t>
+      </w:r>
+      <w:r>
+        <w:t xml:space="preserve"> les plus fréquents d’un document (</w:t>
+      </w:r>
+      <w:r>
+        <w:rPr>
+          <w:i/>
+          <w:iCs/>
+        </w:rPr>
+        <w:t>tf</w:t>
+      </w:r>
+      <w:r>
+        <w:t xml:space="preserve">) </w:t>
+      </w:r>
+      <w:r>
+        <w:t>sont beaucoup moins insignifiants</w:t>
+      </w:r>
+      <w:r>
+        <w:t>.</w:t>
+      </w:r>
+    </w:p>
+    <w:p>
+      <w:pPr>
+        <w:ind w:firstLine="708"/>
+      </w:pPr>
+      <w:r>
+        <w:t xml:space="preserve">On notera </w:t>
+      </w:r>
+      <w:r>
+        <w:t>cependant</w:t>
+      </w:r>
+      <w:r>
+        <w:t xml:space="preserve"> des mots très généraux </w:t>
+      </w:r>
+      <w:r>
+        <w:t>qui disent peu de la scène</w:t>
+      </w:r>
+      <w:r>
+        <w:t xml:space="preserve"> </w:t>
+      </w:r>
+      <w:r>
+        <w:t>elle-même ; ainsi</w:t>
+      </w:r>
+      <w:r>
+        <w:t xml:space="preserve"> </w:t>
+      </w:r>
+      <w:r>
+        <w:rPr>
+          <w:i/>
+          <w:iCs/>
+        </w:rPr>
+        <w:t>animal</w:t>
+      </w:r>
+      <w:r>
+        <w:t xml:space="preserve">, </w:t>
+      </w:r>
+      <w:r>
+        <w:rPr>
+          <w:i/>
+          <w:iCs/>
+        </w:rPr>
+        <w:t>mètre</w:t>
+      </w:r>
+      <w:r>
+        <w:t>,</w:t>
+      </w:r>
+      <w:r>
+        <w:t xml:space="preserve"> et</w:t>
+      </w:r>
+      <w:r>
+        <w:t xml:space="preserve"> </w:t>
+      </w:r>
+      <w:r>
+        <w:rPr>
+          <w:i/>
+          <w:iCs/>
+        </w:rPr>
+        <w:t>œil</w:t>
+      </w:r>
+      <w:r>
+        <w:t xml:space="preserve"> </w:t>
+      </w:r>
+      <w:r>
+        <w:t xml:space="preserve">(et son pluriel </w:t>
+      </w:r>
+      <w:r>
+        <w:rPr>
+          <w:i/>
+          <w:iCs/>
+        </w:rPr>
+        <w:t>yeux</w:t>
+      </w:r>
+      <w:r>
+        <w:t>), sont très généraux</w:t>
+      </w:r>
+      <w:r>
+        <w:t xml:space="preserve"> ; </w:t>
+      </w:r>
+      <w:r>
+        <w:rPr>
+          <w:i/>
+          <w:iCs/>
+        </w:rPr>
+        <w:t>dire</w:t>
+      </w:r>
+      <w:r>
+        <w:t xml:space="preserve">, </w:t>
+      </w:r>
+      <w:r>
+        <w:rPr>
+          <w:i/>
+          <w:iCs/>
+        </w:rPr>
+        <w:t>répondre</w:t>
+      </w:r>
+      <w:r>
+        <w:t>,</w:t>
+      </w:r>
+      <w:r>
+        <w:t xml:space="preserve"> </w:t>
+      </w:r>
+      <w:r>
+        <w:rPr>
+          <w:i/>
+          <w:iCs/>
+        </w:rPr>
+        <w:t>demander</w:t>
+      </w:r>
+      <w:r>
+        <w:t xml:space="preserve"> sont </w:t>
+      </w:r>
+      <w:r>
+        <w:t>des verbes d’expression propres au genre du roman</w:t>
+      </w:r>
+      <w:r>
+        <w:t> ;</w:t>
+      </w:r>
+      <w:r>
+        <w:t xml:space="preserve"> </w:t>
+      </w:r>
+      <w:r>
+        <w:rPr>
+          <w:i/>
+          <w:iCs/>
+        </w:rPr>
+        <w:t>capitaine</w:t>
+      </w:r>
+      <w:r>
+        <w:t xml:space="preserve"> et </w:t>
+      </w:r>
+      <w:r>
+        <w:rPr>
+          <w:i/>
+          <w:iCs/>
+        </w:rPr>
+        <w:t>mer</w:t>
+      </w:r>
+      <w:r>
+        <w:t xml:space="preserve"> tiennent au sous-genre du roman d’aventure</w:t>
+      </w:r>
+      <w:r>
+        <w:t>.</w:t>
+      </w:r>
+      <w:r>
+        <w:t xml:space="preserve"> Le thème du chapitre est beaucoup mieux exprimé par</w:t>
+      </w:r>
+      <w:r>
+        <w:t xml:space="preserve"> les mots</w:t>
+      </w:r>
+      <w:r>
+        <w:t xml:space="preserve"> </w:t>
+      </w:r>
+      <w:r>
+        <w:rPr>
+          <w:i/>
+          <w:iCs/>
+        </w:rPr>
+        <w:t>p</w:t>
+      </w:r>
+      <w:r>
+        <w:rPr>
+          <w:i/>
+          <w:iCs/>
+        </w:rPr>
+        <w:t>o</w:t>
+      </w:r>
+      <w:r>
+        <w:rPr>
+          <w:i/>
+          <w:iCs/>
+        </w:rPr>
+        <w:t>ulpe</w:t>
+      </w:r>
+      <w:r>
+        <w:t xml:space="preserve">, </w:t>
+      </w:r>
+      <w:r>
+        <w:rPr>
+          <w:i/>
+          <w:iCs/>
+        </w:rPr>
+        <w:t>monstre</w:t>
+      </w:r>
+      <w:r>
+        <w:t>,</w:t>
+      </w:r>
+      <w:r>
+        <w:t xml:space="preserve"> et</w:t>
+      </w:r>
+      <w:r>
+        <w:t xml:space="preserve"> </w:t>
+      </w:r>
+      <w:r>
+        <w:rPr>
+          <w:i/>
+          <w:iCs/>
+        </w:rPr>
+        <w:t>calmar</w:t>
+      </w:r>
+      <w:r>
+        <w:t>.</w:t>
+      </w:r>
+      <w:r>
+        <w:t xml:space="preserve"> </w:t>
+      </w:r>
+      <w:r>
+        <w:t xml:space="preserve">Filtrer les mots </w:t>
+      </w:r>
+      <w:r>
+        <w:t>grammaticaux</w:t>
+      </w:r>
+      <w:r>
+        <w:t xml:space="preserve"> ne suffit pas, i</w:t>
+      </w:r>
+      <w:r>
+        <w:t xml:space="preserve">l reste utile de pondérer la fréquence dans le texte </w:t>
+      </w:r>
+      <w:r>
+        <w:t>par</w:t>
+      </w:r>
+      <w:r>
+        <w:t xml:space="preserve"> le reste du corpus.</w:t>
+      </w:r>
+    </w:p>
+    <w:p>
+      <w:pPr>
+        <w:ind w:firstLine="708"/>
+      </w:pPr>
+      <w:r>
+        <w:t xml:space="preserve">Le rang du mot </w:t>
+      </w:r>
+      <w:r>
+        <w:rPr>
+          <w:i/>
+          <w:iCs/>
+        </w:rPr>
+        <w:t>monstre</w:t>
+      </w:r>
+      <w:r>
+        <w:t xml:space="preserve"> semble justifier la qualité sémantique de </w:t>
+      </w:r>
+      <w:r>
+        <w:rPr>
+          <w:i/>
+          <w:iCs/>
+        </w:rPr>
+        <w:t>g2</w:t>
+      </w:r>
+      <w:r>
+        <w:t xml:space="preserve"> et </w:t>
+      </w:r>
+      <w:r>
+        <w:rPr>
+          <w:i/>
+          <w:iCs/>
+        </w:rPr>
+        <w:t>lafon</w:t>
+      </w:r>
+      <w:r>
+        <w:t xml:space="preserve"> contre les classiques des moteurs de recherche, tandis que les autres scores relèvent trop de mots exclusifs.</w:t>
+      </w:r>
+    </w:p>
+    <w:p>
+      <w:pPr>
+        <w:ind w:firstLine="708"/>
+      </w:pPr>
     </w:p>
     <w:p>
       <w:pPr>
         <w:ind w:firstLine="0"/>
-      </w:pPr>
-    </w:p>
-    <w:p>
-      <w:pPr>
-        <w:ind w:firstLine="0"/>
-      </w:pPr>
-      <w:r>
-        <w:t xml:space="preserve">Un fois filtrés </w:t>
-      </w:r>
-      <w:r>
-        <w:t>l</w:t>
-      </w:r>
-      <w:r>
-        <w:t>es mots grammaticaux</w:t>
-      </w:r>
-      <w:r>
-        <w:t xml:space="preserve">, </w:t>
-      </w:r>
-      <w:r>
-        <w:t>ainsi qu</w:t>
-      </w:r>
-      <w:r>
-        <w:t>e</w:t>
-      </w:r>
-      <w:r>
-        <w:t xml:space="preserve"> </w:t>
-      </w:r>
-      <w:r>
-        <w:t>l</w:t>
-      </w:r>
-      <w:r>
-        <w:t xml:space="preserve">es noms propres, les </w:t>
-      </w:r>
-      <w:r>
-        <w:t>termes</w:t>
-      </w:r>
-      <w:r>
-        <w:t xml:space="preserve"> les plus fréquents d’un document (</w:t>
-      </w:r>
-      <w:proofErr w:type="spellStart"/>
-      <w:r>
-        <w:rPr>
-          <w:i/>
-          <w:iCs/>
-        </w:rPr>
-        <w:t>tf</w:t>
-      </w:r>
-      <w:proofErr w:type="spellEnd"/>
-      <w:r>
-        <w:t xml:space="preserve">) </w:t>
-      </w:r>
-      <w:r>
-        <w:t>sont beaucoup moins insignifiants</w:t>
-      </w:r>
-      <w:r>
-        <w:t>.</w:t>
-      </w:r>
-    </w:p>
-    <w:p>
-      <w:pPr>
-        <w:ind w:firstLine="708"/>
-      </w:pPr>
-      <w:r>
-        <w:t xml:space="preserve">On notera </w:t>
-      </w:r>
-      <w:r>
-        <w:t>cependant</w:t>
-      </w:r>
-      <w:r>
-        <w:t xml:space="preserve"> des mots très généraux </w:t>
-      </w:r>
-      <w:r>
-        <w:t>qui disent peu de la scène</w:t>
-      </w:r>
-      <w:r>
-        <w:t xml:space="preserve"> comme </w:t>
-      </w:r>
-      <w:r>
-        <w:rPr>
-          <w:i/>
-          <w:iCs/>
-        </w:rPr>
-        <w:t>animal</w:t>
-      </w:r>
-      <w:r>
-        <w:t xml:space="preserve">, </w:t>
-      </w:r>
-      <w:r>
-        <w:rPr>
-          <w:i/>
-          <w:iCs/>
-        </w:rPr>
-        <w:t>mètre</w:t>
-      </w:r>
-      <w:r>
-        <w:t xml:space="preserve">, </w:t>
-      </w:r>
-      <w:r>
-        <w:rPr>
-          <w:i/>
-          <w:iCs/>
-        </w:rPr>
-        <w:t>œil</w:t>
-      </w:r>
-      <w:r>
-        <w:t xml:space="preserve"> ; </w:t>
-      </w:r>
-      <w:r>
-        <w:t xml:space="preserve">des </w:t>
-      </w:r>
-      <w:r>
-        <w:t>verbes d’expression</w:t>
-      </w:r>
-      <w:r>
-        <w:t xml:space="preserve"> </w:t>
-      </w:r>
-      <w:r>
-        <w:t>propre</w:t>
-      </w:r>
-      <w:r>
-        <w:t>s</w:t>
-      </w:r>
-      <w:r>
-        <w:t xml:space="preserve"> au genre du roman</w:t>
-      </w:r>
-      <w:r>
-        <w:t xml:space="preserve"> comme</w:t>
-      </w:r>
-      <w:r>
-        <w:t xml:space="preserve"> </w:t>
-      </w:r>
-      <w:r>
-        <w:rPr>
-          <w:i/>
-          <w:iCs/>
-        </w:rPr>
-        <w:t>dire</w:t>
-      </w:r>
-      <w:r>
-        <w:t xml:space="preserve">, </w:t>
-      </w:r>
-      <w:r>
-        <w:rPr>
-          <w:i/>
-          <w:iCs/>
-        </w:rPr>
-        <w:t>répondre</w:t>
-      </w:r>
-      <w:r>
-        <w:t>,</w:t>
-      </w:r>
-      <w:r>
-        <w:t xml:space="preserve"> </w:t>
-      </w:r>
-      <w:r>
-        <w:rPr>
-          <w:i/>
-          <w:iCs/>
-        </w:rPr>
-        <w:t>demander</w:t>
-      </w:r>
-      <w:r>
-        <w:t>,</w:t>
-      </w:r>
-      <w:r>
-        <w:t xml:space="preserve"> </w:t>
-      </w:r>
-      <w:r>
-        <w:t xml:space="preserve">ou du sous-genre d’aventures comme </w:t>
-      </w:r>
-      <w:r>
-        <w:rPr>
-          <w:i/>
-          <w:iCs/>
-        </w:rPr>
-        <w:t>capitaine</w:t>
-      </w:r>
-      <w:r>
-        <w:t xml:space="preserve"> et </w:t>
-      </w:r>
-      <w:r>
-        <w:rPr>
-          <w:i/>
-          <w:iCs/>
-        </w:rPr>
-        <w:t>mer</w:t>
-      </w:r>
-      <w:r>
-        <w:t>.</w:t>
-      </w:r>
-      <w:r>
-        <w:t xml:space="preserve"> Le thème du chapitre est beaucoup mieux exprimé par</w:t>
-      </w:r>
-      <w:r>
-        <w:t xml:space="preserve"> les mots</w:t>
-      </w:r>
-      <w:r>
-        <w:t xml:space="preserve"> </w:t>
-      </w:r>
-      <w:r>
-        <w:rPr>
-          <w:i/>
-          <w:iCs/>
-        </w:rPr>
-        <w:t>p</w:t>
-      </w:r>
-      <w:r>
-        <w:rPr>
-          <w:i/>
-          <w:iCs/>
-        </w:rPr>
-        <w:t>o</w:t>
-      </w:r>
-      <w:r>
-        <w:rPr>
-          <w:i/>
-          <w:iCs/>
-        </w:rPr>
-        <w:t>ulpe</w:t>
-      </w:r>
-      <w:r>
-        <w:t xml:space="preserve">, </w:t>
-      </w:r>
-      <w:r>
-        <w:rPr>
-          <w:i/>
-          <w:iCs/>
-        </w:rPr>
-        <w:t>monstre</w:t>
-      </w:r>
-      <w:r>
-        <w:t>,</w:t>
-      </w:r>
-      <w:r>
-        <w:t xml:space="preserve"> et</w:t>
-      </w:r>
-      <w:r>
-        <w:t xml:space="preserve"> </w:t>
-      </w:r>
-      <w:r>
-        <w:rPr>
-          <w:i/>
-          <w:iCs/>
-        </w:rPr>
-        <w:t>calmar</w:t>
-      </w:r>
-      <w:r>
-        <w:t>.</w:t>
-      </w:r>
-      <w:r>
-        <w:t xml:space="preserve"> </w:t>
-      </w:r>
-      <w:r>
-        <w:t xml:space="preserve">Filtrer les mots </w:t>
-      </w:r>
-      <w:r>
-        <w:t>grammaticaux</w:t>
-      </w:r>
-      <w:r>
-        <w:t xml:space="preserve"> ne suffit pas, i</w:t>
-      </w:r>
-      <w:r>
-        <w:t xml:space="preserve">l reste utile de pondérer la fréquence dans le texte </w:t>
-      </w:r>
-      <w:r>
-        <w:t>par</w:t>
-      </w:r>
-      <w:r>
-        <w:t xml:space="preserve"> le reste du corpus.</w:t>
-      </w:r>
-      <w:r>
-        <w:t xml:space="preserve"> </w:t>
-      </w:r>
-      <w:r>
-        <w:t xml:space="preserve">Le rang du mot </w:t>
-      </w:r>
-      <w:r>
-        <w:rPr>
-          <w:i/>
-          <w:iCs/>
-        </w:rPr>
-        <w:t>monstre</w:t>
-      </w:r>
-      <w:r>
-        <w:t xml:space="preserve"> semble justifier la qualité sémantique de </w:t>
-      </w:r>
-      <w:r>
-        <w:rPr>
-          <w:i/>
-          <w:iCs/>
-        </w:rPr>
-        <w:t>g2</w:t>
-      </w:r>
-      <w:r>
-        <w:t xml:space="preserve"> et </w:t>
-      </w:r>
-      <w:proofErr w:type="spellStart"/>
-      <w:r>
-        <w:rPr>
-          <w:i/>
-          <w:iCs/>
-        </w:rPr>
-        <w:t>lafon</w:t>
-      </w:r>
-      <w:proofErr w:type="spellEnd"/>
-      <w:r>
-        <w:t>.</w:t>
-      </w:r>
-    </w:p>
-    <w:p>
-      <w:pPr>
-        <w:ind w:firstLine="708"/>
       </w:pPr>
       <w:r>
         <w:t xml:space="preserve">Les impressions </w:t>
@@ -3513,18 +3355,14 @@
         <w:t>du domaine</w:t>
       </w:r>
       <w:r>
-        <w:t>, G</w:t>
-      </w:r>
-      <w:r>
-        <w:rPr>
-          <w:vertAlign w:val="superscript"/>
-        </w:rPr>
-        <w:t>2</w:t>
-      </w:r>
-      <w:r>
-        <w:t xml:space="preserve">, et sa version paramétrable </w:t>
-      </w:r>
-      <w:proofErr w:type="spellStart"/>
+        <w:t xml:space="preserve">, </w:t>
+      </w:r>
+      <w:r>
+        <w:t>ainsi que</w:t>
+      </w:r>
+      <w:r>
+        <w:t xml:space="preserve"> </w:t>
+      </w:r>
       <w:r>
         <w:rPr>
           <w:i/>
@@ -3532,7 +3370,6 @@
         </w:rPr>
         <w:t>Focalex</w:t>
       </w:r>
-      <w:proofErr w:type="spellEnd"/>
       <w:r>
         <w:t>.</w:t>
       </w:r>
@@ -3617,7 +3454,6 @@
       <w:r>
         <w:t xml:space="preserve"> </w:t>
       </w:r>
-      <w:proofErr w:type="spellStart"/>
       <w:r>
         <w:rPr>
           <w:i/>
@@ -3625,7 +3461,6 @@
         </w:rPr>
         <w:t>tf</w:t>
       </w:r>
-      <w:proofErr w:type="spellEnd"/>
       <w:r>
         <w:t xml:space="preserve"> et </w:t>
       </w:r>
@@ -3661,7 +3496,6 @@
       <w:r>
         <w:t xml:space="preserve"> sont </w:t>
       </w:r>
-      <w:proofErr w:type="spellStart"/>
       <w:r>
         <w:rPr>
           <w:i/>
@@ -3669,11 +3503,9 @@
         </w:rPr>
         <w:t>tf</w:t>
       </w:r>
-      <w:proofErr w:type="spellEnd"/>
       <w:r>
         <w:t xml:space="preserve"> et </w:t>
       </w:r>
-      <w:proofErr w:type="spellStart"/>
       <w:r>
         <w:rPr>
           <w:i/>
@@ -3681,7 +3513,6 @@
         </w:rPr>
         <w:t>simplemaths</w:t>
       </w:r>
-      <w:proofErr w:type="spellEnd"/>
       <w:r>
         <w:rPr>
           <w:i/>
@@ -3710,7 +3541,13 @@
         <w:t>2.0</w:t>
       </w:r>
       <w:r>
-        <w:t>  a été sorti des calculs, car beaucoup de chapitres n’ont pas 100 mots spécifiques, les distances n’étaient plus comparables.</w:t>
+        <w:t xml:space="preserve">  a été sorti des calculs, car beaucoup de chapitres n’ont pas 100 mots </w:t>
+      </w:r>
+      <w:r>
+        <w:t>exclusifs</w:t>
+      </w:r>
+      <w:r>
+        <w:t>, les distances n’étaient plus comparables.</w:t>
       </w:r>
     </w:p>
     <w:p>
@@ -3765,21 +3602,30 @@
         </w:rPr>
         <w:t> » (</w:t>
       </w:r>
-      <w:proofErr w:type="spellStart"/>
-      <w:r>
-        <w:rPr>
-          <w:lang w:val="fr-FR"/>
-        </w:rPr>
-        <w:t>eng</w:t>
-      </w:r>
-      <w:proofErr w:type="spellEnd"/>
+      <w:r>
+        <w:rPr>
+          <w:lang w:val="fr-FR"/>
+        </w:rPr>
+        <w:t>an</w:t>
+      </w:r>
+      <w:r>
+        <w:rPr>
+          <w:lang w:val="fr-FR"/>
+        </w:rPr>
+        <w:t>g</w:t>
+      </w:r>
+      <w:r>
+        <w:rPr>
+          <w:lang w:val="fr-FR"/>
+        </w:rPr>
+        <w:t>lais</w:t>
+      </w:r>
       <w:r>
         <w:rPr>
           <w:lang w:val="fr-FR"/>
         </w:rPr>
         <w:t xml:space="preserve"> : </w:t>
       </w:r>
-      <w:proofErr w:type="spellStart"/>
       <w:r>
         <w:rPr>
           <w:i/>
@@ -3788,7 +3634,6 @@
         </w:rPr>
         <w:t>PCoA</w:t>
       </w:r>
-      <w:proofErr w:type="spellEnd"/>
       <w:r>
         <w:rPr>
           <w:lang w:val="fr-FR"/>
@@ -3990,7 +3835,6 @@
         </w:rPr>
         <w:t xml:space="preserve"> </w:t>
       </w:r>
-      <w:proofErr w:type="spellStart"/>
       <w:r>
         <w:rPr>
           <w:i/>
@@ -3999,7 +3843,6 @@
         </w:rPr>
         <w:t>focalex</w:t>
       </w:r>
-      <w:proofErr w:type="spellEnd"/>
       <w:r>
         <w:rPr>
           <w:lang w:val="fr-FR"/>
@@ -4050,7 +3893,6 @@
         </w:rPr>
         <w:t xml:space="preserve">fférents </w:t>
       </w:r>
-      <w:proofErr w:type="spellStart"/>
       <w:r>
         <w:rPr>
           <w:i/>
@@ -4058,7 +3900,6 @@
         </w:rPr>
         <w:t>focalex</w:t>
       </w:r>
-      <w:proofErr w:type="spellEnd"/>
       <w:r>
         <w:rPr>
           <w:lang w:val="fr-FR"/>
@@ -4103,7 +3944,6 @@
         </w:rPr>
         <w:t xml:space="preserve"> et les </w:t>
       </w:r>
-      <w:proofErr w:type="spellStart"/>
       <w:r>
         <w:rPr>
           <w:i/>
@@ -4112,7 +3952,6 @@
         </w:rPr>
         <w:t>tfidf</w:t>
       </w:r>
-      <w:proofErr w:type="spellEnd"/>
       <w:r>
         <w:rPr>
           <w:lang w:val="fr-FR"/>
@@ -4131,7 +3970,6 @@
         </w:rPr>
         <w:t xml:space="preserve"> la fréquence par document </w:t>
       </w:r>
-      <w:proofErr w:type="spellStart"/>
       <w:r>
         <w:rPr>
           <w:i/>
@@ -4140,7 +3978,6 @@
         </w:rPr>
         <w:t>df</w:t>
       </w:r>
-      <w:proofErr w:type="spellEnd"/>
       <w:r>
         <w:rPr>
           <w:lang w:val="fr-FR"/>
@@ -4202,7 +4039,6 @@
         <w:lastRenderedPageBreak/>
         <w:t>linéaire (</w:t>
       </w:r>
-      <w:proofErr w:type="spellStart"/>
       <w:r>
         <w:rPr>
           <w:i/>
@@ -4211,14 +4047,12 @@
         </w:rPr>
         <w:t>tf</w:t>
       </w:r>
-      <w:proofErr w:type="spellEnd"/>
       <w:r>
         <w:rPr>
           <w:lang w:val="fr-FR"/>
         </w:rPr>
         <w:t xml:space="preserve">, </w:t>
       </w:r>
-      <w:proofErr w:type="spellStart"/>
       <w:r>
         <w:rPr>
           <w:i/>
@@ -4227,14 +4061,12 @@
         </w:rPr>
         <w:t>tfidf</w:t>
       </w:r>
-      <w:proofErr w:type="spellEnd"/>
       <w:r>
         <w:rPr>
           <w:lang w:val="fr-FR"/>
         </w:rPr>
         <w:t xml:space="preserve">, </w:t>
       </w:r>
-      <w:proofErr w:type="spellStart"/>
       <w:r>
         <w:rPr>
           <w:i/>
@@ -4243,7 +4075,6 @@
         </w:rPr>
         <w:t>simplemaths</w:t>
       </w:r>
-      <w:proofErr w:type="spellEnd"/>
       <w:r>
         <w:rPr>
           <w:lang w:val="fr-FR"/>
@@ -4284,7 +4115,6 @@
         </w:rPr>
         <w:t xml:space="preserve">, </w:t>
       </w:r>
-      <w:proofErr w:type="spellStart"/>
       <w:r>
         <w:rPr>
           <w:i/>
@@ -4293,7 +4123,6 @@
         </w:rPr>
         <w:t>tfidflog</w:t>
       </w:r>
-      <w:proofErr w:type="spellEnd"/>
       <w:r>
         <w:rPr>
           <w:lang w:val="fr-FR"/>
@@ -4304,9 +4133,20 @@
         <w:rPr>
           <w:lang w:val="fr-FR"/>
         </w:rPr>
-        <w:t>, factorielle ou hypergéométrique (</w:t>
-      </w:r>
-      <w:proofErr w:type="spellStart"/>
+        <w:t xml:space="preserve">, factorielle </w:t>
+      </w:r>
+      <w:r>
+        <w:rPr>
+          <w:lang w:val="fr-FR"/>
+        </w:rPr>
+        <w:t>c’est-à-dire</w:t>
+      </w:r>
+      <w:r>
+        <w:rPr>
+          <w:lang w:val="fr-FR"/>
+        </w:rPr>
+        <w:t xml:space="preserve"> hypergéométrique (</w:t>
+      </w:r>
       <w:r>
         <w:rPr>
           <w:i/>
@@ -4315,7 +4155,6 @@
         </w:rPr>
         <w:t>lafon</w:t>
       </w:r>
-      <w:proofErr w:type="spellEnd"/>
       <w:r>
         <w:rPr>
           <w:lang w:val="fr-FR"/>
@@ -4326,7 +4165,19 @@
         <w:rPr>
           <w:lang w:val="fr-FR"/>
         </w:rPr>
-        <w:t>Toutefois lorsque ces scores sont utilisés pour ordonner une liste de mots-clés, on observe une loi qui confirme les impressions plus haut : les formules varient entre généralité et spécificité des mots relevés.</w:t>
+        <w:t xml:space="preserve">Toutefois lorsque ces scores sont utilisés pour ordonner une liste de mots-clés, on observe une loi qui confirme les impressions plus haut : les formules varient entre généralité et </w:t>
+      </w:r>
+      <w:r>
+        <w:rPr>
+          <w:lang w:val="fr-FR"/>
+        </w:rPr>
+        <w:t>exclusivité</w:t>
+      </w:r>
+      <w:r>
+        <w:rPr>
+          <w:lang w:val="fr-FR"/>
+        </w:rPr>
+        <w:t xml:space="preserve"> des mots relevés.</w:t>
       </w:r>
     </w:p>
     <w:p>
@@ -4348,7 +4199,6 @@
         </w:rPr>
         <w:t xml:space="preserve">e </w:t>
       </w:r>
-      <w:proofErr w:type="spellStart"/>
       <w:r>
         <w:rPr>
           <w:i/>
@@ -4357,7 +4207,6 @@
         </w:rPr>
         <w:t>Focalex</w:t>
       </w:r>
-      <w:proofErr w:type="spellEnd"/>
       <w:r>
         <w:rPr>
           <w:lang w:val="fr-FR"/>
@@ -4380,7 +4229,19 @@
         <w:rPr>
           <w:lang w:val="fr-FR"/>
         </w:rPr>
-        <w:t xml:space="preserve"> le degré de spécificité </w:t>
+        <w:t xml:space="preserve"> le degré d</w:t>
+      </w:r>
+      <w:r>
+        <w:rPr>
+          <w:lang w:val="fr-FR"/>
+        </w:rPr>
+        <w:t>’exclusivité</w:t>
+      </w:r>
+      <w:r>
+        <w:rPr>
+          <w:lang w:val="fr-FR"/>
+        </w:rPr>
+        <w:t xml:space="preserve"> </w:t>
       </w:r>
       <w:r>
         <w:rPr>
@@ -4462,7 +4323,6 @@
         </w:rPr>
         <w:t xml:space="preserve">chiffres produits par </w:t>
       </w:r>
-      <w:proofErr w:type="spellStart"/>
       <w:r>
         <w:rPr>
           <w:i/>
@@ -4471,7 +4331,6 @@
         </w:rPr>
         <w:t>Focalex</w:t>
       </w:r>
-      <w:proofErr w:type="spellEnd"/>
       <w:r>
         <w:rPr>
           <w:lang w:val="fr-FR"/>
@@ -4487,6 +4346,87 @@
     </w:p>
     <w:p>
       <w:pPr>
+        <w:ind w:firstLine="708"/>
+        <w:rPr>
+          <w:lang w:val="fr-FR"/>
+        </w:rPr>
+      </w:pPr>
+    </w:p>
+    <w:p>
+      <w:pPr>
+        <w:ind w:firstLine="0"/>
+      </w:pPr>
+      <w:r>
+        <w:t>Cette section</w:t>
+      </w:r>
+      <w:r>
+        <w:t xml:space="preserve"> semble établir que les formules de spécificités parcourent globalement un spectre entre la fréquence locale et la fréquence exclusive. Les formules relevant</w:t>
+      </w:r>
+      <w:r>
+        <w:t xml:space="preserve"> plus</w:t>
+      </w:r>
+      <w:r>
+        <w:t xml:space="preserve"> les mots exclusifs </w:t>
+      </w:r>
+      <w:r>
+        <w:t xml:space="preserve">ont montré leur </w:t>
+      </w:r>
+      <w:r>
+        <w:t>util</w:t>
+      </w:r>
+      <w:r>
+        <w:t>ité pour l’extraction de collocations</w:t>
+      </w:r>
+      <w:r>
+        <w:t xml:space="preserve"> linguistiques</w:t>
+      </w:r>
+      <w:r>
+        <w:t xml:space="preserve"> (</w:t>
+      </w:r>
+      <w:r>
+        <w:t>simplemaths), ou l</w:t>
+      </w:r>
+      <w:r>
+        <w:t>a recherche documentaires (</w:t>
+      </w:r>
+      <w:r>
+        <w:rPr>
+          <w:i/>
+          <w:iCs/>
+        </w:rPr>
+        <w:t>bm25</w:t>
+      </w:r>
+      <w:r>
+        <w:t xml:space="preserve">). Pour ce qui nous intéresse ici, les tests statistiques </w:t>
+      </w:r>
+      <w:r>
+        <w:rPr>
+          <w:i/>
+          <w:iCs/>
+        </w:rPr>
+        <w:t>Fisher</w:t>
+      </w:r>
+      <w:r>
+        <w:t xml:space="preserve"> et G</w:t>
+      </w:r>
+      <w:r>
+        <w:rPr>
+          <w:vertAlign w:val="superscript"/>
+        </w:rPr>
+        <w:t>2</w:t>
+      </w:r>
+      <w:r>
+        <w:t xml:space="preserve"> semblent les score</w:t>
+      </w:r>
+      <w:r>
+        <w:t>s les plus pertinents</w:t>
+      </w:r>
+      <w:r>
+        <w:t xml:space="preserve"> pour l’extraction de mots-clés sémantiques.</w:t>
+      </w:r>
+    </w:p>
+    <w:p>
+      <w:pPr>
         <w:pStyle w:val="Heading1"/>
       </w:pPr>
       <w:r>
@@ -4498,43 +4438,17 @@
         <w:ind w:firstLine="0"/>
       </w:pPr>
       <w:r>
-        <w:t xml:space="preserve">§1 </w:t>
-      </w:r>
-      <w:r>
-        <w:t>semble</w:t>
-      </w:r>
-      <w:r>
-        <w:t xml:space="preserve"> établi</w:t>
-      </w:r>
-      <w:r>
-        <w:t>r</w:t>
-      </w:r>
-      <w:r>
-        <w:t xml:space="preserve"> que les formules de spécificités parcourent globalement un spectre </w:t>
-      </w:r>
-      <w:r>
-        <w:t>entre la</w:t>
-      </w:r>
-      <w:r>
-        <w:t xml:space="preserve"> fréquence</w:t>
-      </w:r>
-      <w:r>
-        <w:t xml:space="preserve"> locale et la fréquence exclusive pour l’extraction d</w:t>
-      </w:r>
-      <w:r>
-        <w:t>e</w:t>
-      </w:r>
-      <w:r>
-        <w:t xml:space="preserve"> mots clés</w:t>
-      </w:r>
-      <w:r>
-        <w:t xml:space="preserve"> significatifs</w:t>
-      </w:r>
-      <w:r>
-        <w:t xml:space="preserve"> d’une partie de corpus. </w:t>
-      </w:r>
-      <w:r>
-        <w:t xml:space="preserve">Cette expérience ne permet d’observer la totalité des mots clés par partie. Jusqu’ici l’impression humaine semble indiquer que </w:t>
+        <w:t xml:space="preserve">Pour l’instant, nous ne saurions pas départager </w:t>
+      </w:r>
+      <w:r>
+        <w:rPr>
+          <w:i/>
+          <w:iCs/>
+        </w:rPr>
+        <w:t>Fisher</w:t>
+      </w:r>
+      <w:r>
+        <w:t xml:space="preserve"> et </w:t>
       </w:r>
       <w:r>
         <w:rPr>
@@ -4552,6 +4466,31 @@
         <w:t>2</w:t>
       </w:r>
       <w:r>
+        <w:t xml:space="preserve"> autrement que par la doctrine, l’existant, ou la rapidité de calcul. Chacun de ces arguments ont de l’importance. La cohérence d’une doctrine aide l’utilisateur à comprendre </w:t>
+      </w:r>
+      <w:r>
+        <w:t>l</w:t>
+      </w:r>
+      <w:r>
+        <w:t>es résultats ; le code existant ne se réécrit pas en quelques heures ; la rapidité permet de chercher plus et donc</w:t>
+      </w:r>
+      <w:r>
+        <w:t xml:space="preserve"> de</w:t>
+      </w:r>
+      <w:r>
+        <w:t xml:space="preserve"> trouver plus. Mais ces raisons restent externes. Cette section tentera de proposer des tests décisifs pour départager</w:t>
+      </w:r>
+      <w:r>
+        <w:t xml:space="preserve"> </w:t>
+      </w:r>
+      <w:r>
+        <w:rPr>
+          <w:i/>
+          <w:iCs/>
+        </w:rPr>
+        <w:t>Fisher</w:t>
+      </w:r>
+      <w:r>
         <w:t xml:space="preserve"> et </w:t>
       </w:r>
       <w:r>
@@ -4559,11 +4498,100 @@
           <w:i/>
           <w:iCs/>
         </w:rPr>
-        <w:t>Fisher</w:t>
-      </w:r>
-      <w:r>
-        <w:t xml:space="preserve"> semblent le meilleur compromis </w:t>
-      </w:r>
+        <w:t>G</w:t>
+      </w:r>
+      <w:r>
+        <w:rPr>
+          <w:i/>
+          <w:iCs/>
+          <w:vertAlign w:val="superscript"/>
+        </w:rPr>
+        <w:t>2</w:t>
+      </w:r>
+      <w:r>
+        <w:t>, et peut-être rattraper d’autres formules trop vite écartées dans la section précédente.</w:t>
+      </w:r>
+    </w:p>
+    <w:p>
+      <w:pPr>
+        <w:ind w:firstLine="708"/>
+      </w:pPr>
+      <w:r>
+        <w:t>En §1</w:t>
+      </w:r>
+      <w:r>
+        <w:t xml:space="preserve"> n’ont été</w:t>
+      </w:r>
+      <w:r>
+        <w:t xml:space="preserve"> observé</w:t>
+      </w:r>
+      <w:r>
+        <w:t>s</w:t>
+      </w:r>
+      <w:r>
+        <w:t xml:space="preserve"> que les 100 premiers mots-clés</w:t>
+      </w:r>
+      <w:r>
+        <w:t xml:space="preserve"> p</w:t>
+      </w:r>
+      <w:r>
+        <w:t>ar</w:t>
+      </w:r>
+      <w:r>
+        <w:t xml:space="preserve"> chapitre. Rien n’assure que </w:t>
+      </w:r>
+      <w:r>
+        <w:t>le score des autres mots</w:t>
+      </w:r>
+      <w:r>
+        <w:t xml:space="preserve"> </w:t>
+      </w:r>
+      <w:r>
+        <w:t xml:space="preserve">soit aussi pertinent. Les expériences qui suivent </w:t>
+      </w:r>
+      <w:r>
+        <w:t xml:space="preserve">travailleront sur le vecteur complet </w:t>
+      </w:r>
+      <w:r>
+        <w:t xml:space="preserve">de tous les mots d’un texte, </w:t>
+      </w:r>
+      <w:r>
+        <w:t>portant</w:t>
+      </w:r>
+      <w:r>
+        <w:t xml:space="preserve"> chacun</w:t>
+      </w:r>
+      <w:r>
+        <w:t xml:space="preserve"> </w:t>
+      </w:r>
+      <w:r>
+        <w:t>un</w:t>
+      </w:r>
+      <w:r>
+        <w:t xml:space="preserve"> nombre calculé</w:t>
+      </w:r>
+      <w:r>
+        <w:t xml:space="preserve"> par </w:t>
+      </w:r>
+      <w:r>
+        <w:t>une</w:t>
+      </w:r>
+      <w:r>
+        <w:t xml:space="preserve"> formule. L’expérience va consister à calculer une distance entre cha</w:t>
+      </w:r>
+      <w:r>
+        <w:t>cun de ces vecteurs, ce qui permet par exemple de suggérer à un lecteur des textes proches de celui qu’il lit. Pour un roman, c’est évidemment idiot, puisque le texte que l’on veut lire ensuite, c’est le chapitre suivant ; mais on devine vite l’intérêt de tels algorithmes pour les textes informatifs.</w:t>
+      </w:r>
+    </w:p>
+    <w:p>
+      <w:pPr>
+        <w:ind w:firstLine="708"/>
+      </w:pPr>
+    </w:p>
+    <w:p>
+      <w:pPr>
+        <w:ind w:firstLine="708"/>
+      </w:pPr>
     </w:p>
     <w:p>
       <w:pPr>
@@ -4600,6 +4628,7 @@
         <w:pStyle w:val="Heading1"/>
       </w:pPr>
       <w:r>
+        <w:lastRenderedPageBreak/>
         <w:t>§</w:t>
       </w:r>
       <w:r>
@@ -5183,14 +5212,7 @@
       </w:r>
       <w:r>
         <w:br/>
-      </w:r>
-      <w:proofErr w:type="spellStart"/>
-      <w:r>
-        <w:t>Dicollecte</w:t>
-      </w:r>
-      <w:proofErr w:type="spellEnd"/>
-      <w:r>
-        <w:t xml:space="preserve"> 7.7 </w:t>
+        <w:t xml:space="preserve">Dicollecte 7.7 </w:t>
       </w:r>
       <w:hyperlink r:id="rId14" w:history="1">
         <w:r>
@@ -5205,14 +5227,7 @@
       </w:r>
       <w:r>
         <w:br/>
-      </w:r>
-      <w:proofErr w:type="spellStart"/>
-      <w:r>
-        <w:t>Morphalou</w:t>
-      </w:r>
-      <w:proofErr w:type="spellEnd"/>
-      <w:r>
-        <w:t xml:space="preserve"> 3.1 </w:t>
+        <w:t xml:space="preserve">Morphalou 3.1 </w:t>
       </w:r>
       <w:hyperlink r:id="rId15" w:history="1">
         <w:r>
@@ -5224,15 +5239,7 @@
       </w:hyperlink>
       <w:r>
         <w:br/>
-        <w:t xml:space="preserve">Chaque lexique a son orientation. Lexique3 intéresse les orthophonistes, il a de précieuses informations de fréquence par forme, mais il est très bruité. </w:t>
-      </w:r>
-      <w:proofErr w:type="spellStart"/>
-      <w:r>
-        <w:t>Dicollecte</w:t>
-      </w:r>
-      <w:proofErr w:type="spellEnd"/>
-      <w:r>
-        <w:t xml:space="preserve"> sert à la correction orthographique, il mélange la langue commune avec les noms propres, ses lemmes sont parfois inexacts ou incomplets car non nécessaires à la correction orthographique (ex : l</w:t>
+        <w:t>Chaque lexique a son orientation. Lexique3 intéresse les orthophonistes, il a de précieuses informations de fréquence par forme, mais il est très bruité. Dicollecte sert à la correction orthographique, il mélange la langue commune avec les noms propres, ses lemmes sont parfois inexacts ou incomplets car non nécessaires à la correction orthographique (ex : l</w:t>
       </w:r>
       <w:r>
         <w:t>es participes passé</w:t>
@@ -5247,15 +5254,7 @@
         <w:t xml:space="preserve"> verbe </w:t>
       </w:r>
       <w:r>
-        <w:t xml:space="preserve">suffisent à fournir les formes adjectives). </w:t>
-      </w:r>
-      <w:proofErr w:type="spellStart"/>
-      <w:r>
-        <w:t>Morphalou</w:t>
-      </w:r>
-      <w:proofErr w:type="spellEnd"/>
-      <w:r>
-        <w:t xml:space="preserve">, en partie constitué sur le </w:t>
+        <w:t xml:space="preserve">suffisent à fournir les formes adjectives). Morphalou, en partie constitué sur le </w:t>
       </w:r>
       <w:r>
         <w:rPr>

</xml_diff>

<commit_message>
Dispersion OK, ready for votes
</commit_message>
<xml_diff>
--- a/docs/glorieux-specif.docx
+++ b/docs/glorieux-specif.docx
@@ -70,6 +70,9 @@
         <w:t>s ;</w:t>
       </w:r>
       <w:r>
+        <w:t xml:space="preserve"> pour</w:t>
+      </w:r>
+      <w:r>
         <w:t xml:space="preserve"> 7</w:t>
       </w:r>
       <w:r>
@@ -101,7 +104,17 @@
         <w:t xml:space="preserve">es moteurs de recherche plein texte (et la textométrie en général), </w:t>
       </w:r>
       <w:r>
-        <w:t xml:space="preserve">une formule de spécificité (keyness) </w:t>
+        <w:t>une formule de spécificité (</w:t>
+      </w:r>
+      <w:r>
+        <w:rPr>
+          <w:i/>
+          <w:iCs/>
+        </w:rPr>
+        <w:t>keyness</w:t>
+      </w:r>
+      <w:r>
+        <w:t xml:space="preserve">) </w:t>
       </w:r>
       <w:r>
         <w:t>mesure à quel point un</w:t>
@@ -196,7 +209,13 @@
         <w:t>(</w:t>
       </w:r>
       <w:r>
-        <w:t xml:space="preserve">articles de </w:t>
+        <w:t xml:space="preserve">articles </w:t>
+      </w:r>
+      <w:r>
+        <w:t xml:space="preserve">scientifiques, </w:t>
+      </w:r>
+      <w:r>
+        <w:t xml:space="preserve">de </w:t>
       </w:r>
       <w:r>
         <w:t>presse</w:t>
@@ -205,13 +224,10 @@
         <w:t>,</w:t>
       </w:r>
       <w:r>
-        <w:t xml:space="preserve"> de revues</w:t>
-      </w:r>
-      <w:r>
-        <w:t xml:space="preserve"> scientifiques</w:t>
-      </w:r>
-      <w:r>
-        <w:t>, forums…</w:t>
+        <w:t xml:space="preserve"> </w:t>
+      </w:r>
+      <w:r>
+        <w:t>forums…</w:t>
       </w:r>
       <w:r>
         <w:t>)</w:t>
@@ -245,54 +261,364 @@
         <w:t xml:space="preserve">. </w:t>
       </w:r>
       <w:r>
-        <w:t xml:space="preserve">Beaucoup d’articles du domaine propose de nouvelles formules plus performantes </w:t>
-      </w:r>
-      <w:r>
-        <w:t>pour ce genre de</w:t>
-      </w:r>
-      <w:r>
-        <w:t xml:space="preserve"> tâche</w:t>
-      </w:r>
-      <w:r>
-        <w:t>s</w:t>
-      </w:r>
-      <w:r>
-        <w:t xml:space="preserve"> restreinte</w:t>
-      </w:r>
-      <w:r>
-        <w:t>s,</w:t>
-      </w:r>
-      <w:r>
-        <w:t xml:space="preserve"> mais expliquent rarement pourquoi telle ou telle fonctionnement mieux</w:t>
+        <w:t>Beaucoup d’articles du domaine propose</w:t>
+      </w:r>
+      <w:r>
+        <w:t>nt</w:t>
+      </w:r>
+      <w:r>
+        <w:t xml:space="preserve"> de nouvelles formules</w:t>
+      </w:r>
+      <w:r>
+        <w:t>,</w:t>
+      </w:r>
+      <w:r>
+        <w:t xml:space="preserve"> </w:t>
+      </w:r>
+      <w:r>
+        <w:t>d</w:t>
+      </w:r>
+      <w:r>
+        <w:t>es chiffres prouvent que l’objectif est atteint, mais la raison est</w:t>
+      </w:r>
+      <w:r>
+        <w:t xml:space="preserve"> rarement </w:t>
+      </w:r>
+      <w:r>
+        <w:t>expliquée, et notamment pas par les textes eux-mêmes.</w:t>
+      </w:r>
+    </w:p>
+    <w:p>
+      <w:pPr>
+        <w:ind w:firstLine="708"/>
+      </w:pPr>
+      <w:r>
+        <w:t xml:space="preserve">Du point de vue des </w:t>
+      </w:r>
+      <w:r>
+        <w:t>humanités</w:t>
+      </w:r>
+      <w:r>
+        <w:t xml:space="preserve">, </w:t>
+      </w:r>
+      <w:r>
+        <w:t xml:space="preserve">un texte </w:t>
+      </w:r>
+      <w:r>
+        <w:t>ne se résume pas à</w:t>
+      </w:r>
+      <w:r>
+        <w:t xml:space="preserve"> ces jeux normalisés de documents</w:t>
+      </w:r>
+      <w:r>
+        <w:t xml:space="preserve">, et il y a bien </w:t>
+      </w:r>
+      <w:r>
+        <w:t>à apprendre</w:t>
+      </w:r>
+      <w:r>
+        <w:t xml:space="preserve"> que des résultats de recherche en ordre de pertinence</w:t>
+      </w:r>
+      <w:r>
+        <w:t xml:space="preserve">. La question du chercheur est plutôt, qu’est-ce qu’un nombre révèle d’un auteur qui échappe à la lecture subjective ? </w:t>
+      </w:r>
+      <w:r>
+        <w:t>Qu’est-ce que chaque formule montre, à quoi peut-elle être bonne ?</w:t>
+      </w:r>
+    </w:p>
+    <w:p>
+      <w:pPr>
+        <w:ind w:firstLine="708"/>
+      </w:pPr>
+      <w:r>
+        <w:t>C</w:t>
+      </w:r>
+      <w:r>
+        <w:t xml:space="preserve">et article </w:t>
+      </w:r>
+      <w:r>
+        <w:t>vise à expliquer ce que montrer différentes formules du domaine, et propose une formule paramétrable qui couvre en partie le</w:t>
+      </w:r>
+      <w:r>
+        <w:t>s variations observées sur l’extraction de mots-clés pour un texte.</w:t>
+      </w:r>
+    </w:p>
+    <w:p>
+      <w:pPr>
+        <w:ind w:firstLine="708"/>
+      </w:pPr>
+      <w:r>
+        <w:t>Afin</w:t>
+      </w:r>
+      <w:r>
+        <w:t xml:space="preserve"> que le lecteur puisse se faire une idée</w:t>
+      </w:r>
+      <w:r>
+        <w:t xml:space="preserve"> qualitative</w:t>
+      </w:r>
+      <w:r>
+        <w:t xml:space="preserve"> des résultats,</w:t>
+      </w:r>
+      <w:r>
+        <w:t xml:space="preserve"> les expériences seront menées sur des </w:t>
+      </w:r>
+      <w:r>
+        <w:t>auteurs</w:t>
+      </w:r>
+      <w:r>
+        <w:t xml:space="preserve"> classiques</w:t>
+      </w:r>
+      <w:r>
+        <w:t xml:space="preserve"> : </w:t>
+      </w:r>
+      <w:r>
+        <w:t xml:space="preserve">Balzac, Dumas, </w:t>
+      </w:r>
+      <w:r>
+        <w:t xml:space="preserve">Sand, </w:t>
+      </w:r>
+      <w:r>
+        <w:t>Verne et Zola</w:t>
       </w:r>
       <w:r>
         <w:t>.</w:t>
       </w:r>
+      <w:r>
+        <w:t xml:space="preserve"> Le corpus partage</w:t>
+      </w:r>
+      <w:r>
+        <w:t>ra ainsi</w:t>
+      </w:r>
+      <w:r>
+        <w:t xml:space="preserve"> une</w:t>
+      </w:r>
+      <w:r>
+        <w:t xml:space="preserve"> unité de langue : le</w:t>
+      </w:r>
+      <w:r>
+        <w:t xml:space="preserve"> français du</w:t>
+      </w:r>
+      <w:r>
+        <w:t xml:space="preserve"> XIX</w:t>
+      </w:r>
+      <w:r>
+        <w:rPr>
+          <w:vertAlign w:val="superscript"/>
+        </w:rPr>
+        <w:t>e</w:t>
+      </w:r>
+      <w:r>
+        <w:t xml:space="preserve"> siècle, </w:t>
+      </w:r>
+      <w:r>
+        <w:t xml:space="preserve">une </w:t>
+      </w:r>
+      <w:r>
+        <w:t xml:space="preserve">unité de genre : le roman, </w:t>
+      </w:r>
+      <w:r>
+        <w:t xml:space="preserve">et une </w:t>
+      </w:r>
+      <w:r>
+        <w:t>unité</w:t>
+      </w:r>
+      <w:r>
+        <w:t xml:space="preserve"> textuelle</w:t>
+      </w:r>
+      <w:r>
+        <w:t> :</w:t>
+      </w:r>
+      <w:r>
+        <w:t xml:space="preserve"> le chapitre.</w:t>
+      </w:r>
+      <w:r>
+        <w:t xml:space="preserve"> </w:t>
+      </w:r>
+      <w:r>
+        <w:t>Ce</w:t>
+      </w:r>
+      <w:r>
+        <w:t xml:space="preserve"> modèle </w:t>
+      </w:r>
+      <w:r>
+        <w:t xml:space="preserve">sert </w:t>
+      </w:r>
+      <w:r>
+        <w:t>de laboratoire</w:t>
+      </w:r>
+      <w:r>
+        <w:t xml:space="preserve"> </w:t>
+      </w:r>
+      <w:r>
+        <w:t xml:space="preserve">pour des applications </w:t>
+      </w:r>
+      <w:r>
+        <w:t>réelles</w:t>
+      </w:r>
+      <w:r>
+        <w:t xml:space="preserve"> de recherche</w:t>
+      </w:r>
+      <w:r>
+        <w:t>s textuelles</w:t>
+      </w:r>
+      <w:r>
+        <w:t xml:space="preserve"> en ligne</w:t>
+      </w:r>
+      <w:r>
+        <w:rPr>
+          <w:rStyle w:val="FootnoteReference"/>
+        </w:rPr>
+        <w:footnoteReference w:id="3"/>
+      </w:r>
+      <w:r>
+        <w:t>.</w:t>
+      </w:r>
+    </w:p>
+    <w:p>
+      <w:pPr>
+        <w:pStyle w:val="Heading1"/>
+      </w:pPr>
+      <w:r>
+        <w:t>§</w:t>
+      </w:r>
+      <w:r>
+        <w:t>1</w:t>
+      </w:r>
+      <w:r>
+        <w:t>.</w:t>
+      </w:r>
+      <w:r>
+        <w:t xml:space="preserve"> </w:t>
+      </w:r>
+      <w:r>
+        <w:t xml:space="preserve">Reproduction, </w:t>
+      </w:r>
+      <w:r>
+        <w:t>une</w:t>
+      </w:r>
+      <w:r>
+        <w:t xml:space="preserve"> méthode</w:t>
+      </w:r>
+    </w:p>
+    <w:p>
+      <w:pPr>
+        <w:ind w:firstLine="0"/>
+      </w:pPr>
+      <w:r>
+        <w:t>Toutes les données et programmes sont téléchargeables</w:t>
+      </w:r>
+      <w:r>
+        <w:rPr>
+          <w:rStyle w:val="FootnoteReference"/>
+        </w:rPr>
+        <w:footnoteReference w:id="4"/>
+      </w:r>
+      <w:r>
+        <w:t xml:space="preserve"> pour </w:t>
+      </w:r>
+      <w:r>
+        <w:t>que</w:t>
+      </w:r>
+      <w:r>
+        <w:t xml:space="preserve"> les expériences</w:t>
+      </w:r>
+      <w:r>
+        <w:t xml:space="preserve"> soient reproductibles</w:t>
+      </w:r>
+      <w:r>
+        <w:t>.</w:t>
+      </w:r>
     </w:p>
     <w:p>
       <w:pPr>
         <w:ind w:firstLine="708"/>
       </w:pPr>
       <w:r>
-        <w:t xml:space="preserve">Du point de vue des </w:t>
-      </w:r>
-      <w:r>
-        <w:t>humanités</w:t>
-      </w:r>
-      <w:r>
-        <w:t xml:space="preserve">, </w:t>
-      </w:r>
-      <w:r>
-        <w:t>un texte est bien autre chose que ces jeux normalisés de documents</w:t>
-      </w:r>
-      <w:r>
-        <w:t>, et il y a bien d’autres statistiques à montrer que des résultats de recherche en ordre de pertinence</w:t>
-      </w:r>
-      <w:r>
-        <w:t xml:space="preserve">. La question du chercheur est plutôt, qu’est-ce qu’un nombre révèle d’un auteur qui échappe à la lecture subjective ? </w:t>
-      </w:r>
-      <w:r>
-        <w:t>Qu’est-ce que chaque formule montre, à quoi peut-elle être bonne ?</w:t>
+        <w:lastRenderedPageBreak/>
+        <w:t>Les textes</w:t>
+      </w:r>
+      <w:r>
+        <w:t xml:space="preserve"> p</w:t>
+      </w:r>
+      <w:r>
+        <w:t>rov</w:t>
+      </w:r>
+      <w:r>
+        <w:t>iennent de différentes sources</w:t>
+      </w:r>
+      <w:r>
+        <w:t>.</w:t>
+      </w:r>
+      <w:r>
+        <w:t xml:space="preserve"> </w:t>
+      </w:r>
+      <w:r>
+        <w:rPr>
+          <w:i/>
+          <w:iCs/>
+        </w:rPr>
+        <w:t>La c</w:t>
+      </w:r>
+      <w:r>
+        <w:rPr>
+          <w:i/>
+          <w:iCs/>
+        </w:rPr>
+        <w:t>omédie humaine</w:t>
+      </w:r>
+      <w:r>
+        <w:t xml:space="preserve"> de Balzac est </w:t>
+      </w:r>
+      <w:r>
+        <w:t>reprise</w:t>
+      </w:r>
+      <w:r>
+        <w:t xml:space="preserve"> du projet ebalzac</w:t>
+      </w:r>
+      <w:r>
+        <w:rPr>
+          <w:rStyle w:val="FootnoteReference"/>
+        </w:rPr>
+        <w:footnoteReference w:id="5"/>
+      </w:r>
+      <w:r>
+        <w:t>,</w:t>
+      </w:r>
+      <w:r>
+        <w:t xml:space="preserve"> </w:t>
+      </w:r>
+      <w:r>
+        <w:t xml:space="preserve">une </w:t>
+      </w:r>
+      <w:r>
+        <w:t>édition électronique scientifiquement</w:t>
+      </w:r>
+      <w:r>
+        <w:t xml:space="preserve"> établie</w:t>
+      </w:r>
+      <w:r>
+        <w:t xml:space="preserve"> sur la</w:t>
+      </w:r>
+      <w:r>
+        <w:t xml:space="preserve"> version dite</w:t>
+      </w:r>
+      <w:r>
+        <w:t xml:space="preserve"> du «</w:t>
+      </w:r>
+      <w:r>
+        <w:t> </w:t>
+      </w:r>
+      <w:r>
+        <w:t>Furne corrigé</w:t>
+      </w:r>
+      <w:r>
+        <w:t> </w:t>
+      </w:r>
+      <w:r>
+        <w:t>»</w:t>
+      </w:r>
+      <w:r>
+        <w:t>.</w:t>
       </w:r>
     </w:p>
     <w:p>
@@ -300,288 +626,6 @@
         <w:ind w:firstLine="708"/>
       </w:pPr>
       <w:r>
-        <w:t>C</w:t>
-      </w:r>
-      <w:r>
-        <w:t xml:space="preserve">et article </w:t>
-      </w:r>
-      <w:r>
-        <w:t>vise à expliquer ce que montrer différentes formules du domaine, et propose une formule paramétrable qui couvre en partie le spectre</w:t>
-      </w:r>
-    </w:p>
-    <w:p>
-      <w:pPr>
-        <w:ind w:firstLine="708"/>
-      </w:pPr>
-      <w:r>
-        <w:t>Afin</w:t>
-      </w:r>
-      <w:r>
-        <w:t xml:space="preserve"> que le lecteur puisse se faire une idée</w:t>
-      </w:r>
-      <w:r>
-        <w:t xml:space="preserve"> qualitative</w:t>
-      </w:r>
-      <w:r>
-        <w:t xml:space="preserve"> des résultats,</w:t>
-      </w:r>
-      <w:r>
-        <w:t xml:space="preserve"> les expériences seront menées sur des </w:t>
-      </w:r>
-      <w:r>
-        <w:t>auteurs</w:t>
-      </w:r>
-      <w:r>
-        <w:t xml:space="preserve"> classiques</w:t>
-      </w:r>
-      <w:r>
-        <w:t xml:space="preserve"> : </w:t>
-      </w:r>
-      <w:r>
-        <w:t xml:space="preserve">Balzac, Dumas, </w:t>
-      </w:r>
-      <w:r>
-        <w:t xml:space="preserve">Sand, </w:t>
-      </w:r>
-      <w:r>
-        <w:t>Verne et Zola</w:t>
-      </w:r>
-      <w:r>
-        <w:t>.</w:t>
-      </w:r>
-      <w:r>
-        <w:t xml:space="preserve"> Le corpus partage</w:t>
-      </w:r>
-      <w:r>
-        <w:t>ra ainsi</w:t>
-      </w:r>
-      <w:r>
-        <w:t xml:space="preserve"> une</w:t>
-      </w:r>
-      <w:r>
-        <w:t xml:space="preserve"> unité de langue : le</w:t>
-      </w:r>
-      <w:r>
-        <w:t xml:space="preserve"> français du</w:t>
-      </w:r>
-      <w:r>
-        <w:t xml:space="preserve"> XIX</w:t>
-      </w:r>
-      <w:r>
-        <w:rPr>
-          <w:vertAlign w:val="superscript"/>
-        </w:rPr>
-        <w:t>e</w:t>
-      </w:r>
-      <w:r>
-        <w:t xml:space="preserve"> siècle, </w:t>
-      </w:r>
-      <w:r>
-        <w:t xml:space="preserve">une </w:t>
-      </w:r>
-      <w:r>
-        <w:t xml:space="preserve">unité de genre : le roman, </w:t>
-      </w:r>
-      <w:r>
-        <w:t xml:space="preserve">et une </w:t>
-      </w:r>
-      <w:r>
-        <w:t>unité</w:t>
-      </w:r>
-      <w:r>
-        <w:t xml:space="preserve"> textuelle</w:t>
-      </w:r>
-      <w:r>
-        <w:t> :</w:t>
-      </w:r>
-      <w:r>
-        <w:t xml:space="preserve"> le chapitre.</w:t>
-      </w:r>
-      <w:r>
-        <w:t xml:space="preserve"> </w:t>
-      </w:r>
-      <w:r>
-        <w:t>Ce</w:t>
-      </w:r>
-      <w:r>
-        <w:t xml:space="preserve"> modèle de laboratoire</w:t>
-      </w:r>
-      <w:r>
-        <w:t xml:space="preserve"> </w:t>
-      </w:r>
-      <w:r>
-        <w:t xml:space="preserve">servira de prototype pour des applications </w:t>
-      </w:r>
-      <w:r>
-        <w:t xml:space="preserve">s </w:t>
-      </w:r>
-      <w:r>
-        <w:t>publiques</w:t>
-      </w:r>
-      <w:r>
-        <w:t xml:space="preserve"> moteur de recherche en ligne</w:t>
-      </w:r>
-      <w:r>
-        <w:rPr>
-          <w:rStyle w:val="FootnoteReference"/>
-        </w:rPr>
-        <w:footnoteReference w:id="3"/>
-      </w:r>
-      <w:r>
-        <w:t>.</w:t>
-      </w:r>
-    </w:p>
-    <w:p>
-      <w:pPr>
-        <w:pStyle w:val="Heading1"/>
-      </w:pPr>
-      <w:r>
-        <w:t>§</w:t>
-      </w:r>
-      <w:r>
-        <w:t>1</w:t>
-      </w:r>
-      <w:r>
-        <w:t>.</w:t>
-      </w:r>
-      <w:r>
-        <w:t xml:space="preserve"> </w:t>
-      </w:r>
-      <w:r>
-        <w:t xml:space="preserve">Reproduction, </w:t>
-      </w:r>
-      <w:r>
-        <w:t>une</w:t>
-      </w:r>
-      <w:r>
-        <w:t xml:space="preserve"> méthode</w:t>
-      </w:r>
-    </w:p>
-    <w:p>
-      <w:pPr>
-        <w:ind w:firstLine="0"/>
-      </w:pPr>
-      <w:r>
-        <w:t>Toutes les données et programmes sont téléchargeables</w:t>
-      </w:r>
-      <w:r>
-        <w:rPr>
-          <w:rStyle w:val="FootnoteReference"/>
-        </w:rPr>
-        <w:footnoteReference w:id="4"/>
-      </w:r>
-      <w:r>
-        <w:t xml:space="preserve"> pour </w:t>
-      </w:r>
-      <w:r>
-        <w:t>que</w:t>
-      </w:r>
-      <w:r>
-        <w:t xml:space="preserve"> les expériences</w:t>
-      </w:r>
-      <w:r>
-        <w:t xml:space="preserve"> soient reproductibles</w:t>
-      </w:r>
-      <w:r>
-        <w:t>.</w:t>
-      </w:r>
-    </w:p>
-    <w:p>
-      <w:pPr>
-        <w:ind w:firstLine="708"/>
-      </w:pPr>
-      <w:r>
-        <w:t>Les textes</w:t>
-      </w:r>
-      <w:r>
-        <w:t xml:space="preserve"> p</w:t>
-      </w:r>
-      <w:r>
-        <w:t>rov</w:t>
-      </w:r>
-      <w:r>
-        <w:t>iennent de différentes sources</w:t>
-      </w:r>
-      <w:r>
-        <w:t>.</w:t>
-      </w:r>
-      <w:r>
-        <w:t xml:space="preserve"> </w:t>
-      </w:r>
-      <w:r>
-        <w:rPr>
-          <w:i/>
-          <w:iCs/>
-        </w:rPr>
-        <w:t>La c</w:t>
-      </w:r>
-      <w:r>
-        <w:rPr>
-          <w:i/>
-          <w:iCs/>
-        </w:rPr>
-        <w:t>omédie humaine</w:t>
-      </w:r>
-      <w:r>
-        <w:t xml:space="preserve"> de Balzac est </w:t>
-      </w:r>
-      <w:r>
-        <w:t>reprise</w:t>
-      </w:r>
-      <w:r>
-        <w:t xml:space="preserve"> du projet ebalzac</w:t>
-      </w:r>
-      <w:r>
-        <w:rPr>
-          <w:rStyle w:val="FootnoteReference"/>
-        </w:rPr>
-        <w:footnoteReference w:id="5"/>
-      </w:r>
-      <w:r>
-        <w:t>,</w:t>
-      </w:r>
-      <w:r>
-        <w:t xml:space="preserve"> </w:t>
-      </w:r>
-      <w:r>
-        <w:t xml:space="preserve">une </w:t>
-      </w:r>
-      <w:r>
-        <w:t>édition électronique scientifiquement</w:t>
-      </w:r>
-      <w:r>
-        <w:t xml:space="preserve"> établie</w:t>
-      </w:r>
-      <w:r>
-        <w:t xml:space="preserve"> sur la</w:t>
-      </w:r>
-      <w:r>
-        <w:t xml:space="preserve"> version dite</w:t>
-      </w:r>
-      <w:r>
-        <w:t xml:space="preserve"> du «</w:t>
-      </w:r>
-      <w:r>
-        <w:t> </w:t>
-      </w:r>
-      <w:r>
-        <w:t>Furne corrigé</w:t>
-      </w:r>
-      <w:r>
-        <w:t> </w:t>
-      </w:r>
-      <w:r>
-        <w:t>»</w:t>
-      </w:r>
-      <w:r>
-        <w:t>.</w:t>
-      </w:r>
-    </w:p>
-    <w:p>
-      <w:pPr>
-        <w:ind w:firstLine="708"/>
-      </w:pPr>
-      <w:r>
         <w:t>Les autres auteurs ont été compilés à partir de différents sites de livres libres et gratuits</w:t>
       </w:r>
       <w:r>
@@ -591,11 +635,7 @@
         <w:t>. Dumas,</w:t>
       </w:r>
       <w:r>
-        <w:t xml:space="preserve"> Sand et Verne </w:t>
-      </w:r>
-      <w:r>
-        <w:lastRenderedPageBreak/>
-        <w:t>sont</w:t>
+        <w:t xml:space="preserve"> Sand et Verne sont</w:t>
       </w:r>
       <w:r>
         <w:t xml:space="preserve"> presque</w:t>
@@ -2310,10 +2350,10 @@
         <w:t>trouver</w:t>
       </w:r>
       <w:r>
-        <w:t xml:space="preserve"> ce</w:t>
-      </w:r>
-      <w:r>
-        <w:t>ux</w:t>
+        <w:t xml:space="preserve"> c</w:t>
+      </w:r>
+      <w:r>
+        <w:t>e</w:t>
       </w:r>
       <w:r>
         <w:t xml:space="preserve"> que l’on désire ?</w:t>
@@ -6666,6 +6706,9 @@
         <w:t>D</w:t>
       </w:r>
       <w:r>
+        <w:t>ispersions d</w:t>
+      </w:r>
+      <w:r>
         <w:t>ans le ventre du croissant</w:t>
       </w:r>
     </w:p>
@@ -6796,7 +6839,31 @@
         <w:t>,</w:t>
       </w:r>
       <w:r>
-        <w:t xml:space="preserve"> TXM ou HGT, TF-IDF, subTF-IDF </w:t>
+        <w:t xml:space="preserve"> </w:t>
+      </w:r>
+      <w:r>
+        <w:t>HGT</w:t>
+      </w:r>
+      <w:r>
+        <w:t xml:space="preserve"> </w:t>
+      </w:r>
+      <w:r>
+        <w:t>(</w:t>
+      </w:r>
+      <w:r>
+        <w:rPr>
+          <w:rFonts w:ascii="Cambria Math" w:hAnsi="Cambria Math" w:cs="Cambria Math"/>
+        </w:rPr>
+        <w:t>≃</w:t>
+      </w:r>
+      <w:r>
+        <w:t>TXM</w:t>
+      </w:r>
+      <w:r>
+        <w:t>)</w:t>
+      </w:r>
+      <w:r>
+        <w:t xml:space="preserve">, TF-IDF, subTF-IDF </w:t>
       </w:r>
       <w:r>
         <w:t>en neutralisant</w:t>
@@ -6882,13 +6949,647 @@
         <w:t xml:space="preserve"> noms propres</w:t>
       </w:r>
       <w:r>
-        <w:t>, avec les formules paramétrées</w:t>
+        <w:t>.</w:t>
+      </w:r>
+      <w:r>
+        <w:t xml:space="preserve"> </w:t>
+      </w:r>
+      <w:r>
+        <w:t>A</w:t>
+      </w:r>
+      <w:r>
+        <w:t xml:space="preserve">vec </w:t>
+      </w:r>
+      <w:r>
+        <w:t>d</w:t>
+      </w:r>
+      <w:r>
+        <w:t>es formules paramétrées</w:t>
+      </w:r>
+      <w:r>
+        <w:t xml:space="preserve"> ajustées, l</w:t>
+      </w:r>
+      <w:r>
+        <w:t>es têtes de listes sont maintenant très similaires</w:t>
+      </w:r>
+      <w:r>
+        <w:t>.</w:t>
+      </w:r>
+    </w:p>
+    <w:p>
+      <w:pPr>
+        <w:ind w:firstLine="0"/>
+      </w:pPr>
+    </w:p>
+    <w:p>
+      <w:pPr>
+        <w:ind w:firstLine="0"/>
+      </w:pPr>
+      <w:r>
+        <w:t>sub</w:t>
+      </w:r>
+      <w:r>
+        <w:t>TF</w:t>
+      </w:r>
+      <w:r>
+        <w:noBreakHyphen/>
+      </w:r>
+      <w:r>
+        <w:t>IDF</w:t>
+      </w:r>
+      <w:r>
+        <w:t>α</w:t>
+      </w:r>
+      <w:r>
+        <w:t>(</w:t>
+      </w:r>
+      <w:r>
+        <w:t>0.56</w:t>
+      </w:r>
+      <w:r>
+        <w:t>)</w:t>
+      </w:r>
+      <w:r>
+        <w:t> :</w:t>
+      </w:r>
+      <w:r>
+        <w:t xml:space="preserve"> </w:t>
+      </w:r>
+      <w:r>
+        <w:t>poulpe, calmar, tentacule, céphalopode, ventouse, monstre, harpon, charnu, nageoire, bec</w:t>
+      </w:r>
+      <w:r>
+        <w:t>…</w:t>
+      </w:r>
+    </w:p>
+    <w:p>
+      <w:pPr>
+        <w:ind w:firstLine="0"/>
+      </w:pPr>
+      <w:r>
+        <w:t>TF</w:t>
+      </w:r>
+      <w:r>
+        <w:noBreakHyphen/>
+      </w:r>
+      <w:r>
+        <w:t>IDF</w:t>
+      </w:r>
+      <w:r>
+        <w:t>α</w:t>
+      </w:r>
+      <w:r>
+        <w:t>(</w:t>
+      </w:r>
+      <w:r>
+        <w:t>1.14</w:t>
+      </w:r>
+      <w:r>
+        <w:t>)</w:t>
+      </w:r>
+      <w:r>
+        <w:t xml:space="preserve"> : </w:t>
+      </w:r>
+      <w:r>
+        <w:t>poulpe, calmar, tentacule, monstre, céphalopode, ventouse, harpon, bec, nageoire, vitre</w:t>
+      </w:r>
+      <w:r>
+        <w:t>…</w:t>
+      </w:r>
+    </w:p>
+    <w:p>
+      <w:pPr>
+        <w:ind w:firstLine="0"/>
+      </w:pPr>
+      <w:r>
+        <w:t>HGT</w:t>
+      </w:r>
+      <w:r>
+        <w:t>α</w:t>
+      </w:r>
+      <w:r>
+        <w:t>(</w:t>
+      </w:r>
+      <w:r>
+        <w:t>1.47</w:t>
+      </w:r>
+      <w:r>
+        <w:t>)</w:t>
+      </w:r>
+      <w:r>
+        <w:t> </w:t>
+      </w:r>
+      <w:r>
+        <w:t xml:space="preserve">: </w:t>
+      </w:r>
+      <w:r>
+        <w:t>poulpe, calmar, tentacule, monstre, céphalopode, ventouse, bec, vitre, charnu, harpon</w:t>
+      </w:r>
+      <w:r>
+        <w:t>…</w:t>
+      </w:r>
+    </w:p>
+    <w:p>
+      <w:pPr>
+        <w:ind w:firstLine="0"/>
+      </w:pPr>
+      <w:r>
+        <w:t>G²α</w:t>
+      </w:r>
+      <w:r>
+        <w:t>(</w:t>
+      </w:r>
+      <w:r>
+        <w:t>0.56</w:t>
+      </w:r>
+      <w:r>
+        <w:t>)</w:t>
+      </w:r>
+      <w:r>
+        <w:t xml:space="preserve"> : </w:t>
+      </w:r>
+      <w:r>
+        <w:t>poulpe, calmar, monstre, tentacule, céphalopode, ventouse, bec, vitre, charnu, harpon</w:t>
+      </w:r>
+      <w:r>
+        <w:t>…</w:t>
+      </w:r>
+    </w:p>
+    <w:p>
+      <w:pPr>
+        <w:ind w:firstLine="0"/>
+      </w:pPr>
+      <w:r>
+        <w:t>χ²α</w:t>
+      </w:r>
+      <w:r>
+        <w:t>(</w:t>
+      </w:r>
+      <w:r>
+        <w:t>0.43</w:t>
+      </w:r>
+      <w:r>
+        <w:t>)</w:t>
+      </w:r>
+      <w:r>
+        <w:t xml:space="preserve"> : </w:t>
+      </w:r>
+      <w:r>
+        <w:t>poulpe, calmar, tentacule, monstre, céphalopode, ventouse, bec, charnu, vitre, harpon</w:t>
+      </w:r>
+    </w:p>
+    <w:p>
+      <w:pPr>
+        <w:ind w:firstLine="0"/>
+      </w:pPr>
+    </w:p>
+    <w:p>
+      <w:pPr>
+        <w:ind w:firstLine="0"/>
+      </w:pPr>
+      <w:r>
+        <w:t>Avec un paramètre</w:t>
+      </w:r>
+      <w:r>
+        <w:t xml:space="preserve"> </w:t>
+      </w:r>
+      <w:r>
+        <w:t>α</w:t>
+      </w:r>
+      <w:r>
+        <w:t xml:space="preserve"> qui</w:t>
+      </w:r>
+      <w:r>
+        <w:t xml:space="preserve"> </w:t>
+      </w:r>
+      <w:r>
+        <w:t>rel</w:t>
+      </w:r>
+      <w:r>
+        <w:t>è</w:t>
+      </w:r>
+      <w:r>
+        <w:t>v</w:t>
+      </w:r>
+      <w:r>
+        <w:t>e</w:t>
+      </w:r>
+      <w:r>
+        <w:t xml:space="preserve"> les hautes fréquences</w:t>
+      </w:r>
+      <w:r>
+        <w:t xml:space="preserve"> (le</w:t>
+      </w:r>
+      <w:r>
+        <w:t xml:space="preserve"> </w:t>
+      </w:r>
+      <w:r>
+        <w:rPr>
+          <w:i/>
+          <w:iCs/>
+        </w:rPr>
+        <w:t>tf</w:t>
+      </w:r>
+      <w:r>
+        <w:t>),</w:t>
+      </w:r>
+      <w:r>
+        <w:t xml:space="preserve"> </w:t>
+      </w:r>
+      <w:r>
+        <w:t>la</w:t>
+      </w:r>
+      <w:r>
+        <w:t xml:space="preserve"> </w:t>
+      </w:r>
+      <w:r>
+        <w:t xml:space="preserve">tendance du </w:t>
+      </w:r>
+      <w:r>
+        <w:t>χ²</w:t>
+      </w:r>
+      <w:r>
+        <w:t xml:space="preserve"> </w:t>
+      </w:r>
+      <w:r>
+        <w:t>aux mots exclusifs se déplace</w:t>
+      </w:r>
+      <w:r>
+        <w:t xml:space="preserve"> un peu</w:t>
+      </w:r>
+      <w:r>
+        <w:t xml:space="preserve"> vers le bas du tableau, mais elle reste importante, dès le rang 17 on trouvera : </w:t>
+      </w:r>
+      <w:r>
+        <w:rPr>
+          <w:i/>
+          <w:iCs/>
+        </w:rPr>
+        <w:t>espalier, violacé, quenotte, suceur, brachioures, clupanodons, corégone, fissurelles, gobies-plumiers, krak</w:t>
+      </w:r>
+      <w:r>
+        <w:t xml:space="preserve">… </w:t>
+      </w:r>
+      <w:r>
+        <w:t xml:space="preserve">La formule de TXM native, sans paramétrage </w:t>
+      </w:r>
+      <w:r>
+        <w:t>α</w:t>
+      </w:r>
+      <w:r>
+        <w:t xml:space="preserve">, n’est pas indemne de cet inconvénient, même si elle le retarde au rang 47 : </w:t>
+      </w:r>
+      <w:r>
+        <w:rPr>
+          <w:i/>
+          <w:iCs/>
+        </w:rPr>
+        <w:t>espalier, violacé, quenotte, suceur</w:t>
+      </w:r>
+      <w:r>
+        <w:t xml:space="preserve">… Ce phénomène </w:t>
+      </w:r>
+      <w:r>
+        <w:t xml:space="preserve">est assez facile à </w:t>
+      </w:r>
+      <w:r>
+        <w:t>montrer</w:t>
+      </w:r>
+      <w:r>
+        <w:t>.</w:t>
+      </w:r>
+    </w:p>
+    <w:p>
+      <w:pPr>
+        <w:ind w:firstLine="708"/>
+      </w:pPr>
+      <w:r>
+        <w:t xml:space="preserve">Soit tous les mots clés de </w:t>
+      </w:r>
+      <w:r>
+        <w:t>« </w:t>
+      </w:r>
+      <w:r>
+        <w:t>Les poulpes</w:t>
+      </w:r>
+      <w:r>
+        <w:t> »</w:t>
+      </w:r>
+      <w:r>
+        <w:t>. Soit un point pour chaque mot-clé sur une bande, où la longueur indique la place d’un mot-clé dans la liste, et la hauteur indique si le mot est de fréquence haute ou basse dans Jules Verne.</w:t>
+      </w:r>
+    </w:p>
+    <w:p>
+      <w:pPr>
+        <w:ind w:firstLine="708"/>
+      </w:pPr>
+      <w:r>
+        <w:t xml:space="preserve">Les bandes de dispersion montre plusieurs phénomènes pour ces équations. D’abord, les listes de mot-clés selon le </w:t>
+      </w:r>
+      <w:r>
+        <w:t>χ²</w:t>
+      </w:r>
+      <w:r>
+        <w:t xml:space="preserve"> et TXM sont plus courtes, parce que ces scores peuvent être négatifs pour des mots spécialement rares relativement au reste du corpus</w:t>
+      </w:r>
+      <w:r>
+        <w:t>, et donc ne sont pas considérés</w:t>
+      </w:r>
+      <w:r>
+        <w:t xml:space="preserve"> comme</w:t>
+      </w:r>
+      <w:r>
+        <w:t xml:space="preserve"> des mots-clés</w:t>
+      </w:r>
+      <w:r>
+        <w:t>.</w:t>
+      </w:r>
+    </w:p>
+    <w:p>
+      <w:pPr>
+        <w:ind w:firstLine="708"/>
+      </w:pPr>
+      <w:r>
+        <w:t xml:space="preserve">La fréquence des termes du chapitre selon le corpus, </w:t>
+      </w:r>
+      <w:r>
+        <w:rPr>
+          <w:i/>
+          <w:iCs/>
+        </w:rPr>
+        <w:t>cf</w:t>
+      </w:r>
+      <w:r>
+        <w:t>, est strictement décroissante, par construction, avec une tête qui se redresse un peu et une queue qui s’aplatit.</w:t>
+      </w:r>
+    </w:p>
+    <w:p>
+      <w:pPr>
+        <w:ind w:firstLine="708"/>
+      </w:pPr>
+      <w:r>
+        <w:t xml:space="preserve">La fréquence des termes relativement au corpus, TF, </w:t>
+      </w:r>
+      <w:r>
+        <w:t xml:space="preserve">montre </w:t>
+      </w:r>
+      <w:r>
+        <w:t xml:space="preserve">de belles lignes continues </w:t>
+      </w:r>
+      <w:r>
+        <w:t>montantes</w:t>
+      </w:r>
+      <w:r>
+        <w:t xml:space="preserve"> pour tf=1, 2, 3, 4…</w:t>
+      </w:r>
+      <w:r>
+        <w:t xml:space="preserve"> Ce n’est pas un hasard mais par construction. En effet, pour un même score </w:t>
+      </w:r>
+      <w:r>
+        <w:rPr>
+          <w:i/>
+          <w:iCs/>
+        </w:rPr>
+        <w:t>tf</w:t>
+      </w:r>
+      <w:r>
+        <w:t xml:space="preserve"> (ex : </w:t>
+      </w:r>
+      <w:r>
+        <w:rPr>
+          <w:i/>
+          <w:iCs/>
+        </w:rPr>
+        <w:t>tf</w:t>
+      </w:r>
+      <w:r>
+        <w:t xml:space="preserve"> = 1), l’algorithme n’agglomère pas tous les mots sur un même rang, il</w:t>
+      </w:r>
+      <w:r>
+        <w:t>s</w:t>
+      </w:r>
+      <w:r>
+        <w:t xml:space="preserve"> sont rangés en fonction d’un deuxième critère, du rare au fréquent dans le corpus (-</w:t>
+      </w:r>
+      <w:r>
+        <w:rPr>
+          <w:i/>
+          <w:iCs/>
+        </w:rPr>
+        <w:t>cf</w:t>
+      </w:r>
+      <w:r>
+        <w:t>).</w:t>
+      </w:r>
+      <w:r>
+        <w:t xml:space="preserve"> </w:t>
+      </w:r>
+      <w:r>
+        <w:t>La ligne jaune commence</w:t>
+      </w:r>
+      <w:r>
+        <w:t xml:space="preserve"> donc</w:t>
+      </w:r>
+      <w:r>
+        <w:t xml:space="preserve"> avec un segment plat à </w:t>
+      </w:r>
+      <w:r>
+        <w:rPr>
+          <w:i/>
+          <w:iCs/>
+        </w:rPr>
+        <w:t>tf</w:t>
+      </w:r>
+      <w:r>
+        <w:t xml:space="preserve"> = </w:t>
+      </w:r>
+      <w:r>
+        <w:rPr>
+          <w:i/>
+          <w:iCs/>
+        </w:rPr>
+        <w:t>cf</w:t>
+      </w:r>
+      <w:r>
+        <w:t xml:space="preserve"> = 1.</w:t>
+      </w:r>
+    </w:p>
+    <w:p>
+      <w:pPr>
+        <w:ind w:firstLine="708"/>
+      </w:pPr>
+      <w:r>
+        <w:lastRenderedPageBreak/>
+        <w:t>TF-IDFα(16)</w:t>
+      </w:r>
+      <w:r>
+        <w:t xml:space="preserve"> est principalement conduit par la ligne jaune des mots rares dans le chapitre (</w:t>
+      </w:r>
+      <w:r>
+        <w:rPr>
+          <w:i/>
+          <w:iCs/>
+        </w:rPr>
+        <w:t>tf</w:t>
+      </w:r>
+      <w:r>
+        <w:t xml:space="preserve"> = 1), commençant par les mots rares dans le corpus (</w:t>
+      </w:r>
+      <w:r>
+        <w:rPr>
+          <w:i/>
+          <w:iCs/>
+        </w:rPr>
+        <w:t>cf</w:t>
+      </w:r>
+      <w:r>
+        <w:t xml:space="preserve"> = 1), finissant par </w:t>
+      </w:r>
+      <w:r>
+        <w:rPr>
+          <w:i/>
+          <w:iCs/>
+        </w:rPr>
+        <w:t>cf</w:t>
+      </w:r>
+      <w:r>
+        <w:rPr>
+          <w:vertAlign w:val="subscript"/>
+        </w:rPr>
+        <w:t>max</w:t>
+      </w:r>
+      <w:r>
+        <w:t>.</w:t>
+      </w:r>
+    </w:p>
+    <w:p>
+      <w:pPr>
+        <w:ind w:firstLine="708"/>
+      </w:pPr>
+      <w:r>
+        <w:t>Toutes les</w:t>
+      </w:r>
+      <w:r>
+        <w:t xml:space="preserve"> formules</w:t>
+      </w:r>
+      <w:r>
+        <w:t xml:space="preserve"> (à part </w:t>
+      </w:r>
+      <w:r>
+        <w:rPr>
+          <w:i/>
+          <w:iCs/>
+        </w:rPr>
+        <w:t>cf</w:t>
+      </w:r>
+      <w:r>
+        <w:t>)</w:t>
+      </w:r>
+      <w:r>
+        <w:t xml:space="preserve"> observent </w:t>
+      </w:r>
+      <w:r>
+        <w:t>cette</w:t>
+      </w:r>
+      <w:r>
+        <w:t xml:space="preserve"> ligne de base</w:t>
+      </w:r>
+      <w:r>
+        <w:t xml:space="preserve"> </w:t>
+      </w:r>
+      <w:r>
+        <w:t>en jaune</w:t>
+      </w:r>
+      <w:r>
+        <w:t xml:space="preserve"> qui monte doucement jusqu</w:t>
+      </w:r>
+      <w:r>
+        <w:t>’à</w:t>
+      </w:r>
+      <w:r>
+        <w:t xml:space="preserve"> la queue. </w:t>
+      </w:r>
+      <w:r>
+        <w:t xml:space="preserve">On peut même plus ou moins remarquer des alignements pour </w:t>
+      </w:r>
+      <w:r>
+        <w:rPr>
+          <w:i/>
+          <w:iCs/>
+        </w:rPr>
+        <w:t>tf</w:t>
+      </w:r>
+      <w:r>
+        <w:t xml:space="preserve"> = </w:t>
+      </w:r>
+      <w:r>
+        <w:t xml:space="preserve">2 et </w:t>
+      </w:r>
+      <w:r>
+        <w:rPr>
+          <w:i/>
+          <w:iCs/>
+        </w:rPr>
+        <w:t>tf</w:t>
+      </w:r>
+      <w:r>
+        <w:t xml:space="preserve"> = </w:t>
+      </w:r>
+      <w:r>
+        <w:t>3</w:t>
+      </w:r>
+      <w:r>
+        <w:t>, comme pour TF</w:t>
       </w:r>
       <w:r>
         <w:t xml:space="preserve">. </w:t>
       </w:r>
       <w:r>
-        <w:t>Les têtes de listes sont maintenant très similaires</w:t>
+        <w:t>L</w:t>
+      </w:r>
+      <w:r>
+        <w:t>e trait horizontal</w:t>
+      </w:r>
+      <w:r>
+        <w:t xml:space="preserve"> plat</w:t>
+      </w:r>
+      <w:r>
+        <w:t xml:space="preserve"> du bas</w:t>
+      </w:r>
+      <w:r>
+        <w:t xml:space="preserve"> (</w:t>
+      </w:r>
+      <w:r>
+        <w:rPr>
+          <w:i/>
+          <w:iCs/>
+        </w:rPr>
+        <w:t>tf</w:t>
+      </w:r>
+      <w:r>
+        <w:t xml:space="preserve"> = </w:t>
+      </w:r>
+      <w:r>
+        <w:rPr>
+          <w:i/>
+          <w:iCs/>
+        </w:rPr>
+        <w:t>cf</w:t>
+      </w:r>
+      <w:r>
+        <w:t xml:space="preserve"> = 1</w:t>
+      </w:r>
+      <w:r>
+        <w:t>) commencent à un rang de plus en plus tardif dans l’ordre</w:t>
+      </w:r>
+      <w:r>
+        <w:t xml:space="preserve"> </w:t>
+      </w:r>
+      <w:r>
+        <w:t>proposé</w:t>
+      </w:r>
+      <w:r>
+        <w:t xml:space="preserve"> pour les formules</w:t>
       </w:r>
       <w:r>
         <w:t>.</w:t>
@@ -6898,294 +7599,151 @@
       <w:pPr>
         <w:ind w:firstLine="0"/>
       </w:pPr>
+      <w:r>
+        <w:drawing>
+          <wp:anchor distT="0" distB="0" distL="114300" distR="114300" simplePos="0" relativeHeight="251669504" behindDoc="0" locked="0" layoutInCell="1" allowOverlap="1" wp14:anchorId="0AFF1921" wp14:editId="2D62CED9">
+            <wp:simplePos x="0" y="0"/>
+            <wp:positionH relativeFrom="column">
+              <wp:posOffset>41275</wp:posOffset>
+            </wp:positionH>
+            <wp:positionV relativeFrom="paragraph">
+              <wp:posOffset>219710</wp:posOffset>
+            </wp:positionV>
+            <wp:extent cx="5760720" cy="4194175"/>
+            <wp:effectExtent l="0" t="0" r="0" b="0"/>
+            <wp:wrapTopAndBottom/>
+            <wp:docPr id="1144321089" name="Graphic 1"/>
+            <wp:cNvGraphicFramePr>
+              <a:graphicFrameLocks xmlns:a="http://schemas.openxmlformats.org/drawingml/2006/main" noChangeAspect="1"/>
+            </wp:cNvGraphicFramePr>
+            <a:graphic xmlns:a="http://schemas.openxmlformats.org/drawingml/2006/main">
+              <a:graphicData uri="http://schemas.openxmlformats.org/drawingml/2006/picture">
+                <pic:pic xmlns:pic="http://schemas.openxmlformats.org/drawingml/2006/picture">
+                  <pic:nvPicPr>
+                    <pic:cNvPr id="1144321089" name=""/>
+                    <pic:cNvPicPr/>
+                  </pic:nvPicPr>
+                  <pic:blipFill>
+                    <a:blip r:embed="rId14">
+                      <a:extLst>
+                        <a:ext uri="{96DAC541-7B7A-43D3-8B79-37D633B846F1}">
+                          <asvg:svgBlip xmlns:asvg="http://schemas.microsoft.com/office/drawing/2016/SVG/main" r:embed="rId15"/>
+                        </a:ext>
+                      </a:extLst>
+                    </a:blip>
+                    <a:stretch>
+                      <a:fillRect/>
+                    </a:stretch>
+                  </pic:blipFill>
+                  <pic:spPr>
+                    <a:xfrm>
+                      <a:off x="0" y="0"/>
+                      <a:ext cx="5760720" cy="4194175"/>
+                    </a:xfrm>
+                    <a:prstGeom prst="rect">
+                      <a:avLst/>
+                    </a:prstGeom>
+                  </pic:spPr>
+                </pic:pic>
+              </a:graphicData>
+            </a:graphic>
+          </wp:anchor>
+        </w:drawing>
+      </w:r>
+    </w:p>
+    <w:p>
+      <w:pPr>
+        <w:ind w:firstLine="708"/>
+      </w:pPr>
     </w:p>
     <w:p>
       <w:pPr>
         <w:ind w:firstLine="0"/>
       </w:pPr>
       <w:r>
-        <w:t>sub</w:t>
-      </w:r>
-      <w:r>
-        <w:t>TF</w:t>
-      </w:r>
-      <w:r>
-        <w:noBreakHyphen/>
-      </w:r>
-      <w:r>
-        <w:t>IDF</w:t>
-      </w:r>
-      <w:r>
-        <w:t>α</w:t>
-      </w:r>
-      <w:r>
-        <w:t>(</w:t>
-      </w:r>
-      <w:r>
-        <w:t>0.56</w:t>
+        <w:t>On touche désormais</w:t>
+      </w:r>
+      <w:r>
+        <w:t xml:space="preserve"> beaucoup plus</w:t>
+      </w:r>
+      <w:r>
+        <w:t xml:space="preserve"> concrètement </w:t>
+      </w:r>
+      <w:r>
+        <w:t>la distance entre</w:t>
+      </w:r>
+      <w:r>
+        <w:t xml:space="preserve"> les formules</w:t>
+      </w:r>
+      <w:r>
+        <w:t>, comment elles s’étalent entre TF et</w:t>
+      </w:r>
+      <w:r>
+        <w:t xml:space="preserve"> TF-IDF</w:t>
+      </w:r>
+      <w:r>
+        <w:t>α(1</w:t>
+      </w:r>
+      <w:r>
+        <w:t>6</w:t>
       </w:r>
       <w:r>
         <w:t>)</w:t>
       </w:r>
       <w:r>
-        <w:t> :</w:t>
-      </w:r>
-      <w:r>
-        <w:t xml:space="preserve"> </w:t>
-      </w:r>
-      <w:r>
-        <w:t>poulpe, calmar, tentacule, céphalopode, ventouse, monstre, harpon, charnu, nageoire, bec</w:t>
-      </w:r>
-      <w:r>
-        <w:t>…</w:t>
+        <w:t>.</w:t>
+      </w:r>
+      <w:r>
+        <w:t xml:space="preserve"> Pour la ligne intérieure du croissant par exemple </w:t>
+      </w:r>
+      <w:r>
+        <w:t>χ²α(0,43)</w:t>
+      </w:r>
+      <w:r>
+        <w:t xml:space="preserve">, le segment des happax commence toujours plus vite que pour la ligne extérieure du croissant au même angle, par exemple </w:t>
+      </w:r>
+      <w:r>
+        <w:t>subTF-IDFα(0,56)</w:t>
+      </w:r>
+      <w:r>
+        <w:t xml:space="preserve">. Suffit-il de retarder l’apparition du segment des happax, par exemple avec </w:t>
+      </w:r>
+      <w:r>
+        <w:t>subTF-IDFα(0,3)</w:t>
+      </w:r>
+      <w:r>
+        <w:t xml:space="preserve">, qui est à peu près sur le même angle du croissant que TXM et </w:t>
+      </w:r>
+      <w:r>
+        <w:t>G²</w:t>
+      </w:r>
+      <w:r>
+        <w:t xml:space="preserve">, pour avoir la liste la plus discriminante de mots-clés ? Il est en réalité très facile de filtre la ligne jaune </w:t>
+      </w:r>
+      <w:r>
+        <w:rPr>
+          <w:i/>
+          <w:iCs/>
+        </w:rPr>
+        <w:t>tf</w:t>
+      </w:r>
+      <w:r>
+        <w:t xml:space="preserve"> = 1 si elle était gênante, par contre cela ne dit pas si les autres mots ont un classement relatif plus discriminant. </w:t>
+      </w:r>
+      <w:r>
+        <w:t>D’autres expériences sont nécessaires</w:t>
+      </w:r>
+      <w:r>
+        <w:t xml:space="preserve"> pour comparer les formules.</w:t>
       </w:r>
     </w:p>
     <w:p>
       <w:pPr>
         <w:ind w:firstLine="0"/>
       </w:pPr>
-      <w:r>
-        <w:t>TF</w:t>
-      </w:r>
-      <w:r>
-        <w:noBreakHyphen/>
-      </w:r>
-      <w:r>
-        <w:t>IDF</w:t>
-      </w:r>
-      <w:r>
-        <w:t>α</w:t>
-      </w:r>
-      <w:r>
-        <w:t>(</w:t>
-      </w:r>
-      <w:r>
-        <w:t>1.14</w:t>
-      </w:r>
-      <w:r>
-        <w:t>)</w:t>
-      </w:r>
-      <w:r>
-        <w:t xml:space="preserve"> : </w:t>
-      </w:r>
-      <w:r>
-        <w:t>poulpe, calmar, tentacule, monstre, céphalopode, ventouse, harpon, bec, nageoire, vitre</w:t>
-      </w:r>
-      <w:r>
-        <w:t>…</w:t>
-      </w:r>
-    </w:p>
-    <w:p>
-      <w:pPr>
-        <w:ind w:firstLine="0"/>
-      </w:pPr>
-      <w:r>
-        <w:t>HGT</w:t>
-      </w:r>
-      <w:r>
-        <w:t>α</w:t>
-      </w:r>
-      <w:r>
-        <w:t>(</w:t>
-      </w:r>
-      <w:r>
-        <w:t>1.47</w:t>
-      </w:r>
-      <w:r>
-        <w:t>)</w:t>
-      </w:r>
-      <w:r>
-        <w:t> </w:t>
-      </w:r>
-      <w:r>
-        <w:t xml:space="preserve">: </w:t>
-      </w:r>
-      <w:r>
-        <w:t>poulpe, calmar, tentacule, monstre, céphalopode, ventouse, bec, vitre, charnu, harpon</w:t>
-      </w:r>
-      <w:r>
-        <w:t>…</w:t>
-      </w:r>
-    </w:p>
-    <w:p>
-      <w:pPr>
-        <w:ind w:firstLine="0"/>
-      </w:pPr>
-      <w:r>
-        <w:t>G²α</w:t>
-      </w:r>
-      <w:r>
-        <w:t>(</w:t>
-      </w:r>
-      <w:r>
-        <w:t>0.56</w:t>
-      </w:r>
-      <w:r>
-        <w:t>)</w:t>
-      </w:r>
-      <w:r>
-        <w:t xml:space="preserve"> : </w:t>
-      </w:r>
-      <w:r>
-        <w:t>poulpe, calmar, monstre, tentacule, céphalopode, ventouse, bec, vitre, charnu, harpon</w:t>
-      </w:r>
-      <w:r>
-        <w:t>…</w:t>
-      </w:r>
-    </w:p>
-    <w:p>
-      <w:pPr>
-        <w:ind w:firstLine="0"/>
-      </w:pPr>
-      <w:r>
-        <w:t>χ²α</w:t>
-      </w:r>
-      <w:r>
-        <w:t>(</w:t>
-      </w:r>
-      <w:r>
-        <w:t>0.43</w:t>
-      </w:r>
-      <w:r>
-        <w:t>)</w:t>
-      </w:r>
-      <w:r>
-        <w:t xml:space="preserve"> : </w:t>
-      </w:r>
-      <w:r>
-        <w:t>poulpe, calmar, tentacule, monstre, céphalopode, ventouse, bec, charnu, vitre, harpon</w:t>
-      </w:r>
-    </w:p>
-    <w:p>
-      <w:pPr>
-        <w:ind w:firstLine="0"/>
-      </w:pPr>
-    </w:p>
-    <w:p>
-      <w:pPr>
-        <w:ind w:firstLine="0"/>
-      </w:pPr>
-      <w:r>
-        <w:t>Avec un paramètre</w:t>
-      </w:r>
-      <w:r>
-        <w:t xml:space="preserve"> </w:t>
-      </w:r>
-      <w:r>
-        <w:t>α</w:t>
-      </w:r>
-      <w:r>
-        <w:t xml:space="preserve"> qui</w:t>
-      </w:r>
-      <w:r>
-        <w:t xml:space="preserve"> </w:t>
-      </w:r>
-      <w:r>
-        <w:t>rel</w:t>
-      </w:r>
-      <w:r>
-        <w:t>è</w:t>
-      </w:r>
-      <w:r>
-        <w:t>v</w:t>
-      </w:r>
-      <w:r>
-        <w:t>e</w:t>
-      </w:r>
-      <w:r>
-        <w:t xml:space="preserve"> les hautes fréquences</w:t>
-      </w:r>
-      <w:r>
-        <w:t xml:space="preserve"> (le</w:t>
-      </w:r>
-      <w:r>
-        <w:t xml:space="preserve"> </w:t>
-      </w:r>
-      <w:r>
-        <w:rPr>
-          <w:i/>
-          <w:iCs/>
-        </w:rPr>
-        <w:t>tf</w:t>
-      </w:r>
-      <w:r>
-        <w:t>),</w:t>
-      </w:r>
-      <w:r>
-        <w:t xml:space="preserve"> </w:t>
-      </w:r>
-      <w:r>
-        <w:t>la</w:t>
-      </w:r>
-      <w:r>
-        <w:t xml:space="preserve"> </w:t>
-      </w:r>
-      <w:r>
-        <w:t xml:space="preserve">tendance du </w:t>
-      </w:r>
-      <w:r>
-        <w:t>χ²</w:t>
-      </w:r>
-      <w:r>
-        <w:t xml:space="preserve"> </w:t>
-      </w:r>
-      <w:r>
-        <w:t>aux mots exclusifs se déplace</w:t>
-      </w:r>
-      <w:r>
-        <w:t xml:space="preserve"> un peu</w:t>
-      </w:r>
-      <w:r>
-        <w:t xml:space="preserve"> vers le bas du tableau, mais elle reste importante, dès le rang 17 on trouvera : </w:t>
-      </w:r>
-      <w:r>
-        <w:rPr>
-          <w:i/>
-          <w:iCs/>
-        </w:rPr>
-        <w:t>espalier, violacé, quenotte, suceur, brachioures, clupanodons, corégone, fissurelles, gobies-plumiers, krak</w:t>
-      </w:r>
-      <w:r>
-        <w:t xml:space="preserve">… </w:t>
-      </w:r>
-      <w:r>
-        <w:t xml:space="preserve">La formule de TXM native, sans paramétrage </w:t>
-      </w:r>
-      <w:r>
-        <w:t>α</w:t>
-      </w:r>
-      <w:r>
-        <w:t xml:space="preserve">, n’est pas indemne de cet inconvénient, même si elle le retarde au rang 47 : </w:t>
-      </w:r>
-      <w:r>
-        <w:rPr>
-          <w:i/>
-          <w:iCs/>
-        </w:rPr>
-        <w:t>espalier, violacé, quenotte, suceur</w:t>
-      </w:r>
-      <w:r>
-        <w:t xml:space="preserve">… Ce phénomène </w:t>
-      </w:r>
-      <w:r>
-        <w:t xml:space="preserve">est assez facile à présenter </w:t>
-      </w:r>
-    </w:p>
-    <w:p>
-      <w:pPr>
-        <w:ind w:firstLine="0"/>
-      </w:pPr>
-    </w:p>
-    <w:p>
-      <w:pPr>
-        <w:ind w:firstLine="708"/>
-      </w:pPr>
-      <w:r>
-        <w:t xml:space="preserve"> </w:t>
-      </w:r>
     </w:p>
     <w:sectPr>
-      <w:footerReference w:type="default" r:id="rId14"/>
+      <w:footerReference w:type="default" r:id="rId16"/>
       <w:pgSz w:w="11906" w:h="16838"/>
       <w:pgMar w:top="1417" w:right="1417" w:bottom="1417" w:left="1417" w:header="708" w:footer="708" w:gutter="0"/>
       <w:cols w:space="708"/>

</xml_diff>

<commit_message>
Stopwords dispersion is working
</commit_message>
<xml_diff>
--- a/docs/glorieux-specif.docx
+++ b/docs/glorieux-specif.docx
@@ -341,7 +341,13 @@
         <w:t xml:space="preserve">et article </w:t>
       </w:r>
       <w:r>
-        <w:t>vise à expliquer ce que montrer différentes formules du domaine, et propose une formule paramétrable qui couvre en partie le</w:t>
+        <w:t>vise à expliquer ce que montre</w:t>
+      </w:r>
+      <w:r>
+        <w:t>nt</w:t>
+      </w:r>
+      <w:r>
+        <w:t xml:space="preserve"> différentes formules du domaine, et propose une formule paramétrable qui couvre en partie le</w:t>
       </w:r>
       <w:r>
         <w:t>s variations observées sur l’extraction de mots-clés pour un texte.</w:t>
@@ -2443,10 +2449,13 @@
         <w:ind w:firstLine="708"/>
       </w:pPr>
       <w:r>
-        <w:t>Notons cependant</w:t>
-      </w:r>
-      <w:r>
-        <w:t xml:space="preserve"> aussi, </w:t>
+        <w:t xml:space="preserve">Notons </w:t>
+      </w:r>
+      <w:r>
+        <w:t>aussi</w:t>
+      </w:r>
+      <w:r>
+        <w:t xml:space="preserve"> </w:t>
       </w:r>
       <w:r>
         <w:t>que l</w:t>
@@ -2491,7 +2500,31 @@
         <w:t>seulement</w:t>
       </w:r>
       <w:r>
-        <w:t xml:space="preserve"> une conscience écologique, elle ouvre aussi la possibilité d’agrégations nouvelles et plus complexes.</w:t>
+        <w:t xml:space="preserve"> une conscience écologique, </w:t>
+      </w:r>
+      <w:r>
+        <w:t xml:space="preserve">c’est aussi </w:t>
+      </w:r>
+      <w:r>
+        <w:t>la rapidité</w:t>
+      </w:r>
+      <w:r>
+        <w:t xml:space="preserve"> </w:t>
+      </w:r>
+      <w:r>
+        <w:t>d</w:t>
+      </w:r>
+      <w:r>
+        <w:t>es interfaces, et donc</w:t>
+      </w:r>
+      <w:r>
+        <w:t xml:space="preserve"> plus de recherche, moins d’agacement et de découragement</w:t>
+      </w:r>
+      <w:r>
+        <w:t>.</w:t>
+      </w:r>
+      <w:r>
+        <w:t xml:space="preserve"> La vitesse n’est pas une variable scientifiquement négligeable.</w:t>
       </w:r>
     </w:p>
     <w:p>
@@ -3012,6 +3045,7 @@
         <w:ind w:firstLine="0"/>
       </w:pPr>
       <w:r>
+        <w:lastRenderedPageBreak/>
         <w:t>BM</w:t>
       </w:r>
       <w:r>
@@ -3061,7 +3095,6 @@
       <w:proofErr w:type="spellStart"/>
       <w:proofErr w:type="gramStart"/>
       <w:r>
-        <w:lastRenderedPageBreak/>
         <w:t>subTF</w:t>
       </w:r>
       <w:proofErr w:type="spellEnd"/>
@@ -3934,7 +3967,11 @@
         <w:t>s</w:t>
       </w:r>
       <w:r>
-        <w:t>tes de taille</w:t>
+        <w:t xml:space="preserve">tes </w:t>
+      </w:r>
+      <w:r>
+        <w:lastRenderedPageBreak/>
+        <w:t>de taille</w:t>
       </w:r>
       <w:r>
         <w:t>s</w:t>
@@ -3952,11 +3989,7 @@
         <w:t>) qui peuvent être moins nombreux que 100.</w:t>
       </w:r>
       <w:r>
-        <w:t xml:space="preserve"> Cet indice donne 0 si les listes sont identiques, et 1 si elles ne </w:t>
-      </w:r>
-      <w:r>
-        <w:lastRenderedPageBreak/>
-        <w:t xml:space="preserve">partagent aucun </w:t>
+        <w:t xml:space="preserve"> Cet indice donne 0 si les listes sont identiques, et 1 si elles ne partagent aucun </w:t>
       </w:r>
       <w:r>
         <w:t>élément</w:t>
@@ -4720,7 +4753,14 @@
         <w:rPr>
           <w:lang w:val="fr-FR"/>
         </w:rPr>
-        <w:t xml:space="preserve"> s’intéresser à des relations très fortes, par exemple les collocations pour lequel le score d’exclusivité est important</w:t>
+        <w:t xml:space="preserve"> s’intéresser à des relations très fortes, par exemple les </w:t>
+      </w:r>
+      <w:r>
+        <w:rPr>
+          <w:lang w:val="fr-FR"/>
+        </w:rPr>
+        <w:lastRenderedPageBreak/>
+        <w:t>collocations pour lequel le score d’exclusivité est important</w:t>
       </w:r>
       <w:r>
         <w:rPr>
@@ -4732,14 +4772,7 @@
         <w:rPr>
           <w:lang w:val="fr-FR"/>
         </w:rPr>
-        <w:t xml:space="preserve"> ou bien très lâches, comme </w:t>
-      </w:r>
-      <w:r>
-        <w:rPr>
-          <w:lang w:val="fr-FR"/>
-        </w:rPr>
-        <w:lastRenderedPageBreak/>
-        <w:t>observer des thématiques partagées à travers de gros corpus. Il est vain de promettre la formule universelle.</w:t>
+        <w:t xml:space="preserve"> ou bien très lâches, comme observer des thématiques partagées à travers de gros corpus. Il est vain de promettre la formule universelle.</w:t>
       </w:r>
     </w:p>
     <w:p>
@@ -6988,10 +7021,10 @@
         <w:t>D</w:t>
       </w:r>
       <w:r>
-        <w:t>ispersions d</w:t>
-      </w:r>
-      <w:r>
         <w:t>ans le ventre du croissant</w:t>
+      </w:r>
+      <w:r>
+        <w:t xml:space="preserve"> (dispersions)</w:t>
       </w:r>
     </w:p>
     <w:p>
@@ -7639,13 +7672,19 @@
       <w:r>
         <w:t>. Soit un point pour chaque mot-clé sur une bande, où la longueur indique la place d’un mot-clé dans la liste, et la hauteur indique si le mot est de fréquence haute ou basse dans Jules Verne.</w:t>
       </w:r>
+      <w:r>
+        <w:t xml:space="preserve"> </w:t>
+      </w:r>
+      <w:r>
+        <w:t xml:space="preserve">Les bandes de dispersion montre plusieurs phénomènes pour ces équations. </w:t>
+      </w:r>
     </w:p>
     <w:p>
       <w:pPr>
         <w:ind w:firstLine="708"/>
       </w:pPr>
       <w:r>
-        <w:t xml:space="preserve">Les bandes de dispersion montre plusieurs phénomènes pour ces équations. D’abord, les listes de </w:t>
+        <w:t xml:space="preserve">D’abord, les listes de </w:t>
       </w:r>
       <w:proofErr w:type="spellStart"/>
       <w:r>
@@ -7685,6 +7724,9 @@
         <w:ind w:firstLine="708"/>
       </w:pPr>
       <w:r>
+        <w:t>L’</w:t>
+      </w:r>
+      <w:r>
         <w:t xml:space="preserve">La fréquence des termes relativement au corpus, TF, </w:t>
       </w:r>
       <w:r>
@@ -7755,14 +7797,16 @@
       <w:r>
         <w:t xml:space="preserve"> </w:t>
       </w:r>
-      <w:r>
-        <w:t>La ligne jaune commence</w:t>
-      </w:r>
-      <w:r>
-        <w:t xml:space="preserve"> donc</w:t>
-      </w:r>
-      <w:r>
-        <w:t xml:space="preserve"> avec un segment plat à </w:t>
+    </w:p>
+    <w:p>
+      <w:pPr>
+        <w:ind w:firstLine="708"/>
+      </w:pPr>
+      <w:r>
+        <w:t>Plusieurs formules semblent observer</w:t>
+      </w:r>
+      <w:r>
+        <w:t xml:space="preserve"> des alignements pour </w:t>
       </w:r>
       <w:proofErr w:type="spellStart"/>
       <w:r>
@@ -7774,7 +7818,7 @@
       </w:r>
       <w:proofErr w:type="spellEnd"/>
       <w:r>
-        <w:t xml:space="preserve"> = </w:t>
+        <w:t xml:space="preserve"> = 2 et </w:t>
       </w:r>
       <w:proofErr w:type="spellStart"/>
       <w:r>
@@ -7782,11 +7826,137 @@
           <w:i/>
           <w:iCs/>
         </w:rPr>
+        <w:t>tf</w:t>
+      </w:r>
+      <w:proofErr w:type="spellEnd"/>
+      <w:r>
+        <w:t xml:space="preserve"> = 3, comme pour TF.</w:t>
+      </w:r>
+      <w:r>
+        <w:t xml:space="preserve"> </w:t>
+      </w:r>
+      <w:r>
+        <w:t>Toutes les</w:t>
+      </w:r>
+      <w:r>
+        <w:t xml:space="preserve"> formules</w:t>
+      </w:r>
+      <w:r>
+        <w:t xml:space="preserve"> </w:t>
+      </w:r>
+      <w:r>
+        <w:t xml:space="preserve">observent </w:t>
+      </w:r>
+      <w:r>
+        <w:t>cette</w:t>
+      </w:r>
+      <w:r>
+        <w:t xml:space="preserve"> ligne de base</w:t>
+      </w:r>
+      <w:r>
+        <w:t xml:space="preserve"> </w:t>
+      </w:r>
+      <w:r>
+        <w:t>en jaune</w:t>
+      </w:r>
+      <w:r>
+        <w:t xml:space="preserve"> qui</w:t>
+      </w:r>
+      <w:r>
+        <w:t xml:space="preserve"> commence par un segment plat (</w:t>
+      </w:r>
+      <w:proofErr w:type="spellStart"/>
+      <w:r>
+        <w:rPr>
+          <w:i/>
+          <w:iCs/>
+        </w:rPr>
+        <w:t>tf</w:t>
+      </w:r>
+      <w:proofErr w:type="spellEnd"/>
+      <w:r>
+        <w:t> = </w:t>
+      </w:r>
+      <w:proofErr w:type="spellStart"/>
+      <w:r>
+        <w:rPr>
+          <w:i/>
+          <w:iCs/>
+        </w:rPr>
         <w:t>cf</w:t>
       </w:r>
       <w:proofErr w:type="spellEnd"/>
       <w:r>
-        <w:t xml:space="preserve"> = 1.</w:t>
+        <w:t xml:space="preserve"> =1), les </w:t>
+      </w:r>
+      <w:proofErr w:type="spellStart"/>
+      <w:r>
+        <w:t>happax</w:t>
+      </w:r>
+      <w:proofErr w:type="spellEnd"/>
+      <w:r>
+        <w:t>. L</w:t>
+      </w:r>
+      <w:r>
+        <w:t>’ordre</w:t>
+      </w:r>
+      <w:r>
+        <w:t xml:space="preserve"> </w:t>
+      </w:r>
+      <w:r>
+        <w:t>proposé</w:t>
+      </w:r>
+      <w:r>
+        <w:t xml:space="preserve"> pour les formules</w:t>
+      </w:r>
+      <w:r>
+        <w:t>.</w:t>
+      </w:r>
+      <w:r>
+        <w:t xml:space="preserve"> TXM semble « mieux » que </w:t>
+      </w:r>
+      <w:r>
+        <w:t>G²</w:t>
+      </w:r>
+      <w:r>
+        <w:t xml:space="preserve"> </w:t>
+      </w:r>
+      <w:r>
+        <w:lastRenderedPageBreak/>
+        <w:t xml:space="preserve">selon ce critère, mais en ce cas </w:t>
+      </w:r>
+      <w:proofErr w:type="spellStart"/>
+      <w:r>
+        <w:t>subTF</w:t>
+      </w:r>
+      <w:proofErr w:type="spellEnd"/>
+      <w:r>
+        <w:t>-IDF</w:t>
+      </w:r>
+      <w:proofErr w:type="gramStart"/>
+      <w:r>
+        <w:t>α(</w:t>
+      </w:r>
+      <w:proofErr w:type="gramEnd"/>
+      <w:r>
+        <w:t>0,56)</w:t>
+      </w:r>
+      <w:r>
+        <w:t xml:space="preserve"> serait encore « mieux », sans que l’on </w:t>
+      </w:r>
+      <w:proofErr w:type="gramStart"/>
+      <w:r>
+        <w:t>voit</w:t>
+      </w:r>
+      <w:proofErr w:type="gramEnd"/>
+      <w:r>
+        <w:t xml:space="preserve"> </w:t>
+      </w:r>
+      <w:r>
+        <w:t>encore</w:t>
+      </w:r>
+      <w:r>
+        <w:t xml:space="preserve"> l’intérêt sémantique.</w:t>
       </w:r>
     </w:p>
     <w:p>
@@ -7794,7 +7964,6 @@
         <w:ind w:firstLine="708"/>
       </w:pPr>
       <w:r>
-        <w:lastRenderedPageBreak/>
         <w:t>TF-IDF</w:t>
       </w:r>
       <w:proofErr w:type="gramStart"/>
@@ -7848,183 +8017,7 @@
       </w:r>
       <w:proofErr w:type="spellEnd"/>
       <w:r>
-        <w:t>.</w:t>
-      </w:r>
-      <w:r>
-        <w:t xml:space="preserve"> Des mots plus fréquents sont visibles en ordre dispersé.</w:t>
-      </w:r>
-    </w:p>
-    <w:p>
-      <w:pPr>
-        <w:ind w:firstLine="708"/>
-      </w:pPr>
-      <w:r>
-        <w:t>Toutes les</w:t>
-      </w:r>
-      <w:r>
-        <w:t xml:space="preserve"> formules</w:t>
-      </w:r>
-      <w:r>
-        <w:t xml:space="preserve"> </w:t>
-      </w:r>
-      <w:r>
-        <w:t xml:space="preserve">observent </w:t>
-      </w:r>
-      <w:r>
-        <w:t>cette</w:t>
-      </w:r>
-      <w:r>
-        <w:t xml:space="preserve"> ligne de base</w:t>
-      </w:r>
-      <w:r>
-        <w:t xml:space="preserve"> </w:t>
-      </w:r>
-      <w:r>
-        <w:t>en jaune</w:t>
-      </w:r>
-      <w:r>
-        <w:t xml:space="preserve"> qui monte doucement jusqu</w:t>
-      </w:r>
-      <w:r>
-        <w:t>’à</w:t>
-      </w:r>
-      <w:r>
-        <w:t xml:space="preserve"> la queue. </w:t>
-      </w:r>
-      <w:r>
-        <w:t xml:space="preserve">On peut même plus ou moins remarquer des alignements pour </w:t>
-      </w:r>
-      <w:proofErr w:type="spellStart"/>
-      <w:r>
-        <w:rPr>
-          <w:i/>
-          <w:iCs/>
-        </w:rPr>
-        <w:t>tf</w:t>
-      </w:r>
-      <w:proofErr w:type="spellEnd"/>
-      <w:r>
-        <w:t xml:space="preserve"> = </w:t>
-      </w:r>
-      <w:r>
-        <w:t xml:space="preserve">2 et </w:t>
-      </w:r>
-      <w:proofErr w:type="spellStart"/>
-      <w:r>
-        <w:rPr>
-          <w:i/>
-          <w:iCs/>
-        </w:rPr>
-        <w:t>tf</w:t>
-      </w:r>
-      <w:proofErr w:type="spellEnd"/>
-      <w:r>
-        <w:t xml:space="preserve"> = </w:t>
-      </w:r>
-      <w:r>
-        <w:t>3</w:t>
-      </w:r>
-      <w:r>
-        <w:t>, comme pour TF</w:t>
-      </w:r>
-      <w:r>
-        <w:t xml:space="preserve">. </w:t>
-      </w:r>
-      <w:r>
-        <w:t>L</w:t>
-      </w:r>
-      <w:r>
-        <w:t>e trait horizontal</w:t>
-      </w:r>
-      <w:r>
-        <w:t xml:space="preserve"> plat</w:t>
-      </w:r>
-      <w:r>
-        <w:t xml:space="preserve"> du bas</w:t>
-      </w:r>
-      <w:r>
-        <w:t xml:space="preserve"> (</w:t>
-      </w:r>
-      <w:proofErr w:type="spellStart"/>
-      <w:r>
-        <w:rPr>
-          <w:i/>
-          <w:iCs/>
-        </w:rPr>
-        <w:t>tf</w:t>
-      </w:r>
-      <w:proofErr w:type="spellEnd"/>
-      <w:r>
-        <w:t xml:space="preserve"> = </w:t>
-      </w:r>
-      <w:proofErr w:type="spellStart"/>
-      <w:r>
-        <w:rPr>
-          <w:i/>
-          <w:iCs/>
-        </w:rPr>
-        <w:t>cf</w:t>
-      </w:r>
-      <w:proofErr w:type="spellEnd"/>
-      <w:r>
-        <w:t xml:space="preserve"> = 1</w:t>
-      </w:r>
-      <w:r>
-        <w:t>) commencent à un rang de plus en plus tardif dans l’ordre</w:t>
-      </w:r>
-      <w:r>
-        <w:t xml:space="preserve"> </w:t>
-      </w:r>
-      <w:r>
-        <w:t>proposé</w:t>
-      </w:r>
-      <w:r>
-        <w:t xml:space="preserve"> pour les formules</w:t>
-      </w:r>
-      <w:r>
-        <w:t>.</w:t>
-      </w:r>
-      <w:r>
-        <w:t xml:space="preserve"> TXM semble « mieux » que </w:t>
-      </w:r>
-      <w:r>
-        <w:t>G²</w:t>
-      </w:r>
-      <w:r>
-        <w:t xml:space="preserve"> selon ce critère, mais en ce cas </w:t>
-      </w:r>
-      <w:proofErr w:type="spellStart"/>
-      <w:r>
-        <w:t>subTF</w:t>
-      </w:r>
-      <w:proofErr w:type="spellEnd"/>
-      <w:r>
-        <w:t>-IDF</w:t>
-      </w:r>
-      <w:proofErr w:type="gramStart"/>
-      <w:r>
-        <w:t>α(</w:t>
-      </w:r>
-      <w:proofErr w:type="gramEnd"/>
-      <w:r>
-        <w:t>0,56)</w:t>
-      </w:r>
-      <w:r>
-        <w:t xml:space="preserve"> serait encore « mieux », sans que l’on </w:t>
-      </w:r>
-      <w:proofErr w:type="gramStart"/>
-      <w:r>
-        <w:t>voit</w:t>
-      </w:r>
-      <w:proofErr w:type="gramEnd"/>
-      <w:r>
-        <w:t xml:space="preserve"> </w:t>
-      </w:r>
-      <w:r>
-        <w:t>encore</w:t>
-      </w:r>
-      <w:r>
-        <w:t xml:space="preserve"> l’intérêt sémantique.</w:t>
+        <w:t>. Des mots plus fréquents sont visibles en ordre dispersé.</w:t>
       </w:r>
     </w:p>
     <w:p>
@@ -8093,7 +8086,13 @@
         <w:ind w:firstLine="0"/>
       </w:pPr>
       <w:r>
-        <w:t>On touche désormais</w:t>
+        <w:t xml:space="preserve">On </w:t>
+      </w:r>
+      <w:r>
+        <w:t>voit</w:t>
+      </w:r>
+      <w:r>
+        <w:t xml:space="preserve"> désormais</w:t>
       </w:r>
       <w:r>
         <w:t xml:space="preserve"> beaucoup plus</w:t>
@@ -8102,13 +8101,25 @@
         <w:t xml:space="preserve"> concrètement </w:t>
       </w:r>
       <w:r>
-        <w:t>la distance entre</w:t>
-      </w:r>
-      <w:r>
-        <w:t xml:space="preserve"> les formules</w:t>
-      </w:r>
-      <w:r>
-        <w:t>, comment elles s’étalent entre TF et</w:t>
+        <w:t>comment</w:t>
+      </w:r>
+      <w:r>
+        <w:t xml:space="preserve"> </w:t>
+      </w:r>
+      <w:r>
+        <w:t xml:space="preserve">fonctionnent </w:t>
+      </w:r>
+      <w:r>
+        <w:t>les formules</w:t>
+      </w:r>
+      <w:r>
+        <w:t xml:space="preserve"> qui</w:t>
+      </w:r>
+      <w:r>
+        <w:t xml:space="preserve"> </w:t>
+      </w:r>
+      <w:r>
+        <w:t>s’étalent entre TF et</w:t>
       </w:r>
       <w:r>
         <w:t xml:space="preserve"> TF-IDF</w:t>
@@ -8257,7 +8268,7 @@
       </w:r>
       <w:proofErr w:type="gramEnd"/>
       <w:r>
-        <w:t xml:space="preserve"> cela ne dit pas si les autres mots ont un classement relatif plus </w:t>
+        <w:t xml:space="preserve"> cela ne dit pas si les autres mots ont un classement plus </w:t>
       </w:r>
       <w:r>
         <w:t>sémantique</w:t>
@@ -8292,7 +8303,6 @@
         <w:pStyle w:val="Heading1"/>
       </w:pPr>
       <w:r>
-        <w:lastRenderedPageBreak/>
         <w:t>§7.</w:t>
       </w:r>
       <w:r>

</xml_diff>

<commit_message>
Drop the all keywords experiment
</commit_message>
<xml_diff>
--- a/docs/glorieux-specif.docx
+++ b/docs/glorieux-specif.docx
@@ -3826,10 +3826,12 @@
         <w:pStyle w:val="keywords"/>
       </w:pPr>
       <w:proofErr w:type="spellStart"/>
+      <w:proofErr w:type="gramStart"/>
       <w:r>
         <w:t>subTF</w:t>
       </w:r>
       <w:proofErr w:type="spellEnd"/>
+      <w:proofErr w:type="gramEnd"/>
       <w:r>
         <w:t>-IDF </w:t>
       </w:r>
@@ -6085,8 +6087,13 @@
         <w:t>ᵅ</w:t>
       </w:r>
       <w:r>
-        <w:t> ; IDF = ln(</w:t>
-      </w:r>
+        <w:t xml:space="preserve"> ; IDF = </w:t>
+      </w:r>
+      <w:proofErr w:type="gramStart"/>
+      <w:r>
+        <w:t>ln(</w:t>
+      </w:r>
+      <w:proofErr w:type="gramEnd"/>
       <w:r>
         <w:rPr>
           <w:i/>
@@ -6413,6 +6420,7 @@
         <w:t xml:space="preserve">) = </w:t>
       </w:r>
       <w:proofErr w:type="spellStart"/>
+      <w:proofErr w:type="gramStart"/>
       <w:r>
         <w:rPr>
           <w:i/>
@@ -6425,14 +6433,21 @@
         <w:rPr>
           <w:vertAlign w:val="superscript"/>
         </w:rPr>
-        <w:t xml:space="preserve">(1 - </w:t>
-      </w:r>
-      <w:r>
-        <w:rPr>
-          <w:i/>
-          <w:iCs/>
+        <w:t>(</w:t>
+      </w:r>
+      <w:proofErr w:type="gramEnd"/>
+      <w:r>
+        <w:rPr>
           <w:vertAlign w:val="superscript"/>
         </w:rPr>
+        <w:t xml:space="preserve">1 - </w:t>
+      </w:r>
+      <w:r>
+        <w:rPr>
+          <w:i/>
+          <w:iCs/>
+          <w:vertAlign w:val="superscript"/>
+        </w:rPr>
         <w:t>α</w:t>
       </w:r>
       <w:r>
@@ -6485,13 +6500,19 @@
       <w:r>
         <w:t>G</w:t>
       </w:r>
+      <w:proofErr w:type="gramStart"/>
       <w:r>
         <w:t>²</w:t>
       </w:r>
       <w:r>
-        <w:t xml:space="preserve">(0) = </w:t>
+        <w:t>(</w:t>
+      </w:r>
+      <w:proofErr w:type="gramEnd"/>
+      <w:r>
+        <w:t xml:space="preserve">0) = </w:t>
       </w:r>
       <w:proofErr w:type="spellStart"/>
+      <w:proofErr w:type="gramStart"/>
       <w:r>
         <w:rPr>
           <w:i/>
@@ -6504,7 +6525,14 @@
         <w:rPr>
           <w:vertAlign w:val="superscript"/>
         </w:rPr>
-        <w:t>(1-0)</w:t>
+        <w:t>(</w:t>
+      </w:r>
+      <w:proofErr w:type="gramEnd"/>
+      <w:r>
+        <w:rPr>
+          <w:vertAlign w:val="superscript"/>
+        </w:rPr>
+        <w:t>1-0)</w:t>
       </w:r>
       <w:r>
         <w:t xml:space="preserve"> × (</w:t>
@@ -6585,13 +6613,19 @@
       <w:r>
         <w:t>²</w:t>
       </w:r>
+      <w:proofErr w:type="gramStart"/>
       <w:r>
         <w:t>α</w:t>
       </w:r>
       <w:r>
-        <w:t xml:space="preserve">(1) = </w:t>
+        <w:t>(</w:t>
+      </w:r>
+      <w:proofErr w:type="gramEnd"/>
+      <w:r>
+        <w:t xml:space="preserve">1) = </w:t>
       </w:r>
       <w:proofErr w:type="spellStart"/>
+      <w:proofErr w:type="gramStart"/>
       <w:r>
         <w:rPr>
           <w:i/>
@@ -6604,7 +6638,14 @@
         <w:rPr>
           <w:vertAlign w:val="superscript"/>
         </w:rPr>
-        <w:t>(1-1)</w:t>
+        <w:t>(</w:t>
+      </w:r>
+      <w:proofErr w:type="gramEnd"/>
+      <w:r>
+        <w:rPr>
+          <w:vertAlign w:val="superscript"/>
+        </w:rPr>
+        <w:t>1-1)</w:t>
       </w:r>
       <w:r>
         <w:t xml:space="preserve"> × (</w:t>
@@ -7358,7 +7399,25 @@
         <w:ind w:firstLine="0"/>
       </w:pPr>
       <w:r>
-        <w:t xml:space="preserve">Nous avons vu sur l’exemple d’un chapitre que les mots exclusifs </w:t>
+        <w:t>Nous avons vu sur l’exemple d’un chapitre que les mots exclusifs</w:t>
+      </w:r>
+      <w:r>
+        <w:t xml:space="preserve"> — </w:t>
+      </w:r>
+      <w:proofErr w:type="spellStart"/>
+      <w:r>
+        <w:rPr>
+          <w:i/>
+          <w:iCs/>
+        </w:rPr>
+        <w:t>df</w:t>
+      </w:r>
+      <w:proofErr w:type="spellEnd"/>
+      <w:r>
+        <w:t>=1 —</w:t>
+      </w:r>
+      <w:r>
+        <w:t xml:space="preserve"> </w:t>
       </w:r>
       <w:r>
         <w:t xml:space="preserve">sont le seuil minimal de </w:t>
@@ -7392,11 +7451,67 @@
           <w:i/>
           <w:iCs/>
         </w:rPr>
+        <w:t>d</w:t>
+      </w:r>
+      <w:r>
+        <w:rPr>
+          <w:i/>
+          <w:iCs/>
+        </w:rPr>
+        <w:t>f</w:t>
+      </w:r>
+      <w:proofErr w:type="spellEnd"/>
+      <w:r>
+        <w:t>=</w:t>
+      </w:r>
+      <w:r>
+        <w:t xml:space="preserve">1, </w:t>
+      </w:r>
+      <w:proofErr w:type="spellStart"/>
+      <w:r>
+        <w:rPr>
+          <w:i/>
+          <w:iCs/>
+        </w:rPr>
+        <w:t>t</w:t>
+      </w:r>
+      <w:r>
+        <w:rPr>
+          <w:i/>
+          <w:iCs/>
+        </w:rPr>
+        <w:t>f</w:t>
+      </w:r>
+      <w:proofErr w:type="spellEnd"/>
+      <w:r>
+        <w:t>=1 — ont le même score pour un même document, et donc occupent une suite continue de rangs.</w:t>
+      </w:r>
+      <w:r>
+        <w:t xml:space="preserve"> Les autres termes exclusifs — </w:t>
+      </w:r>
+      <w:proofErr w:type="spellStart"/>
+      <w:r>
+        <w:rPr>
+          <w:i/>
+          <w:iCs/>
+        </w:rPr>
+        <w:t>df</w:t>
+      </w:r>
+      <w:proofErr w:type="spellEnd"/>
+      <w:r>
+        <w:t xml:space="preserve">=1, </w:t>
+      </w:r>
+      <w:proofErr w:type="spellStart"/>
+      <w:r>
+        <w:rPr>
+          <w:i/>
+          <w:iCs/>
+        </w:rPr>
         <w:t>tf</w:t>
       </w:r>
       <w:proofErr w:type="spellEnd"/>
       <w:r>
-        <w:t>=</w:t>
+        <w:t xml:space="preserve">&gt;1 — peuvent être diversement dispersés selon la valeur de </w:t>
       </w:r>
       <w:proofErr w:type="spellStart"/>
       <w:r>
@@ -7404,177 +7519,227 @@
           <w:i/>
           <w:iCs/>
         </w:rPr>
+        <w:t>tf</w:t>
+      </w:r>
+      <w:proofErr w:type="spellEnd"/>
+      <w:r>
+        <w:t>.</w:t>
+      </w:r>
+    </w:p>
+    <w:p>
+      <w:pPr>
+        <w:ind w:firstLine="708"/>
+      </w:pPr>
+      <w:r>
+        <w:lastRenderedPageBreak/>
+        <w:t>L</w:t>
+      </w:r>
+      <w:r>
+        <w:t>e plateau</w:t>
+      </w:r>
+      <w:r>
+        <w:t xml:space="preserve"> des hapax</w:t>
+      </w:r>
+      <w:r>
+        <w:t>, présent pour chaque</w:t>
+      </w:r>
+      <w:r>
+        <w:t xml:space="preserve"> formule et </w:t>
+      </w:r>
+      <w:r>
+        <w:t>les</w:t>
+      </w:r>
+      <w:r>
+        <w:t xml:space="preserve"> document</w:t>
+      </w:r>
+      <w:r>
+        <w:t>s</w:t>
+      </w:r>
+      <w:r>
+        <w:t xml:space="preserve"> </w:t>
+      </w:r>
+      <w:r>
+        <w:t>qui contien</w:t>
+      </w:r>
+      <w:r>
+        <w:t>nent</w:t>
+      </w:r>
+      <w:r>
+        <w:t xml:space="preserve"> au moins un </w:t>
+      </w:r>
+      <w:proofErr w:type="spellStart"/>
+      <w:r>
+        <w:t>happax</w:t>
+      </w:r>
+      <w:proofErr w:type="spellEnd"/>
+      <w:r>
+        <w:t xml:space="preserve">, donne un point de repère intéressant de la bande passante utile. Au-delà du rang des hapax, </w:t>
+      </w:r>
+      <w:r>
+        <w:t>on ne sait plus ce que peu</w:t>
+      </w:r>
+      <w:r>
+        <w:t>ven</w:t>
+      </w:r>
+      <w:r>
+        <w:t xml:space="preserve">t signifier les rangs, </w:t>
+      </w:r>
+      <w:r>
+        <w:t>à une exception</w:t>
+      </w:r>
+      <w:r>
+        <w:t xml:space="preserve"> à considérer avant</w:t>
+      </w:r>
+      <w:r>
+        <w:t>, les spécificités négatives</w:t>
+      </w:r>
+      <w:r>
+        <w:t>.</w:t>
+      </w:r>
+    </w:p>
+    <w:p>
+      <w:pPr>
+        <w:ind w:firstLine="708"/>
+      </w:pPr>
+      <w:r>
+        <w:t xml:space="preserve">Les tests statistiques comme </w:t>
+      </w:r>
+      <w:r>
+        <w:t>G</w:t>
+      </w:r>
+      <w:r>
+        <w:t>²</w:t>
+      </w:r>
+      <w:r>
+        <w:t>, LRC, ou</w:t>
+      </w:r>
+      <w:r>
+        <w:t xml:space="preserve"> Fisher (TXM)</w:t>
+      </w:r>
+      <w:r>
+        <w:t>,</w:t>
+      </w:r>
+      <w:r>
+        <w:t xml:space="preserve"> mesurent les mots sur-représentés, mais aussi les mots sous-représentés.</w:t>
+      </w:r>
+      <w:r>
+        <w:t xml:space="preserve"> Pour le chapitre « Les poulpes », la formule TXM donne </w:t>
+      </w:r>
+      <w:r>
+        <w:t xml:space="preserve">par exemple </w:t>
+      </w:r>
+      <w:r>
+        <w:t>les mots suivants</w:t>
+      </w:r>
+      <w:r>
+        <w:t xml:space="preserve"> — mots grammaticaux filtrés —</w:t>
+      </w:r>
+      <w:r>
+        <w:t xml:space="preserve"> comme spécialement sous-représentés relativement aux autres textes de Jules Verne : </w:t>
+      </w:r>
+      <w:r>
+        <w:rPr>
+          <w:i/>
+          <w:iCs/>
+        </w:rPr>
+        <w:t>venir, savoir, heure, trouver, donner, reprendre, main, dernier, attendre, suivre</w:t>
+      </w:r>
+      <w:r>
+        <w:t xml:space="preserve">… Cette information est beaucoup moins significative que les spécificités positives : </w:t>
+      </w:r>
+      <w:r>
+        <w:rPr>
+          <w:i/>
+          <w:iCs/>
+        </w:rPr>
+        <w:t>poulpe, calmar, monstre</w:t>
+      </w:r>
+      <w:r>
+        <w:t xml:space="preserve">… On comprend l’intérêt des spécificités négatives pour des corpus spécialement cohérents, par exemple des discours politiques, ou des entretiens sociologiques, mais ils sont assez difficiles à </w:t>
+      </w:r>
+      <w:r>
+        <w:t>interpréter</w:t>
+      </w:r>
+      <w:r>
+        <w:t xml:space="preserve"> pour de la littérature plus variée, à moins de s’intéresser spécialement à certains mots, comme les pronoms personnels, les verbes d’expression, ou les parties du corps.</w:t>
+      </w:r>
+    </w:p>
+    <w:p>
+      <w:pPr>
+        <w:ind w:firstLine="708"/>
+      </w:pPr>
+      <w:r>
+        <w:t xml:space="preserve">On peut donc dire que la bande passante utile d’une formule va de son maximum </w:t>
+      </w:r>
+      <w:r>
+        <w:t>au premier hapax, et peut reprendre pour les formules mesurant des spécificités négatives. Nous tenons donc ici un indice quantitatif intéressant pour évaluer les formules selon leurs résultats</w:t>
+      </w:r>
+      <w:r>
+        <w:t xml:space="preserve"> — et non</w:t>
+      </w:r>
+      <w:r>
+        <w:t xml:space="preserve"> selon</w:t>
+      </w:r>
+      <w:r>
+        <w:t xml:space="preserve"> leurs prétentions théoriques</w:t>
+      </w:r>
+      <w:r>
+        <w:t>, car la liberté de la langue n’est contenue dans aucun modèle mathématique.</w:t>
+      </w:r>
+    </w:p>
+    <w:p>
+      <w:pPr>
+        <w:ind w:firstLine="0"/>
+      </w:pPr>
+    </w:p>
+    <w:p>
+      <w:pPr>
+        <w:ind w:firstLine="0"/>
+      </w:pPr>
+      <w:r>
+        <w:t>Figure 4. Rangs d’apparition des hapax (</w:t>
+      </w:r>
+      <w:proofErr w:type="spellStart"/>
+      <w:r>
+        <w:rPr>
+          <w:i/>
+          <w:iCs/>
+        </w:rPr>
         <w:t>df</w:t>
       </w:r>
       <w:proofErr w:type="spellEnd"/>
       <w:r>
-        <w:t>=1 — ont le même score pour un même document, et donc occupent une suite continue de rangs. Ce plateau, présent pour chaque</w:t>
-      </w:r>
-      <w:r>
-        <w:t xml:space="preserve"> formule et chaque</w:t>
-      </w:r>
-      <w:r>
-        <w:t xml:space="preserve"> document </w:t>
-      </w:r>
-      <w:r>
-        <w:t xml:space="preserve">(qui contient au moins un </w:t>
+        <w:t>=1</w:t>
+      </w:r>
+      <w:r>
+        <w:t xml:space="preserve">, </w:t>
       </w:r>
       <w:proofErr w:type="spellStart"/>
       <w:r>
-        <w:t>happax</w:t>
+        <w:rPr>
+          <w:i/>
+          <w:iCs/>
+        </w:rPr>
+        <w:t>tf</w:t>
       </w:r>
       <w:proofErr w:type="spellEnd"/>
       <w:r>
-        <w:t>)</w:t>
-      </w:r>
-      <w:r>
-        <w:t xml:space="preserve">, donne un point de repère </w:t>
-      </w:r>
-      <w:r>
-        <w:lastRenderedPageBreak/>
-        <w:t xml:space="preserve">intéressant de la bande passante utile. Au-delà du rang des hapax, </w:t>
-      </w:r>
-      <w:r>
-        <w:t>on ne sait plus ce que peu</w:t>
-      </w:r>
-      <w:r>
-        <w:t>ven</w:t>
-      </w:r>
-      <w:r>
-        <w:t xml:space="preserve">t signifier les rangs, </w:t>
-      </w:r>
-      <w:r>
-        <w:t>à une exception prêt</w:t>
-      </w:r>
-      <w:r>
-        <w:t xml:space="preserve"> à considérer avant</w:t>
-      </w:r>
-      <w:r>
-        <w:t>, les spécificités négatives</w:t>
-      </w:r>
-      <w:r>
-        <w:t>.</w:t>
-      </w:r>
-    </w:p>
-    <w:p>
-      <w:pPr>
-        <w:ind w:firstLine="708"/>
-      </w:pPr>
-      <w:r>
-        <w:t xml:space="preserve">Les tests statistiques comme le </w:t>
-      </w:r>
-      <w:r>
-        <w:t>G</w:t>
-      </w:r>
-      <w:r>
-        <w:t>²</w:t>
-      </w:r>
-      <w:r>
-        <w:t xml:space="preserve"> ou le Fisher (TXM)</w:t>
-      </w:r>
-      <w:r>
-        <w:t xml:space="preserve"> mesurent les mots sur-représentés, mais aussi les mots sous-représentés.</w:t>
-      </w:r>
-      <w:r>
-        <w:t xml:space="preserve"> Pour le chapitre « Les poulpes », la formule TXM donne </w:t>
-      </w:r>
-      <w:r>
-        <w:t xml:space="preserve">par exemple </w:t>
-      </w:r>
-      <w:r>
-        <w:t>les mots suivants</w:t>
-      </w:r>
-      <w:r>
-        <w:t xml:space="preserve"> — mots grammaticaux filtrés —</w:t>
-      </w:r>
-      <w:r>
-        <w:t xml:space="preserve"> comme spécialement sous-représentés relativement aux autres textes de Jules Verne : </w:t>
-      </w:r>
-      <w:r>
-        <w:rPr>
-          <w:i/>
-          <w:iCs/>
-        </w:rPr>
-        <w:t>venir, savoir, heure, trouver, donner, reprendre, main, dernier, attendre, suivre</w:t>
-      </w:r>
-      <w:r>
-        <w:t xml:space="preserve">… Cette information est beaucoup moins significative que les spécificités positives : </w:t>
-      </w:r>
-      <w:r>
-        <w:rPr>
-          <w:i/>
-          <w:iCs/>
-        </w:rPr>
-        <w:t>poulpe, calmar, monstre</w:t>
-      </w:r>
-      <w:r>
-        <w:t xml:space="preserve">… On comprend l’intérêt des spécificités négatives pour des corpus spécialement cohérents, par exemple des discours politiques, ou des entretiens sociologiques, mais ils sont assez difficiles à </w:t>
-      </w:r>
-      <w:r>
-        <w:t>interpréter</w:t>
-      </w:r>
-      <w:r>
-        <w:t xml:space="preserve"> pour de la littérature plus variée, à moins de s’intéresser spécialement à certains mots, comme les pronoms personnels, les verbes d’expression, ou les parties du corps.</w:t>
-      </w:r>
-    </w:p>
-    <w:p>
-      <w:pPr>
-        <w:ind w:firstLine="708"/>
-      </w:pPr>
-      <w:r>
-        <w:t xml:space="preserve">On peut donc dire que la bande passante utile d’une formule va de son maximum </w:t>
-      </w:r>
-      <w:r>
-        <w:t>au premier hapax, et peut reprendre pour les formules mesurant des spécificités négatives. Nous tenons donc ici un indice quantitatif intéressant pour évaluer les formules selon leurs résultats, et non selon une doctrine statistique dont aucune ne rend exactement compte des phénomènes linguistiques réels.</w:t>
+        <w:t>=1</w:t>
+      </w:r>
+      <w:r>
+        <w:t>) selon différentes formules.</w:t>
       </w:r>
     </w:p>
     <w:p>
       <w:pPr>
         <w:ind w:firstLine="0"/>
       </w:pPr>
-    </w:p>
-    <w:p>
-      <w:pPr>
-        <w:ind w:firstLine="0"/>
-      </w:pPr>
-      <w:r>
-        <w:t>Figure 4. Rangs d’apparition des hapax (</w:t>
-      </w:r>
-      <w:proofErr w:type="spellStart"/>
-      <w:r>
-        <w:rPr>
-          <w:i/>
-          <w:iCs/>
-        </w:rPr>
-        <w:t>tf</w:t>
-      </w:r>
-      <w:proofErr w:type="spellEnd"/>
-      <w:r>
-        <w:t>=</w:t>
-      </w:r>
-      <w:proofErr w:type="spellStart"/>
-      <w:r>
-        <w:rPr>
-          <w:i/>
-          <w:iCs/>
-        </w:rPr>
-        <w:t>df</w:t>
-      </w:r>
-      <w:proofErr w:type="spellEnd"/>
-      <w:r>
-        <w:t>=1) selon différentes formules.</w:t>
-      </w:r>
-    </w:p>
-    <w:p>
-      <w:pPr>
-        <w:ind w:firstLine="0"/>
-      </w:pPr>
       <w:r>
         <w:rPr>
           <w:noProof/>
         </w:rPr>
         <w:drawing>
-          <wp:anchor distT="0" distB="0" distL="114300" distR="114300" simplePos="0" relativeHeight="251679744" behindDoc="0" locked="0" layoutInCell="1" allowOverlap="1" wp14:anchorId="4DE1EDAF" wp14:editId="54262FF1">
+          <wp:anchor distT="0" distB="0" distL="114300" distR="114300" simplePos="0" relativeHeight="251679744" behindDoc="0" locked="0" layoutInCell="1" allowOverlap="1" wp14:anchorId="425EC4C9" wp14:editId="39E6B19E">
             <wp:simplePos x="0" y="0"/>
             <wp:positionH relativeFrom="column">
               <wp:posOffset>0</wp:posOffset>
@@ -7585,7 +7750,7 @@
             <wp:extent cx="5760720" cy="2409190"/>
             <wp:effectExtent l="0" t="0" r="0" b="0"/>
             <wp:wrapTopAndBottom/>
-            <wp:docPr id="422615351" name="Picture 5"/>
+            <wp:docPr id="1582875185" name="Picture 6"/>
             <wp:cNvGraphicFramePr>
               <a:graphicFrameLocks xmlns:a="http://schemas.openxmlformats.org/drawingml/2006/main" noChangeAspect="1"/>
             </wp:cNvGraphicFramePr>
@@ -7593,7 +7758,7 @@
               <a:graphicData uri="http://schemas.openxmlformats.org/drawingml/2006/picture">
                 <pic:pic xmlns:pic="http://schemas.openxmlformats.org/drawingml/2006/picture">
                   <pic:nvPicPr>
-                    <pic:cNvPr id="0" name="Picture 6"/>
+                    <pic:cNvPr id="0" name="Picture 7"/>
                     <pic:cNvPicPr>
                       <a:picLocks noChangeAspect="1" noChangeArrowheads="1"/>
                     </pic:cNvPicPr>
@@ -7642,7 +7807,13 @@
         <w:ind w:firstLine="0"/>
       </w:pPr>
       <w:r>
-        <w:t>Le rang d’apparition des hapax varie bien sûr selon la taille du texte, le style de l’auteur, et on le voit ci-dessus, selon la formule.</w:t>
+        <w:t>Le rang d’apparition des hapax varie bien sûr selon la taille du texte, le style de l’auteur, et on le voit ci-dessus</w:t>
+      </w:r>
+      <w:r>
+        <w:t xml:space="preserve"> aussi</w:t>
+      </w:r>
+      <w:r>
+        <w:t>, selon la formule.</w:t>
       </w:r>
     </w:p>
     <w:p>
@@ -7661,11 +7832,16 @@
       <w:r>
         <w:t>TF-IDF</w:t>
       </w:r>
+      <w:proofErr w:type="gramStart"/>
       <w:r>
         <w:t>α</w:t>
       </w:r>
       <w:r>
-        <w:t>(100) tend à promouvoir les termes exclusifs (</w:t>
+        <w:t>(</w:t>
+      </w:r>
+      <w:proofErr w:type="gramEnd"/>
+      <w:r>
+        <w:t>100) tend à promouvoir les termes exclusifs (</w:t>
       </w:r>
       <w:proofErr w:type="spellStart"/>
       <w:r>
@@ -7677,7 +7853,13 @@
       </w:r>
       <w:proofErr w:type="spellEnd"/>
       <w:r>
-        <w:t>=1), en ordre de fréquence dans le document (</w:t>
+        <w:t xml:space="preserve">=1), </w:t>
+      </w:r>
+      <w:r>
+        <w:t xml:space="preserve">mais </w:t>
+      </w:r>
+      <w:r>
+        <w:t>en ordre de fréquence dans le document (</w:t>
       </w:r>
       <w:proofErr w:type="spellStart"/>
       <w:r>
@@ -7689,13 +7871,7 @@
       </w:r>
       <w:proofErr w:type="spellEnd"/>
       <w:r>
-        <w:t>), si bien que le premier rang dans les listes de mots-clés peut être occupé par un mot exclusif répété</w:t>
-      </w:r>
-      <w:r>
-        <w:t>s</w:t>
-      </w:r>
-      <w:r>
-        <w:t xml:space="preserve"> (</w:t>
+        <w:t>), si bien que le premier rang dans les listes de mots-clés peut être occupé par un mot exclusif répété (</w:t>
       </w:r>
       <w:proofErr w:type="spellStart"/>
       <w:r>
@@ -7712,11 +7888,16 @@
       <w:r>
         <w:t>TF-IDF</w:t>
       </w:r>
+      <w:proofErr w:type="gramStart"/>
       <w:r>
         <w:t>α</w:t>
       </w:r>
       <w:r>
-        <w:t>(100)</w:t>
+        <w:t>(</w:t>
+      </w:r>
+      <w:proofErr w:type="gramEnd"/>
+      <w:r>
+        <w:t>100)</w:t>
       </w:r>
       <w:r>
         <w:t xml:space="preserve"> n’est pas à 100% d’hapax, mais 67,9</w:t>
@@ -7769,7 +7950,13 @@
         <w:t>=1) sont toujours à leur rang maximal</w:t>
       </w:r>
       <w:r>
-        <w:t xml:space="preserve"> selon le vocabulaire du texte</w:t>
+        <w:t xml:space="preserve"> selon le vocabulaire d</w:t>
+      </w:r>
+      <w:r>
+        <w:t>’un</w:t>
+      </w:r>
+      <w:r>
+        <w:t xml:space="preserve"> texte</w:t>
       </w:r>
       <w:r>
         <w:t>.</w:t>
@@ -7824,8 +8011,13 @@
       <w:r>
         <w:t>DF</w:t>
       </w:r>
-      <w:r>
-        <w:t>α(0.77)</w:t>
+      <w:proofErr w:type="gramStart"/>
+      <w:r>
+        <w:t>α(</w:t>
+      </w:r>
+      <w:proofErr w:type="gramEnd"/>
+      <w:r>
+        <w:t>0.77)</w:t>
       </w:r>
       <w:r>
         <w:t xml:space="preserve"> #46, </w:t>
@@ -7844,7 +8036,15 @@
       </w:r>
       <w:proofErr w:type="spellEnd"/>
       <w:r>
-        <w:t>-IDFα(0.27)</w:t>
+        <w:t>-IDF</w:t>
+      </w:r>
+      <w:proofErr w:type="gramStart"/>
+      <w:r>
+        <w:t>α(</w:t>
+      </w:r>
+      <w:proofErr w:type="gramEnd"/>
+      <w:r>
+        <w:t>0.27)</w:t>
       </w:r>
       <w:r>
         <w:t xml:space="preserve"> #153, </w:t>
@@ -7867,31 +8067,144 @@
       </w:pPr>
       <w:r>
         <w:lastRenderedPageBreak/>
-        <w:t xml:space="preserve">Le repère du premier hapax permet d’obtenir un seuil de pertinence, dans une liste de mots-clés, qui est le même pour toutes les formules ; notamment celles qui n’en ont pas, comme les familles IDF, contrairement aux </w:t>
-      </w:r>
-      <w:r>
-        <w:t>tests statistiques 2×2</w:t>
-      </w:r>
-      <w:r>
-        <w:t xml:space="preserve"> (</w:t>
-      </w:r>
-      <w:r>
-        <w:t xml:space="preserve">χ², </w:t>
-      </w:r>
-      <w:r>
-        <w:rPr>
-          <w:bCs/>
-        </w:rPr>
-        <w:t>G²,</w:t>
-      </w:r>
-      <w:r>
-        <w:t xml:space="preserve"> Fisher </w:t>
-      </w:r>
-      <w:r>
-        <w:t>=</w:t>
-      </w:r>
-      <w:r>
-        <w:t>TXM)</w:t>
+        <w:t xml:space="preserve">La couche de mots-clés significatifs pour </w:t>
+      </w:r>
+      <w:r>
+        <w:t>G²</w:t>
+      </w:r>
+      <w:r>
+        <w:t xml:space="preserve"> et </w:t>
+      </w:r>
+      <w:r>
+        <w:t>TXM</w:t>
+      </w:r>
+      <w:r>
+        <w:t xml:space="preserve"> semble moins épaisse que </w:t>
+      </w:r>
+      <w:proofErr w:type="spellStart"/>
+      <w:r>
+        <w:t>SimpleMaths</w:t>
+      </w:r>
+      <w:proofErr w:type="spellEnd"/>
+      <w:r>
+        <w:t xml:space="preserve">, </w:t>
+      </w:r>
+      <w:proofErr w:type="spellStart"/>
+      <w:r>
+        <w:t>subTF</w:t>
+      </w:r>
+      <w:proofErr w:type="spellEnd"/>
+      <w:r>
+        <w:t>-IDFα</w:t>
+      </w:r>
+      <w:r>
+        <w:t xml:space="preserve">, ou LRC+. </w:t>
+      </w:r>
+      <w:r>
+        <w:t>Reste à assurer la qualité de ces termes, déprécier les hapax n’assure pas que les rangs supérieurs soient de bonne qualité.</w:t>
+      </w:r>
+    </w:p>
+    <w:p>
+      <w:pPr>
+        <w:pStyle w:val="Heading2"/>
+      </w:pPr>
+      <w:r>
+        <w:t>§</w:t>
+      </w:r>
+      <w:r>
+        <w:t>10</w:t>
+      </w:r>
+      <w:r>
+        <w:t xml:space="preserve">. </w:t>
+      </w:r>
+      <w:r>
+        <w:t>Hautes fréquences</w:t>
+      </w:r>
+    </w:p>
+    <w:p>
+      <w:pPr>
+        <w:ind w:firstLine="0"/>
+      </w:pPr>
+      <w:r>
+        <w:t>Comparons</w:t>
+      </w:r>
+      <w:r>
+        <w:t xml:space="preserve"> maintenant</w:t>
+      </w:r>
+      <w:r>
+        <w:t xml:space="preserve"> les formules de spécificités sur les hautes fréquences. </w:t>
+      </w:r>
+      <w:r>
+        <w:t>Soi</w:t>
+      </w:r>
+      <w:r>
+        <w:t>ent plus de 7000</w:t>
+      </w:r>
+      <w:r>
+        <w:t xml:space="preserve"> chapitres de romans avec les mots grammaticaux</w:t>
+      </w:r>
+      <w:r>
+        <w:t>. D</w:t>
+      </w:r>
+      <w:r>
+        <w:t>es listes de mots-clés sont ordonnés par différentes formules, observons le ran</w:t>
+      </w:r>
+      <w:r>
+        <w:t>g</w:t>
+      </w:r>
+      <w:r>
+        <w:t xml:space="preserve"> </w:t>
+      </w:r>
+      <w:r>
+        <w:t>médian</w:t>
+      </w:r>
+      <w:r>
+        <w:t xml:space="preserve"> de mots très fréquents comme </w:t>
+      </w:r>
+      <w:r>
+        <w:rPr>
+          <w:i/>
+          <w:iCs/>
+        </w:rPr>
+        <w:t>le, de, un, être, et, que…</w:t>
+      </w:r>
+      <w:r>
+        <w:t xml:space="preserve"> ; mais aussi plus bas dans la liste comme : </w:t>
+      </w:r>
+      <w:r>
+        <w:rPr>
+          <w:i/>
+          <w:iCs/>
+        </w:rPr>
+        <w:t>dire, voir, aller, savoir, venir…</w:t>
+      </w:r>
+    </w:p>
+    <w:p>
+      <w:pPr>
+        <w:ind w:firstLine="0"/>
+      </w:pPr>
+    </w:p>
+    <w:p>
+      <w:pPr>
+        <w:ind w:firstLine="0"/>
+      </w:pPr>
+      <w:r>
+        <w:t xml:space="preserve">Graphique 4. Rang </w:t>
+      </w:r>
+      <w:r>
+        <w:t>médian</w:t>
+      </w:r>
+      <w:r>
+        <w:t xml:space="preserve"> </w:t>
+      </w:r>
+      <w:r>
+        <w:t xml:space="preserve">des mots les plus fréquents avec </w:t>
+      </w:r>
+      <w:r>
+        <w:t>« boîte à moustache</w:t>
+      </w:r>
+      <w:r>
+        <w:t>s »</w:t>
       </w:r>
       <w:r>
         <w:t>.</w:t>
@@ -7899,2802 +8212,12 @@
     </w:p>
     <w:p>
       <w:pPr>
-        <w:ind w:firstLine="708"/>
-      </w:pPr>
-      <w:r>
-        <w:t xml:space="preserve">La couche de mots-clés significatifs pour </w:t>
-      </w:r>
-      <w:r>
-        <w:t>G²</w:t>
-      </w:r>
-      <w:r>
-        <w:t xml:space="preserve"> et </w:t>
-      </w:r>
-      <w:r>
-        <w:t>TXM</w:t>
-      </w:r>
-      <w:r>
-        <w:t xml:space="preserve"> semble moins épaisse que </w:t>
-      </w:r>
-      <w:proofErr w:type="spellStart"/>
-      <w:r>
-        <w:t>SimpleMaths</w:t>
-      </w:r>
-      <w:proofErr w:type="spellEnd"/>
-      <w:r>
-        <w:t xml:space="preserve">, </w:t>
-      </w:r>
-      <w:proofErr w:type="spellStart"/>
-      <w:r>
-        <w:t>subTF</w:t>
-      </w:r>
-      <w:proofErr w:type="spellEnd"/>
-      <w:r>
-        <w:t>-IDFα</w:t>
-      </w:r>
-      <w:r>
-        <w:t xml:space="preserve">, ou LRC+. </w:t>
-      </w:r>
-      <w:r>
-        <w:t>Reste à assurer la qualité de ces termes, déprécier les hapax n’assure pas que les rangs supérieurs soient de bonne qualité.</w:t>
-      </w:r>
-    </w:p>
-    <w:p>
-      <w:pPr>
-        <w:pStyle w:val="Heading2"/>
-      </w:pPr>
-      <w:r>
-        <w:t>§</w:t>
-      </w:r>
-      <w:r>
-        <w:t>10</w:t>
-      </w:r>
-      <w:r>
-        <w:t xml:space="preserve">. </w:t>
-      </w:r>
-      <w:r>
-        <w:t>Hautes fréquences</w:t>
-      </w:r>
-    </w:p>
-    <w:p/>
-    <w:p>
-      <w:pPr>
         <w:ind w:firstLine="0"/>
       </w:pPr>
       <w:r>
-        <w:t>Soumettons maintenant ces listes de mots-clés à une expérience d’agrégation. Essayons d’extraire les mots saillants d’un auteur avec l’hypothèse que ce seraient des mots souvent saillants dans ses chapitres.</w:t>
-      </w:r>
-      <w:r>
-        <w:t xml:space="preserve"> Afin de pouvoir interpréter le résultat, on appliquera une mesure élémentaire, la moyenne du rang d’un mot lorsqu’il est présent dans une liste de mots-clés — l’absence n’est pas considérée comme une information pour ce corpus, que </w:t>
-      </w:r>
-      <w:r>
-        <w:rPr>
-          <w:i/>
-          <w:iCs/>
-        </w:rPr>
-        <w:t>De la Terre à La Lune</w:t>
-      </w:r>
-      <w:r>
-        <w:t xml:space="preserve"> ne parle pas de mer ou d’île n’est pas un défaut.</w:t>
-      </w:r>
-    </w:p>
-    <w:p>
-      <w:pPr>
-        <w:ind w:firstLine="0"/>
-      </w:pPr>
-      <w:r>
-        <w:t xml:space="preserve"> Si l’on veut 100 mots-clés pour un auteur, il faut en générer plus par chapitre, pour ne pas cacher des mots qui seraient relativement peu significatifs pour un chapitre mais beaucoup plus pour le reste de l’œuvre.</w:t>
-      </w:r>
-      <w:r>
-        <w:t xml:space="preserve"> </w:t>
-      </w:r>
-      <w:r>
-        <w:t>Afin de ne pa</w:t>
-      </w:r>
-      <w:r>
-        <w:t>s</w:t>
-      </w:r>
-      <w:r>
-        <w:t xml:space="preserve"> limiter par avance les résultats</w:t>
-      </w:r>
-      <w:r>
-        <w:t>, on génèrera tous les mots clés pour plusieurs formules. L’agrégation appliquera une formule élémentaire dont on comprendra bien les résultats, simplement une moyenne des rangs pour les mots présents.</w:t>
-      </w:r>
-    </w:p>
-    <w:p>
-      <w:pPr>
-        <w:ind w:firstLine="0"/>
-      </w:pPr>
-    </w:p>
-    <w:p>
-      <w:pPr>
-        <w:ind w:firstLine="0"/>
-      </w:pPr>
-      <w:r>
-        <w:t xml:space="preserve">L’expérience consiste à </w:t>
-      </w:r>
-      <w:r>
-        <w:t xml:space="preserve">générer </w:t>
-      </w:r>
-      <w:r>
-        <w:t>ordonner une liste de mots-clés par auteur selon la moyenne de leur rang dans chaque chapitre. Quelle formule est la plus propre à relever les mots thématiques d’une œuvre ?</w:t>
-      </w:r>
-    </w:p>
-    <w:p>
-      <w:pPr>
-        <w:ind w:firstLine="708"/>
-      </w:pPr>
-      <w:r>
-        <w:t xml:space="preserve">Les mots grammaticaux ont été conservés dans </w:t>
-      </w:r>
-      <w:r>
-        <w:t>cette expérience parce qu’ils sont facilement reconnaissables.</w:t>
-      </w:r>
-    </w:p>
-    <w:p>
-      <w:pPr>
-        <w:ind w:firstLine="0"/>
-      </w:pPr>
-    </w:p>
-    <w:p>
-      <w:pPr>
-        <w:ind w:firstLine="0"/>
-        <w:rPr>
-          <w:b/>
-          <w:bCs/>
-        </w:rPr>
-      </w:pPr>
-      <w:r>
-        <w:rPr>
-          <w:b/>
-          <w:bCs/>
-        </w:rPr>
-        <w:t>Jules Verne</w:t>
-      </w:r>
-    </w:p>
-    <w:p>
-      <w:pPr>
-        <w:ind w:firstLine="0"/>
-      </w:pPr>
-    </w:p>
-    <w:p>
-      <w:pPr>
-        <w:ind w:firstLine="0"/>
-      </w:pPr>
-    </w:p>
-    <w:p>
-      <w:pPr>
-        <w:pStyle w:val="keywords"/>
-      </w:pPr>
-      <w:r>
-        <w:t xml:space="preserve">TXM : je, nous, </w:t>
-      </w:r>
-      <w:r>
-        <w:rPr>
-          <w:b/>
-          <w:bCs/>
-        </w:rPr>
-        <w:t>capitaine</w:t>
-      </w:r>
-      <w:r>
-        <w:t xml:space="preserve">, vous, me, monsieur, mon, </w:t>
-      </w:r>
-      <w:r>
-        <w:rPr>
-          <w:b/>
-          <w:bCs/>
-        </w:rPr>
-        <w:t>île</w:t>
-      </w:r>
-      <w:r>
-        <w:t xml:space="preserve">, il, </w:t>
-      </w:r>
-      <w:r>
-        <w:rPr>
-          <w:b/>
-          <w:bCs/>
-        </w:rPr>
-        <w:t>docteur</w:t>
-      </w:r>
-      <w:r>
-        <w:t xml:space="preserve">, elle, le, ils, </w:t>
-      </w:r>
-      <w:r>
-        <w:rPr>
-          <w:b/>
-          <w:bCs/>
-        </w:rPr>
-        <w:t>mer</w:t>
-      </w:r>
-      <w:r>
-        <w:t>, son…</w:t>
-      </w:r>
-    </w:p>
-    <w:p>
-      <w:pPr>
-        <w:pStyle w:val="keywords"/>
-      </w:pPr>
-      <w:r>
-        <w:t xml:space="preserve">G² : je, nous, vous, il, le, me, </w:t>
-      </w:r>
-      <w:r>
-        <w:rPr>
-          <w:b/>
-          <w:bCs/>
-        </w:rPr>
-        <w:t>capitaine</w:t>
-      </w:r>
-      <w:r>
-        <w:t xml:space="preserve">, mon, son, un, elle, ils, monsieur, avoir, </w:t>
-      </w:r>
-      <w:r>
-        <w:rPr>
-          <w:b/>
-          <w:bCs/>
-        </w:rPr>
-        <w:t>île</w:t>
-      </w:r>
-      <w:r>
-        <w:t>…</w:t>
-      </w:r>
-    </w:p>
-    <w:p>
-      <w:pPr>
-        <w:ind w:firstLine="0"/>
-      </w:pPr>
-      <w:r>
-        <w:t xml:space="preserve">SimpleMaths : </w:t>
-      </w:r>
-      <w:r>
-        <w:t>docteur, M., John, Jean, oncle, ingénieur, capitaine, lieutenant, île, professeur</w:t>
-      </w:r>
-    </w:p>
-    <w:p>
-      <w:pPr>
-        <w:ind w:firstLine="0"/>
-      </w:pPr>
-    </w:p>
-    <w:p>
-      <w:pPr>
-        <w:ind w:firstLine="708"/>
-      </w:pPr>
-      <w:r>
-        <w:t xml:space="preserve">Première surprise désagréable, TXM ne se sort pas bien de cette épreuve. Comme on pouvait le craindre à la lecture du graphique 5, beaucoup de mots grammaticaux relevés dans cette liste sont fortement variables mais peu sémantiques, notamment : </w:t>
-      </w:r>
-      <w:r>
-        <w:rPr>
-          <w:i/>
-          <w:iCs/>
-        </w:rPr>
-        <w:t>il, le, ils, son</w:t>
-      </w:r>
-      <w:r>
-        <w:t>… Le G² est encore moins discriminant, ce qui établit que le coût de calcul du test hypergéométrique a un réel apport sémantique.</w:t>
-      </w:r>
-    </w:p>
-    <w:p>
-      <w:pPr>
-        <w:ind w:firstLine="708"/>
-      </w:pPr>
-      <w:r>
-        <w:t>Le χ² semble se sortir mieux de cette épreuve, car sa tendance à promouvoir les hapax est ici annulée par l’effet de la moyenne entre les chapitres, tandis que sa tendance à manquer les hautes fréquences évite de nombreux mots grammaticaux. Le même effet peut être obtenu avec un test hypergéométrique paramétrable poussé vers la spécificité, HGTα(2). Comme pour le χ² naturel, les mots grammaticaux les moins significatifs s’effacent. Mais ce ne sont que des ruses qui ne font que cacher les limites intrinsèques des formules.</w:t>
-      </w:r>
-    </w:p>
-    <w:p>
-      <w:pPr>
-        <w:ind w:firstLine="708"/>
-      </w:pPr>
-      <w:r>
-        <w:t>Voyons maintenant la famille TF-IDF.</w:t>
-      </w:r>
-    </w:p>
-    <w:p>
-      <w:pPr>
-        <w:ind w:firstLine="0"/>
-      </w:pPr>
-    </w:p>
-    <w:p>
-      <w:pPr>
-        <w:pStyle w:val="keywords"/>
-      </w:pPr>
-      <w:r>
-        <w:t xml:space="preserve">TF-IDF : </w:t>
-      </w:r>
-      <w:r>
-        <w:rPr>
-          <w:b/>
-          <w:bCs/>
-        </w:rPr>
-        <w:t>capitaine</w:t>
-      </w:r>
-      <w:r>
-        <w:t xml:space="preserve">, </w:t>
-      </w:r>
-      <w:r>
-        <w:rPr>
-          <w:b/>
-          <w:bCs/>
-        </w:rPr>
-        <w:t>île</w:t>
-      </w:r>
-      <w:r>
-        <w:t xml:space="preserve">, </w:t>
-      </w:r>
-      <w:r>
-        <w:rPr>
-          <w:b/>
-          <w:bCs/>
-        </w:rPr>
-        <w:t>docteur</w:t>
-      </w:r>
-      <w:r>
-        <w:t xml:space="preserve">, monsieur, ingénieur, </w:t>
-      </w:r>
-      <w:r>
-        <w:rPr>
-          <w:b/>
-          <w:bCs/>
-        </w:rPr>
-        <w:t>tu</w:t>
-      </w:r>
-      <w:r>
-        <w:t>, fille, lieutenant, madame, navire, équipage, oncle, mètre, frère, fleuve…</w:t>
-      </w:r>
-    </w:p>
-    <w:p>
-      <w:pPr>
-        <w:pStyle w:val="keywords"/>
-      </w:pPr>
-      <w:r>
-        <w:t xml:space="preserve">subTF-IDF : </w:t>
-      </w:r>
-      <w:r>
-        <w:rPr>
-          <w:b/>
-          <w:bCs/>
-        </w:rPr>
-        <w:t>docteur</w:t>
-      </w:r>
-      <w:r>
-        <w:t>, comte, oncle, lieutenant, major, goélette, colonel, sergent, professeur, brick, madame, miss, pirogue, rio, glace…</w:t>
-      </w:r>
-    </w:p>
-    <w:p>
-      <w:pPr>
-        <w:pStyle w:val="keywords"/>
-      </w:pPr>
-      <w:r>
-        <w:t xml:space="preserve">subTF-IDFα(0.3) : </w:t>
-      </w:r>
-      <w:r>
-        <w:rPr>
-          <w:b/>
-          <w:bCs/>
-        </w:rPr>
-        <w:t>capitaine</w:t>
-      </w:r>
-      <w:r>
-        <w:t xml:space="preserve">, </w:t>
-      </w:r>
-      <w:r>
-        <w:rPr>
-          <w:b/>
-          <w:bCs/>
-        </w:rPr>
-        <w:t>île</w:t>
-      </w:r>
-      <w:r>
-        <w:t xml:space="preserve">, monsieur, </w:t>
-      </w:r>
-      <w:r>
-        <w:rPr>
-          <w:b/>
-          <w:bCs/>
-        </w:rPr>
-        <w:t>vous</w:t>
-      </w:r>
-      <w:r>
-        <w:t xml:space="preserve">, mer, </w:t>
-      </w:r>
-      <w:r>
-        <w:rPr>
-          <w:b/>
-          <w:bCs/>
-        </w:rPr>
-        <w:t>tu</w:t>
-      </w:r>
-      <w:r>
-        <w:t xml:space="preserve">, jeune, </w:t>
-      </w:r>
-      <w:r>
-        <w:rPr>
-          <w:b/>
-          <w:bCs/>
-        </w:rPr>
-        <w:t>me</w:t>
-      </w:r>
-      <w:r>
-        <w:t xml:space="preserve">, navire, </w:t>
-      </w:r>
-      <w:r>
-        <w:rPr>
-          <w:b/>
-          <w:bCs/>
-        </w:rPr>
-        <w:t>docteur</w:t>
-      </w:r>
-      <w:r>
-        <w:t>, fille, ville, équipage, mètre, ingénieur…</w:t>
-      </w:r>
-    </w:p>
-    <w:p>
-      <w:pPr>
-        <w:ind w:firstLine="0"/>
-      </w:pPr>
-    </w:p>
-    <w:p>
-      <w:pPr>
-        <w:ind w:firstLine="0"/>
-      </w:pPr>
-      <w:r>
-        <w:t>Les TF-IDF s’en sortent décidément beaucoup mieux. Le subTF-IDF natif, dont nous avons vu en §5 qu’il avait une tendance aux termes rares, peut être réglé vers les mots thématiques dans sa version paramétrable subTF-IDFα(0.3). La dispersion dans les documents (</w:t>
-      </w:r>
-      <w:r>
-        <w:rPr>
-          <w:i/>
-          <w:iCs/>
-        </w:rPr>
-        <w:t>df</w:t>
-      </w:r>
-      <w:r>
-        <w:t>) est décidément une information sémantique que ne peuvent pas retrouver les meilleurs tests statistiques</w:t>
-      </w:r>
-      <w:r>
-        <w:t>. Ce résultat est à retenir.</w:t>
-      </w:r>
-    </w:p>
-    <w:p>
-      <w:pPr>
-        <w:ind w:firstLine="0"/>
-      </w:pPr>
-    </w:p>
-    <w:p>
-      <w:pPr>
-        <w:ind w:firstLine="0"/>
-        <w:rPr>
-          <w:b/>
-          <w:bCs/>
-        </w:rPr>
-      </w:pPr>
-      <w:r>
-        <w:rPr>
-          <w:b/>
-          <w:bCs/>
-          <w:i/>
-          <w:iCs/>
-        </w:rPr>
-        <w:t>Les Rougon-Macquart</w:t>
-      </w:r>
-    </w:p>
-    <w:p>
-      <w:pPr>
-        <w:ind w:firstLine="0"/>
-      </w:pPr>
-    </w:p>
-    <w:p>
-      <w:pPr>
-        <w:ind w:firstLine="0"/>
-      </w:pPr>
-      <w:r>
-        <w:t xml:space="preserve">Considérons maintenant </w:t>
-      </w:r>
-      <w:r>
-        <w:rPr>
-          <w:i/>
-          <w:iCs/>
-        </w:rPr>
-        <w:t>Les Rougon-Macquart</w:t>
-      </w:r>
-      <w:r>
-        <w:t xml:space="preserve">, sans les mots grammaticaux, pour rendre justice à TXM. Chaque roman de Zola y a une thématique forte, les deux plus gros sont : </w:t>
-      </w:r>
-      <w:r>
-        <w:rPr>
-          <w:i/>
-          <w:iCs/>
-        </w:rPr>
-        <w:t>La Débâcle</w:t>
-      </w:r>
-      <w:r>
-        <w:t xml:space="preserve">, qui raconte la défaite de 1870 et la Commune ; et </w:t>
-      </w:r>
-      <w:r>
-        <w:rPr>
-          <w:i/>
-          <w:iCs/>
-        </w:rPr>
-        <w:t>Germinal</w:t>
-      </w:r>
-      <w:r>
-        <w:t>, qui se passe dans les mines du Nord-Pas-de-Calais.</w:t>
-      </w:r>
-    </w:p>
-    <w:p>
-      <w:pPr>
-        <w:ind w:firstLine="0"/>
-      </w:pPr>
-    </w:p>
-    <w:p>
-      <w:pPr>
-        <w:pStyle w:val="keywords"/>
-      </w:pPr>
-      <w:r>
-        <w:t xml:space="preserve">TXM : madame, abbé, prêtre, docteur, curé, </w:t>
-      </w:r>
-      <w:r>
-        <w:rPr>
-          <w:b/>
-          <w:bCs/>
-        </w:rPr>
-        <w:t>franc</w:t>
-      </w:r>
-      <w:r>
-        <w:t xml:space="preserve">, jardin, mère, chambre, </w:t>
-      </w:r>
-      <w:r>
-        <w:rPr>
-          <w:b/>
-          <w:bCs/>
-        </w:rPr>
-        <w:t>fosse</w:t>
-      </w:r>
-      <w:r>
-        <w:t xml:space="preserve">, enfant, dame, salon, soldat, père, </w:t>
-      </w:r>
-      <w:r>
-        <w:rPr>
-          <w:b/>
-          <w:bCs/>
-        </w:rPr>
-        <w:t>dire</w:t>
-      </w:r>
-      <w:r>
-        <w:t>, aimer, église, maison, route…</w:t>
-      </w:r>
-    </w:p>
-    <w:p>
-      <w:pPr>
-        <w:pStyle w:val="keywords"/>
-      </w:pPr>
-      <w:r>
-        <w:t xml:space="preserve">G² : madame, abbé, prêtre, </w:t>
-      </w:r>
-      <w:r>
-        <w:rPr>
-          <w:b/>
-          <w:bCs/>
-        </w:rPr>
-        <w:t>dire</w:t>
-      </w:r>
-      <w:r>
-        <w:t xml:space="preserve">, docteur, </w:t>
-      </w:r>
-      <w:r>
-        <w:rPr>
-          <w:b/>
-          <w:bCs/>
-        </w:rPr>
-        <w:t>franc</w:t>
-      </w:r>
-      <w:r>
-        <w:t xml:space="preserve">, curé, femme, enfant, jardin, mère, chambre, </w:t>
-      </w:r>
-      <w:r>
-        <w:rPr>
-          <w:b/>
-          <w:bCs/>
-        </w:rPr>
-        <w:t>fosse</w:t>
-      </w:r>
-      <w:r>
-        <w:t>, soldat, fille, dame, salon, jeune, père, maison…</w:t>
-      </w:r>
-    </w:p>
-    <w:p>
-      <w:pPr>
-        <w:pStyle w:val="keywords"/>
-      </w:pPr>
-      <w:r>
-        <w:t xml:space="preserve">TF-IDFα(0.57) : madame, abbé, </w:t>
-      </w:r>
-      <w:r>
-        <w:rPr>
-          <w:b/>
-          <w:bCs/>
-        </w:rPr>
-        <w:t>franc</w:t>
-      </w:r>
-      <w:r>
-        <w:t>, docteur, prêtre, salon, père, chambre, femme, maison, mère, dame, mari, curé, argent, jardin, lit, maman, camarade, église…</w:t>
-      </w:r>
-    </w:p>
-    <w:p>
-      <w:pPr>
-        <w:pStyle w:val="keywords"/>
-      </w:pPr>
-      <w:r>
-        <w:t xml:space="preserve">TF-IDF : madame, abbé, docteur, prêtre, salon, </w:t>
-      </w:r>
-      <w:r>
-        <w:rPr>
-          <w:b/>
-          <w:bCs/>
-        </w:rPr>
-        <w:t>franc</w:t>
-      </w:r>
-      <w:r>
-        <w:t xml:space="preserve">, curé, </w:t>
-      </w:r>
-      <w:r>
-        <w:rPr>
-          <w:b/>
-          <w:bCs/>
-        </w:rPr>
-        <w:t>fosse</w:t>
-      </w:r>
-      <w:r>
-        <w:t xml:space="preserve">, soldat, maman, oncle, comte, </w:t>
-      </w:r>
-      <w:r>
-        <w:rPr>
-          <w:b/>
-          <w:bCs/>
-        </w:rPr>
-        <w:t>coron</w:t>
-      </w:r>
-      <w:r>
-        <w:t xml:space="preserve">, </w:t>
-      </w:r>
-      <w:r>
-        <w:rPr>
-          <w:b/>
-          <w:bCs/>
-        </w:rPr>
-        <w:t>mineur</w:t>
-      </w:r>
-      <w:r>
-        <w:t>, empereur, boutique, magasin, cousin, comptoir, quartier, président…</w:t>
-      </w:r>
-    </w:p>
-    <w:p>
-      <w:pPr>
-        <w:pStyle w:val="keywords"/>
-      </w:pPr>
-      <w:r>
-        <w:t xml:space="preserve">subTF-IDFα(0.2) : madame, abbé, </w:t>
-      </w:r>
-      <w:r>
-        <w:rPr>
-          <w:b/>
-          <w:bCs/>
-        </w:rPr>
-        <w:t>franc</w:t>
-      </w:r>
-      <w:r>
-        <w:t xml:space="preserve">, père, chambre, docteur, prêtre, salon, mère, maison, dame, mari, jardin, lit, </w:t>
-      </w:r>
-      <w:r>
-        <w:rPr>
-          <w:b/>
-          <w:bCs/>
-        </w:rPr>
-        <w:t>argent</w:t>
-      </w:r>
-      <w:r>
-        <w:t xml:space="preserve">, table, route, </w:t>
-      </w:r>
-      <w:r>
-        <w:rPr>
-          <w:b/>
-          <w:bCs/>
-        </w:rPr>
-        <w:t>sou</w:t>
-      </w:r>
-      <w:r>
-        <w:t>, curé, église…</w:t>
-      </w:r>
-    </w:p>
-    <w:p>
-      <w:pPr>
-        <w:pStyle w:val="keywords"/>
-      </w:pPr>
-      <w:r>
-        <w:t xml:space="preserve">subTF-IDFα(0.3) : madame, abbé, docteur, prêtre, salon, </w:t>
-      </w:r>
-      <w:r>
-        <w:rPr>
-          <w:b/>
-          <w:bCs/>
-        </w:rPr>
-        <w:t>franc</w:t>
-      </w:r>
-      <w:r>
-        <w:t xml:space="preserve">, curé, jardin, maman, </w:t>
-      </w:r>
-      <w:r>
-        <w:rPr>
-          <w:b/>
-          <w:bCs/>
-        </w:rPr>
-        <w:t>fosse</w:t>
-      </w:r>
-      <w:r>
-        <w:t>, église, oncle, soldat, camarade, route, dame, père, ouvrier, mari, frère…</w:t>
-      </w:r>
-    </w:p>
-    <w:p>
-      <w:pPr>
-        <w:pStyle w:val="keywords"/>
-      </w:pPr>
-      <w:r>
-        <w:t xml:space="preserve">subTF-IDF : abbé, </w:t>
-      </w:r>
-      <w:r>
-        <w:rPr>
-          <w:b/>
-          <w:bCs/>
-        </w:rPr>
-        <w:t>coron</w:t>
-      </w:r>
-      <w:r>
-        <w:t xml:space="preserve">, </w:t>
-      </w:r>
-      <w:r>
-        <w:rPr>
-          <w:b/>
-          <w:bCs/>
-        </w:rPr>
-        <w:t>mineur</w:t>
-      </w:r>
-      <w:r>
-        <w:t xml:space="preserve">, </w:t>
-      </w:r>
-      <w:r>
-        <w:rPr>
-          <w:b/>
-          <w:bCs/>
-        </w:rPr>
-        <w:t>fosse</w:t>
-      </w:r>
-      <w:r>
-        <w:t xml:space="preserve">, curé, docteur, prêtre, </w:t>
-      </w:r>
-      <w:r>
-        <w:rPr>
-          <w:b/>
-          <w:bCs/>
-        </w:rPr>
-        <w:t>grève</w:t>
-      </w:r>
-      <w:r>
-        <w:t xml:space="preserve">, colonel, comte, autel, </w:t>
-      </w:r>
-      <w:r>
-        <w:rPr>
-          <w:b/>
-          <w:bCs/>
-        </w:rPr>
-        <w:t>berline</w:t>
-      </w:r>
-      <w:r>
-        <w:t xml:space="preserve">, </w:t>
-      </w:r>
-      <w:r>
-        <w:rPr>
-          <w:b/>
-          <w:bCs/>
-        </w:rPr>
-        <w:t>porion</w:t>
-      </w:r>
-      <w:r>
-        <w:t>, vendeur, piano, sous-préfecture, obus, président, baron, peintre</w:t>
-      </w:r>
-    </w:p>
-    <w:p>
-      <w:pPr>
-        <w:ind w:firstLine="0"/>
-      </w:pPr>
-    </w:p>
-    <w:p>
-      <w:pPr>
-        <w:ind w:firstLine="0"/>
-      </w:pPr>
-      <w:r>
-        <w:t>TXM et G² laissent passer des mots qui ne sont pas thématiques (</w:t>
-      </w:r>
-      <w:r>
-        <w:rPr>
-          <w:i/>
-          <w:iCs/>
-        </w:rPr>
-        <w:t>dire</w:t>
-      </w:r>
-      <w:r>
-        <w:t xml:space="preserve">). SubTF-IDF s’enfonce trop rapidement dans la spécificité, si bien qu’il déprécie le </w:t>
-      </w:r>
-      <w:r>
-        <w:rPr>
-          <w:i/>
-          <w:iCs/>
-        </w:rPr>
-        <w:t>franc</w:t>
-      </w:r>
-      <w:r>
-        <w:t xml:space="preserve">. Si Verne parle surtout de </w:t>
-      </w:r>
-      <w:r>
-        <w:rPr>
-          <w:i/>
-          <w:iCs/>
-        </w:rPr>
-        <w:t>mètres</w:t>
-      </w:r>
-      <w:r>
-        <w:t>, un romancier réaliste parle d’argent.</w:t>
-      </w:r>
-    </w:p>
-    <w:p>
-      <w:pPr>
-        <w:ind w:firstLine="708"/>
-      </w:pPr>
-      <w:r>
-        <w:t xml:space="preserve">SubTF-IDF a aussi tendance à relever plus de mots de </w:t>
-      </w:r>
-      <w:r>
-        <w:rPr>
-          <w:i/>
-          <w:iCs/>
-        </w:rPr>
-        <w:t>Germinal</w:t>
-      </w:r>
-      <w:r>
-        <w:t xml:space="preserve"> et de </w:t>
-      </w:r>
-      <w:r>
-        <w:rPr>
-          <w:i/>
-          <w:iCs/>
-        </w:rPr>
-        <w:t>La Débâcle</w:t>
-      </w:r>
-      <w:r>
-        <w:t xml:space="preserve"> que les autres listes. Avec TF-IDFα(0.57) ou subTF-IDFα(0.2), on voit l’intérêt d’une formule réglable pour ajuster la généralité au corpus.</w:t>
-      </w:r>
-    </w:p>
-    <w:p>
-      <w:pPr>
-        <w:ind w:firstLine="708"/>
-      </w:pPr>
-      <w:r>
-        <w:t xml:space="preserve">Ces simples listes confirment aussi que la religion chez Zola ne se cantonne pas au thème d’un seul roman comme </w:t>
-      </w:r>
-      <w:r>
-        <w:rPr>
-          <w:i/>
-          <w:iCs/>
-        </w:rPr>
-        <w:t>L’abbé Mouret</w:t>
-      </w:r>
-      <w:r>
-        <w:t xml:space="preserve">, l’opposition entre le </w:t>
-      </w:r>
-      <w:r>
-        <w:rPr>
-          <w:i/>
-          <w:iCs/>
-        </w:rPr>
-        <w:t>prêtre</w:t>
-      </w:r>
-      <w:r>
-        <w:t xml:space="preserve"> et le </w:t>
-      </w:r>
-      <w:r>
-        <w:rPr>
-          <w:i/>
-          <w:iCs/>
-        </w:rPr>
-        <w:t>docteur</w:t>
-      </w:r>
-      <w:r>
-        <w:t xml:space="preserve"> traverse de nombreux chapitres de l’œuvre.</w:t>
-      </w:r>
-    </w:p>
-    <w:p>
-      <w:pPr>
-        <w:ind w:firstLine="0"/>
-      </w:pPr>
-    </w:p>
-    <w:p>
-      <w:pPr>
-        <w:ind w:firstLine="0"/>
-        <w:rPr>
-          <w:b/>
-          <w:bCs/>
-        </w:rPr>
-      </w:pPr>
-      <w:r>
-        <w:rPr>
-          <w:b/>
-          <w:bCs/>
-        </w:rPr>
-        <w:lastRenderedPageBreak/>
-        <w:t>Balzac</w:t>
-      </w:r>
-    </w:p>
-    <w:p>
-      <w:pPr>
-        <w:ind w:firstLine="0"/>
-      </w:pPr>
-    </w:p>
-    <w:p>
-      <w:pPr>
-        <w:ind w:firstLine="0"/>
-      </w:pPr>
-      <w:r>
-        <w:t xml:space="preserve">Balzac, dans l’édition reprise, se divise en 311 chapitres de taille très différentes, moins que Zola pour deux fois plus de mots, mais l’unité de thème nous montre la grande affaire de </w:t>
-      </w:r>
-      <w:r>
-        <w:rPr>
-          <w:i/>
-          <w:iCs/>
-        </w:rPr>
-        <w:t>La comédie humaine</w:t>
-      </w:r>
-      <w:r>
-        <w:t> : l’argent et le mariage, inextricablement liés dans la société bourgeoise de l’époque.</w:t>
-      </w:r>
-      <w:r>
-        <w:t xml:space="preserve"> Ce corpus confirme ce que nous savons déjà des formules.</w:t>
-      </w:r>
-    </w:p>
-    <w:p>
-      <w:pPr>
-        <w:ind w:firstLine="0"/>
-      </w:pPr>
-    </w:p>
-    <w:p>
-      <w:pPr>
-        <w:ind w:firstLine="0"/>
-      </w:pPr>
-      <w:r>
-        <w:t xml:space="preserve">TXM : </w:t>
-      </w:r>
-      <w:r>
-        <w:rPr>
-          <w:i/>
-          <w:iCs/>
-        </w:rPr>
-        <w:t xml:space="preserve">femme, mari, amour, madame, mère, comte, </w:t>
-      </w:r>
-      <w:r>
-        <w:rPr>
-          <w:b/>
-          <w:bCs/>
-          <w:i/>
-          <w:iCs/>
-        </w:rPr>
-        <w:t>franc</w:t>
-      </w:r>
-      <w:r>
-        <w:rPr>
-          <w:i/>
-          <w:iCs/>
-        </w:rPr>
-        <w:t xml:space="preserve">, </w:t>
-      </w:r>
-      <w:r>
-        <w:rPr>
-          <w:b/>
-          <w:bCs/>
-          <w:i/>
-          <w:iCs/>
-        </w:rPr>
-        <w:t>dire</w:t>
-      </w:r>
-      <w:r>
-        <w:rPr>
-          <w:i/>
-          <w:iCs/>
-        </w:rPr>
-        <w:t>, jeune, fille, conjugal, père, aimer, homme, vie, enfant, marquis, fils, mariage, bonheur</w:t>
-      </w:r>
-      <w:r>
-        <w:t>…</w:t>
-      </w:r>
-    </w:p>
-    <w:p>
-      <w:pPr>
-        <w:ind w:firstLine="0"/>
-      </w:pPr>
-      <w:r>
-        <w:t xml:space="preserve">G² : </w:t>
-      </w:r>
-      <w:r>
-        <w:rPr>
-          <w:i/>
-          <w:iCs/>
-        </w:rPr>
-        <w:t xml:space="preserve">femme, </w:t>
-      </w:r>
-      <w:r>
-        <w:rPr>
-          <w:b/>
-          <w:bCs/>
-          <w:i/>
-          <w:iCs/>
-        </w:rPr>
-        <w:t>dire</w:t>
-      </w:r>
-      <w:r>
-        <w:rPr>
-          <w:i/>
-          <w:iCs/>
-        </w:rPr>
-        <w:t xml:space="preserve">, madame, comte, </w:t>
-      </w:r>
-      <w:r>
-        <w:rPr>
-          <w:b/>
-          <w:bCs/>
-          <w:i/>
-          <w:iCs/>
-        </w:rPr>
-        <w:t>franc</w:t>
-      </w:r>
-      <w:r>
-        <w:rPr>
-          <w:i/>
-          <w:iCs/>
-        </w:rPr>
-        <w:t>, amour, mère, mari, fille, père, jeune, mademoiselle, marquis, homme, fils, aimer, baron, enfant, vie, âme</w:t>
-      </w:r>
-      <w:r>
-        <w:t>…</w:t>
-      </w:r>
-    </w:p>
-    <w:p>
-      <w:pPr>
-        <w:ind w:firstLine="0"/>
-      </w:pPr>
-      <w:r>
-        <w:t xml:space="preserve">TF-IDF : </w:t>
-      </w:r>
-      <w:r>
-        <w:rPr>
-          <w:b/>
-          <w:bCs/>
-          <w:i/>
-          <w:iCs/>
-        </w:rPr>
-        <w:t>franc</w:t>
-      </w:r>
-      <w:r>
-        <w:rPr>
-          <w:i/>
-          <w:iCs/>
-        </w:rPr>
-        <w:t>, madame, comte, mademoiselle, amour, marquis, père, reprendre, mère, abbé, fille, vieillard, écrier, fils, affaire, vieux, mari, baron, notaire, maison</w:t>
-      </w:r>
-      <w:r>
-        <w:t>…</w:t>
-      </w:r>
-    </w:p>
-    <w:p>
-      <w:pPr>
-        <w:ind w:firstLine="0"/>
-      </w:pPr>
-      <w:r>
-        <w:t xml:space="preserve">subTF-IDF(0.3) : </w:t>
-      </w:r>
-      <w:r>
-        <w:rPr>
-          <w:b/>
-          <w:bCs/>
-          <w:i/>
-          <w:iCs/>
-        </w:rPr>
-        <w:t>franc</w:t>
-      </w:r>
-      <w:r>
-        <w:rPr>
-          <w:i/>
-          <w:iCs/>
-        </w:rPr>
-        <w:t xml:space="preserve">, madame, comte, amour, père, mère, mademoiselle, mari, reprendre, fille, jeune, femme, écrier, vieux, marquis, fils, âme, maison, vieillard, </w:t>
-      </w:r>
-      <w:r>
-        <w:rPr>
-          <w:b/>
-          <w:bCs/>
-          <w:i/>
-          <w:iCs/>
-        </w:rPr>
-        <w:t>affaire</w:t>
-      </w:r>
-      <w:r>
-        <w:t>…</w:t>
-      </w:r>
-    </w:p>
-    <w:p>
-      <w:pPr>
-        <w:ind w:firstLine="0"/>
-      </w:pPr>
-    </w:p>
-    <w:p>
-      <w:pPr>
-        <w:ind w:firstLine="0"/>
-        <w:rPr>
-          <w:b/>
-          <w:bCs/>
-        </w:rPr>
-      </w:pPr>
-      <w:r>
-        <w:rPr>
-          <w:b/>
-          <w:bCs/>
-        </w:rPr>
-        <w:t>Dumas</w:t>
-      </w:r>
-    </w:p>
-    <w:p>
-      <w:pPr>
-        <w:ind w:firstLine="0"/>
-      </w:pPr>
-    </w:p>
-    <w:p>
-      <w:pPr>
-        <w:ind w:firstLine="0"/>
-      </w:pPr>
-      <w:r>
-        <w:t xml:space="preserve">Le sous-corpus Dumas est environ 4 fois plus gros que </w:t>
-      </w:r>
-      <w:r>
-        <w:rPr>
-          <w:i/>
-          <w:iCs/>
-        </w:rPr>
-        <w:t>Les Rougon-Macquart</w:t>
-      </w:r>
-      <w:r>
-        <w:t xml:space="preserve">, un roman ne suffira plus à faire surgir son vocabulaire, d’autant plus que le genre se préoccupe peu de réalisme, le vocabulaire est plus homogène sur l’œuvre. Les listes confirmeront ce que nous savions des formules, par exemple que le subTF-IDF naturel cache le </w:t>
-      </w:r>
-      <w:r>
-        <w:rPr>
-          <w:i/>
-          <w:iCs/>
-        </w:rPr>
-        <w:t>roi</w:t>
-      </w:r>
-      <w:r>
-        <w:t>, le pivot qui articule les très nombreux titres d’Ancien-Régime qui émaillent les chapitres.</w:t>
-      </w:r>
-    </w:p>
-    <w:p>
-      <w:pPr>
-        <w:ind w:firstLine="0"/>
-      </w:pPr>
-    </w:p>
-    <w:p>
-      <w:pPr>
-        <w:pStyle w:val="keywords"/>
-      </w:pPr>
-      <w:r>
-        <w:t xml:space="preserve">TXM : </w:t>
-      </w:r>
-      <w:r>
-        <w:rPr>
-          <w:b/>
-          <w:bCs/>
-        </w:rPr>
-        <w:t>roi</w:t>
-      </w:r>
-      <w:r>
-        <w:t xml:space="preserve">, </w:t>
-      </w:r>
-      <w:r>
-        <w:rPr>
-          <w:b/>
-          <w:bCs/>
-        </w:rPr>
-        <w:t>dire</w:t>
-      </w:r>
-      <w:r>
-        <w:t>, madame, comte, jeune, reine, fille, duc, prince, père, cheval, femme, lettre, aimer, enfant, mademoiselle, ami, mère, sire, homme…</w:t>
-      </w:r>
-    </w:p>
-    <w:p>
-      <w:pPr>
-        <w:pStyle w:val="keywords"/>
-      </w:pPr>
-      <w:r>
-        <w:t xml:space="preserve">G² : </w:t>
-      </w:r>
-      <w:r>
-        <w:rPr>
-          <w:b/>
-          <w:bCs/>
-        </w:rPr>
-        <w:t>dire</w:t>
-      </w:r>
-      <w:r>
-        <w:t xml:space="preserve">, </w:t>
-      </w:r>
-      <w:r>
-        <w:rPr>
-          <w:b/>
-          <w:bCs/>
-        </w:rPr>
-        <w:t>roi</w:t>
-      </w:r>
-      <w:r>
-        <w:t>, madame, comte, homme, reine, jeune, duc, fille, prince, père, cheval, femme, lettre, aimer, mademoiselle, enfant, sire, mère, monseigneur, cardinal…</w:t>
-      </w:r>
-    </w:p>
-    <w:p>
-      <w:pPr>
-        <w:pStyle w:val="keywords"/>
-      </w:pPr>
-      <w:r>
-        <w:t xml:space="preserve">TF-IDF : </w:t>
-      </w:r>
-      <w:r>
-        <w:rPr>
-          <w:b/>
-          <w:bCs/>
-        </w:rPr>
-        <w:t>roi</w:t>
-      </w:r>
-      <w:r>
-        <w:t>, madame, comte, reine, duc, prince, sire, mademoiselle, père, fille, monseigneur, cardinal, mère, lettre, cheval, chevalier, baron, général, capitaine, frère…</w:t>
-      </w:r>
-    </w:p>
-    <w:p>
-      <w:pPr>
-        <w:pStyle w:val="keywords"/>
-      </w:pPr>
-      <w:r>
-        <w:t xml:space="preserve">subTF-IDFα(0.3) : </w:t>
-      </w:r>
-      <w:r>
-        <w:rPr>
-          <w:b/>
-          <w:bCs/>
-        </w:rPr>
-        <w:t>roi</w:t>
-      </w:r>
-      <w:r>
-        <w:t>, madame, comte, fille, père, jeune, reine, femme, cheval, prince, duc, lettre, mademoiselle, mère, aimer, enfant, frère, amour, chambre, sire…</w:t>
-      </w:r>
-    </w:p>
-    <w:p>
-      <w:pPr>
-        <w:pStyle w:val="keywords"/>
-      </w:pPr>
-      <w:r>
-        <w:t>subTF-IDF : marquis, prince, baron, comte, grand-mère, abbé, tante, docteur, oncle, chanoine, lady, parrain, meunier, sir, duchesse, moine, chevalier, duc, maman, curé…</w:t>
-      </w:r>
-    </w:p>
-    <w:p>
-      <w:pPr>
-        <w:ind w:firstLine="0"/>
-      </w:pPr>
-    </w:p>
-    <w:p>
-      <w:pPr>
-        <w:ind w:firstLine="0"/>
-        <w:rPr>
-          <w:b/>
-          <w:bCs/>
-        </w:rPr>
-      </w:pPr>
-      <w:r>
-        <w:rPr>
-          <w:b/>
-          <w:bCs/>
-        </w:rPr>
-        <w:t>George Sand</w:t>
-      </w:r>
-    </w:p>
-    <w:p>
-      <w:pPr>
-        <w:ind w:firstLine="0"/>
-      </w:pPr>
-    </w:p>
-    <w:p>
-      <w:pPr>
-        <w:ind w:firstLine="0"/>
-      </w:pPr>
-      <w:r>
-        <w:t xml:space="preserve">George Sand est plus surprenante. La procédure de moyenne entre les mots-clés des chapitres ne dégage aucune thématique. Chaque chapitre, quel que soit le roman, a pourtant un thème qui se dégage fortement des mots-clés ; mais le vocabulaire partagé entre les chapitres est faiblement thématique, d’où cette abondance de titres de personnes. Est-ce que le thème ne serait pas plutôt porté par des verbes, comme </w:t>
-      </w:r>
-      <w:r>
-        <w:rPr>
-          <w:i/>
-          <w:iCs/>
-        </w:rPr>
-        <w:t>écrire</w:t>
-      </w:r>
-      <w:r>
-        <w:t xml:space="preserve"> et </w:t>
-      </w:r>
-      <w:r>
-        <w:rPr>
-          <w:i/>
-          <w:iCs/>
-        </w:rPr>
-        <w:t>chanter</w:t>
-      </w:r>
-      <w:r>
-        <w:t xml:space="preserve"> ? Plus bas dans le tableau on trouve aussi </w:t>
-      </w:r>
-      <w:r>
-        <w:rPr>
-          <w:i/>
-          <w:iCs/>
-        </w:rPr>
-        <w:t>musique</w:t>
-      </w:r>
-      <w:r>
-        <w:t xml:space="preserve"> et </w:t>
-      </w:r>
-      <w:r>
-        <w:rPr>
-          <w:i/>
-          <w:iCs/>
-        </w:rPr>
-        <w:t>danser</w:t>
-      </w:r>
-      <w:r>
-        <w:t>. Cela mériterait une étude stylistique dédiée par une personne plus spécialiste.</w:t>
-      </w:r>
-    </w:p>
-    <w:p>
-      <w:pPr>
-        <w:ind w:firstLine="0"/>
-      </w:pPr>
-    </w:p>
-    <w:p>
-      <w:pPr>
-        <w:ind w:firstLine="0"/>
-      </w:pPr>
-      <w:r>
-        <w:t xml:space="preserve">TXM : </w:t>
-      </w:r>
-      <w:r>
-        <w:rPr>
-          <w:b/>
-          <w:bCs/>
-          <w:i/>
-          <w:iCs/>
-        </w:rPr>
-        <w:t>dire</w:t>
-      </w:r>
-      <w:r>
-        <w:rPr>
-          <w:i/>
-          <w:iCs/>
-        </w:rPr>
-        <w:t xml:space="preserve">, père, marquis, madame, aimer, comte, mère, prince, amour, enfant, femme, fille, mademoiselle, frère, fils, sœur, cheval, lettre, </w:t>
-      </w:r>
-      <w:r>
-        <w:rPr>
-          <w:b/>
-          <w:bCs/>
-          <w:i/>
-          <w:iCs/>
-        </w:rPr>
-        <w:t>savoir</w:t>
-      </w:r>
-      <w:r>
-        <w:rPr>
-          <w:i/>
-          <w:iCs/>
-        </w:rPr>
-        <w:t>, jeune</w:t>
-      </w:r>
-      <w:r>
-        <w:t>…</w:t>
-      </w:r>
-    </w:p>
-    <w:p>
-      <w:pPr>
-        <w:ind w:firstLine="0"/>
-      </w:pPr>
-      <w:r>
-        <w:lastRenderedPageBreak/>
-        <w:t xml:space="preserve">G² : </w:t>
-      </w:r>
-      <w:r>
-        <w:rPr>
-          <w:b/>
-          <w:bCs/>
-          <w:i/>
-          <w:iCs/>
-        </w:rPr>
-        <w:t>dire</w:t>
-      </w:r>
-      <w:r>
-        <w:rPr>
-          <w:i/>
-          <w:iCs/>
-        </w:rPr>
-        <w:t xml:space="preserve">, père, marquis, madame, aimer, comte, mère, prince, amour, enfant, femme, fille, mademoiselle, frère, </w:t>
-      </w:r>
-      <w:r>
-        <w:rPr>
-          <w:b/>
-          <w:bCs/>
-          <w:i/>
-          <w:iCs/>
-        </w:rPr>
-        <w:t>savoir</w:t>
-      </w:r>
-      <w:r>
-        <w:rPr>
-          <w:i/>
-          <w:iCs/>
-        </w:rPr>
-        <w:t>, fils, sœur, cheval, lettre, jeune</w:t>
-      </w:r>
-      <w:r>
-        <w:t>…</w:t>
-      </w:r>
-    </w:p>
-    <w:p>
-      <w:pPr>
-        <w:ind w:firstLine="0"/>
-      </w:pPr>
-      <w:r>
-        <w:t xml:space="preserve">TF-IDF : </w:t>
-      </w:r>
-      <w:r>
-        <w:rPr>
-          <w:i/>
-          <w:iCs/>
-        </w:rPr>
-        <w:t xml:space="preserve">marquis, madame, comte, prince, mademoiselle, père, mère, baron, oncle, frère, sœur, tante, abbé, cousin, lettre, </w:t>
-      </w:r>
-      <w:r>
-        <w:rPr>
-          <w:b/>
-          <w:bCs/>
-          <w:i/>
-          <w:iCs/>
-        </w:rPr>
-        <w:t>chanter</w:t>
-      </w:r>
-      <w:r>
-        <w:rPr>
-          <w:i/>
-          <w:iCs/>
-        </w:rPr>
-        <w:t xml:space="preserve">, cheval, </w:t>
-      </w:r>
-      <w:r>
-        <w:rPr>
-          <w:b/>
-          <w:bCs/>
-          <w:i/>
-          <w:iCs/>
-        </w:rPr>
-        <w:t>artiste</w:t>
-      </w:r>
-      <w:r>
-        <w:rPr>
-          <w:i/>
-          <w:iCs/>
-        </w:rPr>
-        <w:t>, mariage, château</w:t>
-      </w:r>
-      <w:r>
-        <w:t>…</w:t>
-      </w:r>
-    </w:p>
-    <w:p>
-      <w:pPr>
-        <w:ind w:firstLine="0"/>
-      </w:pPr>
-      <w:r>
-        <w:t xml:space="preserve">subTF-IDF(0.3) : </w:t>
-      </w:r>
-      <w:r>
-        <w:rPr>
-          <w:i/>
-          <w:iCs/>
-        </w:rPr>
-        <w:t xml:space="preserve">madame, père, mère, marquis, fille, comte, mademoiselle, amour, frère, lettre, fils, prince, femme, sœur, cheval, mariage, château, mari, </w:t>
-      </w:r>
-      <w:r>
-        <w:rPr>
-          <w:b/>
-          <w:bCs/>
-          <w:i/>
-          <w:iCs/>
-        </w:rPr>
-        <w:t>écrire</w:t>
-      </w:r>
-      <w:r>
-        <w:rPr>
-          <w:i/>
-          <w:iCs/>
-        </w:rPr>
-        <w:t xml:space="preserve">, </w:t>
-      </w:r>
-      <w:r>
-        <w:rPr>
-          <w:b/>
-          <w:bCs/>
-          <w:i/>
-          <w:iCs/>
-        </w:rPr>
-        <w:t>aimer</w:t>
-      </w:r>
-      <w:r>
-        <w:rPr>
-          <w:i/>
-          <w:iCs/>
-        </w:rPr>
-        <w:t xml:space="preserve">, </w:t>
-      </w:r>
-      <w:r>
-        <w:rPr>
-          <w:b/>
-          <w:bCs/>
-          <w:i/>
-          <w:iCs/>
-        </w:rPr>
-        <w:t>chanter</w:t>
-      </w:r>
-      <w:r>
-        <w:t>…</w:t>
-      </w:r>
-    </w:p>
-    <w:p>
-      <w:pPr>
-        <w:ind w:firstLine="0"/>
-      </w:pPr>
-    </w:p>
-    <w:p>
-      <w:pPr>
-        <w:ind w:firstLine="0"/>
-        <w:rPr>
-          <w:b/>
-          <w:bCs/>
-        </w:rPr>
-      </w:pPr>
-      <w:r>
-        <w:rPr>
-          <w:b/>
-          <w:bCs/>
-        </w:rPr>
-        <w:t>Conclusions pour les spécificités</w:t>
-      </w:r>
-    </w:p>
-    <w:p>
-      <w:pPr>
-        <w:ind w:firstLine="0"/>
-      </w:pPr>
-    </w:p>
-    <w:p>
-      <w:pPr>
-        <w:ind w:firstLine="0"/>
-      </w:pPr>
-      <w:r>
-        <w:t xml:space="preserve">Des spécialistes de ces œuvres auraient évidemment des interprétations beaucoup plus profondes et précises. Cette section suggère qu’il est possible d’identifier les principaux thèmes d’un corpus en analysant les variations de vocabulaire entre les textes qui le composent, sans nécessairement les comparer à un corpus extérieur </w:t>
-      </w:r>
-      <w:r>
-        <w:t>nécessairement biaisé et daté</w:t>
-      </w:r>
-      <w:r>
-        <w:t>. La moyenne des rangs est une mesure élémentaire justifiée ici pour comparer les formules de spécificités, il est sans doute possible de trouver plus fin, mais ce n’est pas le sujet ici.</w:t>
-      </w:r>
-    </w:p>
-    <w:p>
-      <w:pPr>
-        <w:ind w:firstLine="708"/>
-      </w:pPr>
-      <w:r>
-        <w:t>Chacun de ces auteurs est un monde lexical avec sa cohérence qui met les formules à l’épreuve. Cette expérience justifie le corpus comme un excellent matériel de laboratoire, et confirme encore le besoin de pouvoir ajuster la focale de la lunette lexicale avec une formule paramétrable.</w:t>
-      </w:r>
-    </w:p>
-    <w:p>
-      <w:pPr>
-        <w:ind w:firstLine="708"/>
-      </w:pPr>
-      <w:r>
-        <w:t>Dans l’ensemble</w:t>
-      </w:r>
-      <w:r>
-        <w:t>,</w:t>
-      </w:r>
-      <w:r>
-        <w:t xml:space="preserve"> la moyenne des rangs sur des listes de mots clés par chapitres et par auteur montre que les test statistiques 2×2 ne suffisent pas toujours à écarter les mots grammaticaux insignifiants et aberrants. Ces exceptions ne gênent pas l’utilisateur à première vue sur un seul texte, mais ces formules ne sont pas assez robustes pour les agrégations. Ce test, jusqu’à preuve du contraire, semble donc établir que les TF-IDF pondèrent les hautes fréquences de manière plus sémantique.</w:t>
-      </w:r>
-    </w:p>
-    <w:p>
-      <w:pPr>
-        <w:pStyle w:val="Heading1"/>
-      </w:pPr>
-      <w:r>
-        <w:t>§</w:t>
-      </w:r>
-      <w:r>
-        <w:t>8</w:t>
-      </w:r>
-      <w:r>
-        <w:t xml:space="preserve">. </w:t>
-      </w:r>
-      <w:r>
-        <w:t>D</w:t>
-      </w:r>
-      <w:r>
-        <w:t>ans le ventre du croissant</w:t>
-      </w:r>
-      <w:r>
-        <w:t>, les hapax</w:t>
-      </w:r>
-    </w:p>
-    <w:p>
-      <w:pPr>
-        <w:ind w:firstLine="0"/>
-      </w:pPr>
-      <w:r>
-        <w:t>Sur</w:t>
-      </w:r>
-      <w:r>
-        <w:t xml:space="preserve"> la figure</w:t>
-      </w:r>
-      <w:r>
-        <w:t> 2</w:t>
-      </w:r>
-      <w:r>
-        <w:t>, l</w:t>
-      </w:r>
-      <w:r>
-        <w:t>’alignement</w:t>
-      </w:r>
-      <w:r>
-        <w:t xml:space="preserve"> de points</w:t>
-      </w:r>
-      <w:r>
-        <w:t xml:space="preserve"> au milieu du croissant n’est pas fortuit. Les valeurs d’</w:t>
-      </w:r>
-      <w:r>
-        <w:rPr>
-          <w:i/>
-          <w:iCs/>
-        </w:rPr>
-        <w:t>α</w:t>
-      </w:r>
-      <w:r>
-        <w:t xml:space="preserve"> </w:t>
-      </w:r>
-      <w:r>
-        <w:t>affichées</w:t>
-      </w:r>
-      <w:r>
-        <w:t xml:space="preserve"> ont été trouvées par </w:t>
-      </w:r>
-      <w:r>
-        <w:t>un calcul</w:t>
-      </w:r>
-      <w:r>
-        <w:t xml:space="preserve"> </w:t>
-      </w:r>
-      <w:r>
-        <w:t xml:space="preserve">cherchant une sorte de milieu pour chaque </w:t>
-      </w:r>
-      <w:r>
-        <w:t>formule paramétrable</w:t>
-      </w:r>
-      <w:r>
-        <w:t xml:space="preserve"> entre le</w:t>
-      </w:r>
-      <w:r>
-        <w:t>urs</w:t>
-      </w:r>
-      <w:r>
-        <w:t xml:space="preserve"> deux</w:t>
-      </w:r>
-      <w:r>
-        <w:t xml:space="preserve"> points de convergence </w:t>
-      </w:r>
-      <w:r>
-        <w:t>TF</w:t>
-      </w:r>
-      <w:r>
-        <w:t xml:space="preserve"> et </w:t>
-      </w:r>
-      <w:r>
-        <w:t>DF=1</w:t>
-      </w:r>
-      <w:r>
-        <w:t>.</w:t>
-      </w:r>
-      <w:r>
-        <w:t xml:space="preserve"> </w:t>
-      </w:r>
-      <w:r>
-        <w:t>La ligne affichée</w:t>
-      </w:r>
-      <w:r>
-        <w:t xml:space="preserve"> ne résult</w:t>
-      </w:r>
-      <w:r>
-        <w:t>ant</w:t>
-      </w:r>
-      <w:r>
-        <w:t xml:space="preserve"> pas d’une fonction a priori mais d’une</w:t>
-      </w:r>
-      <w:r>
-        <w:t xml:space="preserve"> comparaison multivariée</w:t>
-      </w:r>
-      <w:r>
-        <w:t xml:space="preserve"> réd</w:t>
-      </w:r>
-      <w:r>
-        <w:t>uite</w:t>
-      </w:r>
-      <w:r>
-        <w:t xml:space="preserve"> </w:t>
-      </w:r>
-      <w:r>
-        <w:rPr>
-          <w:i/>
-          <w:iCs/>
-        </w:rPr>
-        <w:t>PCoA</w:t>
-      </w:r>
-      <w:r>
-        <w:t xml:space="preserve">, son </w:t>
-      </w:r>
-      <w:r>
-        <w:t>équation</w:t>
-      </w:r>
-      <w:r>
-        <w:t xml:space="preserve"> ne peut être qu’une interpolation. Ce juste </w:t>
-      </w:r>
-      <w:r>
-        <w:rPr>
-          <w:i/>
-          <w:iCs/>
-        </w:rPr>
-        <w:t>α</w:t>
-      </w:r>
-      <w:r>
-        <w:t xml:space="preserve"> médian permet de comparer </w:t>
-      </w:r>
-      <w:r>
-        <w:t>avec plus d’impartialité</w:t>
-      </w:r>
-      <w:r>
-        <w:t xml:space="preserve"> </w:t>
-      </w:r>
-      <w:r>
-        <w:t>χ²</w:t>
-      </w:r>
-      <w:r>
-        <w:t xml:space="preserve">, </w:t>
-      </w:r>
-      <w:r>
-        <w:t>G²</w:t>
-      </w:r>
-      <w:r>
-        <w:t>,</w:t>
-      </w:r>
-      <w:r>
-        <w:t xml:space="preserve"> </w:t>
-      </w:r>
-      <w:r>
-        <w:t xml:space="preserve">HGT </w:t>
-      </w:r>
-      <w:r>
-        <w:t>(</w:t>
-      </w:r>
-      <w:r>
-        <w:rPr>
-          <w:rFonts w:ascii="Cambria Math" w:hAnsi="Cambria Math" w:cs="Cambria Math"/>
-        </w:rPr>
-        <w:t>≃</w:t>
-      </w:r>
-      <w:r>
-        <w:t>TXM</w:t>
-      </w:r>
-      <w:r>
-        <w:t>)</w:t>
-      </w:r>
-      <w:r>
-        <w:t xml:space="preserve">, </w:t>
-      </w:r>
-      <w:r>
-        <w:t>TF-</w:t>
-      </w:r>
-      <w:r>
-        <w:t>IDF, sub</w:t>
-      </w:r>
-      <w:r>
-        <w:t>TF-</w:t>
-      </w:r>
-      <w:r>
-        <w:t xml:space="preserve">IDF </w:t>
-      </w:r>
-      <w:r>
-        <w:t>en neutralisant</w:t>
-      </w:r>
-      <w:r>
-        <w:t xml:space="preserve"> </w:t>
-      </w:r>
-      <w:r>
-        <w:t>le</w:t>
-      </w:r>
-      <w:r>
-        <w:t xml:space="preserve"> biais</w:t>
-      </w:r>
-      <w:r>
-        <w:t xml:space="preserve"> d’exclusivité</w:t>
-      </w:r>
-      <w:r>
-        <w:t>.</w:t>
-      </w:r>
-      <w:r>
-        <w:t xml:space="preserve"> Ce ventre du croissant permet de les observer au mieux de leur divergence pour qualifier </w:t>
-      </w:r>
-      <w:r>
-        <w:t>leurs différences</w:t>
-      </w:r>
-      <w:r>
-        <w:t>.</w:t>
-      </w:r>
-    </w:p>
-    <w:p>
-      <w:pPr>
-        <w:ind w:firstLine="0"/>
-      </w:pPr>
-    </w:p>
-    <w:p>
-      <w:pPr>
-        <w:ind w:firstLine="0"/>
-      </w:pPr>
-      <w:r>
-        <w:t>Reconsidérons les</w:t>
-      </w:r>
-      <w:r>
-        <w:t xml:space="preserve"> mots-clés de la section §3, pour</w:t>
-      </w:r>
-      <w:r>
-        <w:t xml:space="preserve"> « Les poulpes » de</w:t>
-      </w:r>
-      <w:r>
-        <w:t xml:space="preserve"> </w:t>
-      </w:r>
-      <w:r>
-        <w:rPr>
-          <w:i/>
-          <w:iCs/>
-        </w:rPr>
-        <w:t>20 000 lieues sous les mers</w:t>
-      </w:r>
-      <w:r>
-        <w:t xml:space="preserve">, sans mots grammaticaux </w:t>
-      </w:r>
-      <w:r>
-        <w:t>ni</w:t>
-      </w:r>
-      <w:r>
-        <w:t xml:space="preserve"> noms propres</w:t>
-      </w:r>
-      <w:r>
-        <w:t>.</w:t>
-      </w:r>
-      <w:r>
-        <w:t xml:space="preserve"> </w:t>
-      </w:r>
-      <w:r>
-        <w:t>A</w:t>
-      </w:r>
-      <w:r>
-        <w:t xml:space="preserve">vec </w:t>
-      </w:r>
-      <w:r>
-        <w:t>d</w:t>
-      </w:r>
-      <w:r>
-        <w:t>es formules paramétrées</w:t>
-      </w:r>
-      <w:r>
-        <w:t xml:space="preserve"> ajustées, l</w:t>
-      </w:r>
-      <w:r>
-        <w:t>es têtes de listes sont maintenant très similaires</w:t>
-      </w:r>
-      <w:r>
-        <w:t>.</w:t>
-      </w:r>
-    </w:p>
-    <w:p>
-      <w:pPr>
-        <w:ind w:firstLine="0"/>
-      </w:pPr>
-    </w:p>
-    <w:p>
-      <w:pPr>
-        <w:pStyle w:val="keywords"/>
-      </w:pPr>
-      <w:r>
-        <w:t>sub</w:t>
-      </w:r>
-      <w:r>
-        <w:t>TF-</w:t>
-      </w:r>
-      <w:r>
-        <w:t>IDFα(</w:t>
-      </w:r>
-      <w:r>
-        <w:t>0.56</w:t>
-      </w:r>
-      <w:r>
-        <w:t>)</w:t>
-      </w:r>
-      <w:r>
-        <w:t> : poulpe, calmar, tentacule, céphalopode, ventouse, monstre, harpon, charnu, nageoire, bec</w:t>
-      </w:r>
-      <w:r>
-        <w:t>…</w:t>
-      </w:r>
-    </w:p>
-    <w:p>
-      <w:pPr>
-        <w:pStyle w:val="keywords"/>
-      </w:pPr>
-      <w:r>
-        <w:t>TF</w:t>
-      </w:r>
-      <w:r>
-        <w:noBreakHyphen/>
-        <w:t>IDFα(</w:t>
-      </w:r>
-      <w:r>
-        <w:t>1.14</w:t>
-      </w:r>
-      <w:r>
-        <w:t>)</w:t>
-      </w:r>
-      <w:r>
-        <w:t> : poulpe, calmar, tentacule, monstre, céphalopode, ventouse, harpon, bec, nageoire, vitre…</w:t>
-      </w:r>
-    </w:p>
-    <w:p>
-      <w:pPr>
-        <w:pStyle w:val="keywords"/>
-      </w:pPr>
-      <w:r>
-        <w:lastRenderedPageBreak/>
-        <w:t>HGTα(</w:t>
-      </w:r>
-      <w:r>
-        <w:t>1.47</w:t>
-      </w:r>
-      <w:r>
-        <w:t>)</w:t>
-      </w:r>
-      <w:r>
-        <w:t> : poulpe, calmar, tentacule, monstre, céphalopode, ventouse, bec, vitre, charnu, harpon…</w:t>
-      </w:r>
-    </w:p>
-    <w:p>
-      <w:pPr>
-        <w:pStyle w:val="keywords"/>
-      </w:pPr>
-      <w:r>
-        <w:t>G²α(</w:t>
-      </w:r>
-      <w:r>
-        <w:t>0.56</w:t>
-      </w:r>
-      <w:r>
-        <w:t>)</w:t>
-      </w:r>
-      <w:r>
-        <w:t> : poulpe, calmar, monstre, tentacule, céphalopode, ventouse, bec, vitre, charnu, harpon</w:t>
-      </w:r>
-      <w:r>
-        <w:t>…</w:t>
-      </w:r>
-    </w:p>
-    <w:p>
-      <w:pPr>
-        <w:pStyle w:val="keywords"/>
-      </w:pPr>
-      <w:r>
-        <w:t>χ²α(</w:t>
-      </w:r>
-      <w:r>
-        <w:t>0.43</w:t>
-      </w:r>
-      <w:r>
-        <w:t>)</w:t>
-      </w:r>
-      <w:r>
-        <w:t> : poulpe, calmar, tentacule, monstre, céphalopode, ventouse, bec, charnu, vitre, harpon</w:t>
-      </w:r>
-    </w:p>
-    <w:p>
-      <w:pPr>
-        <w:ind w:firstLine="0"/>
-      </w:pPr>
-    </w:p>
-    <w:p>
-      <w:pPr>
-        <w:ind w:firstLine="0"/>
-      </w:pPr>
-      <w:r>
-        <w:t>Avec un paramètre</w:t>
-      </w:r>
-      <w:r>
-        <w:t xml:space="preserve"> α qui</w:t>
-      </w:r>
-      <w:r>
-        <w:t xml:space="preserve"> </w:t>
-      </w:r>
-      <w:r>
-        <w:t>rel</w:t>
-      </w:r>
-      <w:r>
-        <w:t>è</w:t>
-      </w:r>
-      <w:r>
-        <w:t>v</w:t>
-      </w:r>
-      <w:r>
-        <w:t>e</w:t>
-      </w:r>
-      <w:r>
-        <w:t xml:space="preserve"> les hautes fréquences</w:t>
-      </w:r>
-      <w:r>
-        <w:t xml:space="preserve"> (le</w:t>
-      </w:r>
-      <w:r>
-        <w:t xml:space="preserve"> </w:t>
-      </w:r>
-      <w:r>
-        <w:rPr>
-          <w:i/>
-          <w:iCs/>
-        </w:rPr>
-        <w:t>tf</w:t>
-      </w:r>
-      <w:r>
-        <w:t>),</w:t>
-      </w:r>
-      <w:r>
-        <w:t xml:space="preserve"> </w:t>
-      </w:r>
-      <w:r>
-        <w:t>la</w:t>
-      </w:r>
-      <w:r>
-        <w:t xml:space="preserve"> </w:t>
-      </w:r>
-      <w:r>
-        <w:t>tendance du χ²</w:t>
-      </w:r>
-      <w:r>
-        <w:t xml:space="preserve"> </w:t>
-      </w:r>
-      <w:r>
-        <w:t>aux mots exclusifs se déplace</w:t>
-      </w:r>
-      <w:r>
-        <w:t xml:space="preserve"> un peu</w:t>
-      </w:r>
-      <w:r>
-        <w:t xml:space="preserve"> vers le bas du tableau, mais elle reste importante, dès le rang 17 on trouvera : </w:t>
-      </w:r>
-      <w:r>
-        <w:rPr>
-          <w:i/>
-          <w:iCs/>
-        </w:rPr>
-        <w:t>espalier, violacé, quenotte, suceur, brachioures, clupanodons, corégone, fissurelles, gobies-plumiers, krak</w:t>
-      </w:r>
-      <w:r>
-        <w:t xml:space="preserve">… </w:t>
-      </w:r>
-      <w:r>
-        <w:t>La formule</w:t>
-      </w:r>
-      <w:r>
-        <w:t xml:space="preserve"> native</w:t>
-      </w:r>
-      <w:r>
-        <w:t xml:space="preserve"> de TXM, sans paramétrage α, n’est pas indemne de cet inconvénient, même si elle le retarde au rang 47</w:t>
-      </w:r>
-      <w:r>
-        <w:t>.</w:t>
-      </w:r>
-      <w:r>
-        <w:t xml:space="preserve"> </w:t>
-      </w:r>
-      <w:r>
-        <w:t>Un paramétrage permet donc de faire</w:t>
-      </w:r>
-      <w:r>
-        <w:t xml:space="preserve"> vari</w:t>
-      </w:r>
-      <w:r>
-        <w:t>er</w:t>
-      </w:r>
-      <w:r>
-        <w:t xml:space="preserve"> </w:t>
-      </w:r>
-      <w:r>
-        <w:t>le</w:t>
-      </w:r>
-      <w:r>
-        <w:t xml:space="preserve"> ran</w:t>
-      </w:r>
-      <w:r>
-        <w:t>g</w:t>
-      </w:r>
-      <w:r>
-        <w:t xml:space="preserve"> des hapax</w:t>
-      </w:r>
-      <w:r>
-        <w:t>, mais chaque formule conserve un comportement spécifique à l’égard des hapax. On peut en donner une image graphique.</w:t>
-      </w:r>
-    </w:p>
-    <w:p>
-      <w:pPr>
-        <w:ind w:firstLine="0"/>
-      </w:pPr>
-    </w:p>
-    <w:p>
-      <w:pPr>
-        <w:ind w:firstLine="0"/>
-      </w:pPr>
-      <w:r>
-        <w:t>Soi</w:t>
-      </w:r>
-      <w:r>
-        <w:t>en</w:t>
-      </w:r>
-      <w:r>
-        <w:t>t tous les mots clés de</w:t>
-      </w:r>
-      <w:r>
-        <w:t xml:space="preserve"> ce chapitre</w:t>
-      </w:r>
-      <w:r>
-        <w:t xml:space="preserve"> « Les poulpes ». Soit un point pour chaque mot-clé sur une bande, où la longueur indique </w:t>
-      </w:r>
-      <w:r>
-        <w:t>son</w:t>
-      </w:r>
-      <w:r>
-        <w:t xml:space="preserve"> rang</w:t>
-      </w:r>
-      <w:r>
-        <w:t xml:space="preserve"> dans la liste, et la hauteur indique si le mot est de fréquence haute ou basse dans Jules Verne.</w:t>
-      </w:r>
-      <w:r>
-        <w:t xml:space="preserve"> </w:t>
-      </w:r>
-      <w:r>
-        <w:t>Le graphique 3</w:t>
-      </w:r>
-      <w:r>
-        <w:t xml:space="preserve"> </w:t>
-      </w:r>
-      <w:r>
-        <w:t>fait apparaître</w:t>
-      </w:r>
-      <w:r>
-        <w:t xml:space="preserve"> plusieurs phénomènes pour </w:t>
-      </w:r>
-      <w:r>
-        <w:t>ces différentes formules de spécificité</w:t>
-      </w:r>
-      <w:r>
-        <w:t>.</w:t>
-      </w:r>
-    </w:p>
-    <w:p>
-      <w:pPr>
-        <w:pStyle w:val="ListParagraph"/>
-        <w:numPr>
-          <w:ilvl w:val="0"/>
-          <w:numId w:val="3"/>
-        </w:numPr>
-      </w:pPr>
-      <w:r>
-        <w:t>D’abord, les listes de mot-clés selon le χ² et TXM sont plus courtes, parce que ces scores peuvent être négatifs pour des mots spécialement rares relativement au reste du corpus</w:t>
-      </w:r>
-      <w:r>
-        <w:t xml:space="preserve">, et donc </w:t>
-      </w:r>
-      <w:r>
-        <w:t>ils</w:t>
-      </w:r>
-      <w:r>
-        <w:t xml:space="preserve"> sont </w:t>
-      </w:r>
-      <w:r>
-        <w:t>retirés des listes de</w:t>
-      </w:r>
-      <w:r>
-        <w:t xml:space="preserve"> mots-clés</w:t>
-      </w:r>
-      <w:r>
-        <w:t>.</w:t>
-      </w:r>
-    </w:p>
-    <w:p>
-      <w:pPr>
-        <w:pStyle w:val="ListParagraph"/>
-        <w:numPr>
-          <w:ilvl w:val="0"/>
-          <w:numId w:val="3"/>
-        </w:numPr>
-      </w:pPr>
-      <w:r>
-        <w:t xml:space="preserve">La fréquence des termes relativement au corpus, TF, </w:t>
-      </w:r>
-      <w:r>
-        <w:t xml:space="preserve">montre </w:t>
-      </w:r>
-      <w:r>
-        <w:t xml:space="preserve">de belles lignes continues </w:t>
-      </w:r>
-      <w:r>
-        <w:t>légèrement ascendantes</w:t>
-      </w:r>
-      <w:r>
-        <w:t xml:space="preserve"> pour tf=1, 2, 3, 4…</w:t>
-      </w:r>
-      <w:r>
-        <w:t xml:space="preserve"> Ce</w:t>
-      </w:r>
-      <w:r>
-        <w:t>ci</w:t>
-      </w:r>
-      <w:r>
-        <w:t xml:space="preserve"> n’est pas un hasard. En effet, pour un même score </w:t>
-      </w:r>
-      <w:r>
-        <w:rPr>
-          <w:i/>
-          <w:iCs/>
-        </w:rPr>
-        <w:t>tf</w:t>
-      </w:r>
-      <w:r>
-        <w:t xml:space="preserve"> (ex : </w:t>
-      </w:r>
-      <w:r>
-        <w:rPr>
-          <w:i/>
-          <w:iCs/>
-        </w:rPr>
-        <w:t>tf</w:t>
-      </w:r>
-      <w:r>
-        <w:t xml:space="preserve"> = 1), l’algorithme n’agglomère pas tous les mots sur un même rang, il</w:t>
-      </w:r>
-      <w:r>
-        <w:t>s</w:t>
-      </w:r>
-      <w:r>
-        <w:t xml:space="preserve"> sont rangés en fonction d’un </w:t>
-      </w:r>
-      <w:r>
-        <w:t>second</w:t>
-      </w:r>
-      <w:r>
-        <w:t xml:space="preserve"> critère</w:t>
-      </w:r>
-      <w:r>
-        <w:t xml:space="preserve"> (-</w:t>
-      </w:r>
-      <w:r>
-        <w:rPr>
-          <w:i/>
-          <w:iCs/>
-        </w:rPr>
-        <w:t>cf</w:t>
-      </w:r>
-      <w:r>
-        <w:t>)</w:t>
-      </w:r>
-      <w:r>
-        <w:t xml:space="preserve">, </w:t>
-      </w:r>
-      <w:r>
-        <w:t xml:space="preserve">qui étagent les mots </w:t>
-      </w:r>
-      <w:r>
-        <w:t xml:space="preserve">du rare au fréquent </w:t>
-      </w:r>
-      <w:r>
-        <w:t>selon</w:t>
-      </w:r>
-      <w:r>
-        <w:t xml:space="preserve"> </w:t>
-      </w:r>
-      <w:r>
-        <w:t>Verne</w:t>
-      </w:r>
-      <w:r>
-        <w:t>.</w:t>
-      </w:r>
-    </w:p>
-    <w:p>
-      <w:pPr>
-        <w:pStyle w:val="ListParagraph"/>
-        <w:numPr>
-          <w:ilvl w:val="0"/>
-          <w:numId w:val="3"/>
-        </w:numPr>
-      </w:pPr>
-      <w:r>
-        <w:t>Plusieurs formules</w:t>
-      </w:r>
-      <w:r>
-        <w:t>, même non paramétrées,</w:t>
-      </w:r>
-      <w:r>
-        <w:t xml:space="preserve"> observe</w:t>
-      </w:r>
-      <w:r>
-        <w:t>nt</w:t>
-      </w:r>
-      <w:r>
-        <w:t xml:space="preserve"> des alignements pour </w:t>
-      </w:r>
-      <w:r>
-        <w:rPr>
-          <w:i/>
-          <w:iCs/>
-        </w:rPr>
-        <w:t>tf</w:t>
-      </w:r>
-      <w:r>
-        <w:t xml:space="preserve"> = 2 et </w:t>
-      </w:r>
-      <w:r>
-        <w:rPr>
-          <w:i/>
-          <w:iCs/>
-        </w:rPr>
-        <w:t>tf</w:t>
-      </w:r>
-      <w:r>
-        <w:t xml:space="preserve"> = 3, comme pour TF.</w:t>
-      </w:r>
-    </w:p>
-    <w:p>
-      <w:pPr>
-        <w:pStyle w:val="ListParagraph"/>
-        <w:numPr>
-          <w:ilvl w:val="0"/>
-          <w:numId w:val="3"/>
-        </w:numPr>
-      </w:pPr>
-      <w:r>
-        <w:t>Toutes les</w:t>
-      </w:r>
-      <w:r>
-        <w:t xml:space="preserve"> formules</w:t>
-      </w:r>
-      <w:r>
-        <w:t xml:space="preserve"> </w:t>
-      </w:r>
-      <w:r>
-        <w:t xml:space="preserve">observent </w:t>
-      </w:r>
-      <w:r>
-        <w:t>la</w:t>
-      </w:r>
-      <w:r>
-        <w:t xml:space="preserve"> ligne de base</w:t>
-      </w:r>
-      <w:r>
-        <w:t xml:space="preserve"> </w:t>
-      </w:r>
-      <w:r>
-        <w:t>en jaune</w:t>
-      </w:r>
-      <w:r>
-        <w:t xml:space="preserve"> qui</w:t>
-      </w:r>
-      <w:r>
-        <w:t xml:space="preserve"> commence par un segment plat (</w:t>
-      </w:r>
-      <w:r>
-        <w:rPr>
-          <w:i/>
-          <w:iCs/>
-        </w:rPr>
-        <w:t>tf</w:t>
-      </w:r>
-      <w:r>
-        <w:t> = </w:t>
-      </w:r>
-      <w:r>
-        <w:rPr>
-          <w:i/>
-          <w:iCs/>
-        </w:rPr>
-        <w:t>cf</w:t>
-      </w:r>
-      <w:r>
-        <w:t xml:space="preserve"> =1), les hapax. </w:t>
-      </w:r>
-      <w:r>
-        <w:t>TXM semble « m</w:t>
-      </w:r>
-      <w:r>
-        <w:t>eilleur</w:t>
-      </w:r>
-      <w:r>
-        <w:t> » que G² selon ce critère, mais en ce cas subTF-IDFα(0,56) serait encore « m</w:t>
-      </w:r>
-      <w:r>
-        <w:t>eilleur</w:t>
-      </w:r>
-      <w:r>
-        <w:t xml:space="preserve"> », sans que l’on </w:t>
-      </w:r>
-      <w:r>
-        <w:t>perçoive</w:t>
-      </w:r>
-      <w:r>
-        <w:t xml:space="preserve"> </w:t>
-      </w:r>
-      <w:r>
-        <w:t>encore</w:t>
-      </w:r>
-      <w:r>
-        <w:t xml:space="preserve"> quel est</w:t>
-      </w:r>
-      <w:r>
-        <w:t xml:space="preserve"> l’intérêt sémantique.</w:t>
-      </w:r>
-    </w:p>
-    <w:p>
-      <w:pPr>
-        <w:pStyle w:val="ListParagraph"/>
-        <w:numPr>
-          <w:ilvl w:val="0"/>
-          <w:numId w:val="3"/>
-        </w:numPr>
-      </w:pPr>
-      <w:r>
-        <w:t>Qua</w:t>
-      </w:r>
-      <w:r>
-        <w:t>n</w:t>
-      </w:r>
-      <w:r>
-        <w:t xml:space="preserve">t à </w:t>
-      </w:r>
-      <w:r>
-        <w:t>TF-IDFα(16)</w:t>
-      </w:r>
-      <w:r>
-        <w:t>, elle</w:t>
-      </w:r>
-      <w:r>
-        <w:t xml:space="preserve"> est principalement conduit</w:t>
-      </w:r>
-      <w:r>
-        <w:t>e</w:t>
-      </w:r>
-      <w:r>
-        <w:t xml:space="preserve"> par la ligne jaune des mots rares dans le chapitre (</w:t>
-      </w:r>
-      <w:r>
-        <w:rPr>
-          <w:i/>
-          <w:iCs/>
-        </w:rPr>
-        <w:t>tf</w:t>
-      </w:r>
-      <w:r>
-        <w:t xml:space="preserve"> = 1), commençant par les mots rares dans le corpus (</w:t>
-      </w:r>
-      <w:r>
-        <w:rPr>
-          <w:i/>
-          <w:iCs/>
-        </w:rPr>
-        <w:t>cf</w:t>
-      </w:r>
-      <w:r>
-        <w:t xml:space="preserve"> = 1), finissant par </w:t>
-      </w:r>
-      <w:r>
-        <w:rPr>
-          <w:i/>
-          <w:iCs/>
-        </w:rPr>
-        <w:t>cf</w:t>
-      </w:r>
-      <w:r>
-        <w:rPr>
-          <w:vertAlign w:val="subscript"/>
-        </w:rPr>
-        <w:t>max</w:t>
-      </w:r>
-      <w:r>
-        <w:t xml:space="preserve">. Des mots </w:t>
-      </w:r>
-      <w:r>
-        <w:t>à tf &gt; 1</w:t>
-      </w:r>
-      <w:r>
-        <w:t xml:space="preserve"> </w:t>
-      </w:r>
-      <w:r>
-        <w:t>s’insèrent</w:t>
-      </w:r>
-      <w:r>
-        <w:t xml:space="preserve"> en ordre dispersé</w:t>
-      </w:r>
-      <w:r>
-        <w:t xml:space="preserve"> dans la courbe générale</w:t>
-      </w:r>
-      <w:r>
-        <w:t>.</w:t>
-      </w:r>
-    </w:p>
-    <w:p>
-      <w:pPr>
-        <w:ind w:firstLine="708"/>
-      </w:pPr>
-    </w:p>
-    <w:p>
-      <w:pPr>
-        <w:ind w:firstLine="0"/>
-      </w:pPr>
-      <w:r>
-        <w:t xml:space="preserve">Graphique 3. Jule Verne, </w:t>
-      </w:r>
-      <w:r>
-        <w:rPr>
-          <w:i/>
-          <w:iCs/>
-        </w:rPr>
-        <w:t>20 000 lieues sous les mers</w:t>
-      </w:r>
-      <w:r>
-        <w:t>, « les poulpes », dispersion des mots-clés selon plusieurs formules de spécificité</w:t>
-      </w:r>
-    </w:p>
-    <w:p>
-      <w:pPr>
-        <w:ind w:firstLine="0"/>
-      </w:pPr>
-      <w:r>
         <w:rPr>
           <w:noProof/>
         </w:rPr>
-        <w:lastRenderedPageBreak/>
-        <w:drawing>
-          <wp:anchor distT="0" distB="0" distL="114300" distR="114300" simplePos="0" relativeHeight="251671552" behindDoc="0" locked="0" layoutInCell="1" allowOverlap="1" wp14:anchorId="1833F320" wp14:editId="6640A808">
-            <wp:simplePos x="0" y="0"/>
-            <wp:positionH relativeFrom="column">
-              <wp:posOffset>0</wp:posOffset>
-            </wp:positionH>
-            <wp:positionV relativeFrom="paragraph">
-              <wp:posOffset>0</wp:posOffset>
-            </wp:positionV>
-            <wp:extent cx="5755640" cy="4191635"/>
-            <wp:effectExtent l="0" t="0" r="0" b="0"/>
-            <wp:wrapTopAndBottom/>
-            <wp:docPr id="907993736" name="Picture 2"/>
-            <wp:cNvGraphicFramePr>
-              <a:graphicFrameLocks xmlns:a="http://schemas.openxmlformats.org/drawingml/2006/main" noChangeAspect="1"/>
-            </wp:cNvGraphicFramePr>
-            <a:graphic xmlns:a="http://schemas.openxmlformats.org/drawingml/2006/main">
-              <a:graphicData uri="http://schemas.openxmlformats.org/drawingml/2006/picture">
-                <pic:pic xmlns:pic="http://schemas.openxmlformats.org/drawingml/2006/picture">
-                  <pic:nvPicPr>
-                    <pic:cNvPr id="0" name="Picture 3"/>
-                    <pic:cNvPicPr>
-                      <a:picLocks noChangeAspect="1" noChangeArrowheads="1"/>
-                    </pic:cNvPicPr>
-                  </pic:nvPicPr>
-                  <pic:blipFill>
-                    <a:blip r:embed="rId13" cstate="print">
-                      <a:extLst>
-                        <a:ext uri="{28A0092B-C50C-407E-A947-70E740481C1C}">
-                          <a14:useLocalDpi xmlns:a14="http://schemas.microsoft.com/office/drawing/2010/main" val="0"/>
-                        </a:ext>
-                      </a:extLst>
-                    </a:blip>
-                    <a:srcRect/>
-                    <a:stretch>
-                      <a:fillRect/>
-                    </a:stretch>
-                  </pic:blipFill>
-                  <pic:spPr bwMode="auto">
-                    <a:xfrm>
-                      <a:off x="0" y="0"/>
-                      <a:ext cx="5755640" cy="4191635"/>
-                    </a:xfrm>
-                    <a:prstGeom prst="rect">
-                      <a:avLst/>
-                    </a:prstGeom>
-                    <a:noFill/>
-                    <a:ln>
-                      <a:noFill/>
-                    </a:ln>
-                  </pic:spPr>
-                </pic:pic>
-              </a:graphicData>
-            </a:graphic>
-            <wp14:sizeRelH relativeFrom="page">
-              <wp14:pctWidth>0</wp14:pctWidth>
-            </wp14:sizeRelH>
-            <wp14:sizeRelV relativeFrom="page">
-              <wp14:pctHeight>0</wp14:pctHeight>
-            </wp14:sizeRelV>
-          </wp:anchor>
-        </w:drawing>
-      </w:r>
-    </w:p>
-    <w:p>
-      <w:pPr>
-        <w:ind w:firstLine="0"/>
-      </w:pPr>
-      <w:r>
-        <w:t>Le paramétrage d’une fonction de spécificité permet donc de retarder l’apparition des hapax, et donc d’augmenter la couche de rangs utiles à la spécification du texte. Cette épaisseur n’est pas à destination des humains, qui va lire plus de 50 mots-clés ? Elle est utile pour des applications comme le rapprochement de textes par leurs mots saillants. Cependant les fonctions gardent une tendance. Ainsi sur</w:t>
-      </w:r>
-      <w:r>
-        <w:t xml:space="preserve"> la ligne intérieure du croissant</w:t>
-      </w:r>
-      <w:r>
-        <w:t>,</w:t>
-      </w:r>
-      <w:r>
-        <w:t xml:space="preserve"> par exemple χ²α(0,43), le segment des hapax commence plus vite que pour la ligne extérieure du croissant</w:t>
-      </w:r>
-      <w:r>
-        <w:t xml:space="preserve">, </w:t>
-      </w:r>
-      <w:r>
-        <w:t>par exemple subTF-IDFα(0,56)</w:t>
-      </w:r>
-      <w:r>
-        <w:t xml:space="preserve">. </w:t>
-      </w:r>
-      <w:r>
-        <w:t>Un paramétrage ne change par la nature du signal lexical capté, nous allons maintenant l’observer sur les fréquences hautes.</w:t>
-      </w:r>
-    </w:p>
-    <w:p>
-      <w:pPr>
-        <w:pStyle w:val="Heading1"/>
-      </w:pPr>
-      <w:r>
-        <w:t>§</w:t>
-      </w:r>
-      <w:r>
-        <w:t>9</w:t>
-      </w:r>
-      <w:r>
-        <w:t>.</w:t>
-      </w:r>
-      <w:r>
-        <w:t xml:space="preserve"> </w:t>
-      </w:r>
-      <w:r>
-        <w:t>Panaches de mots vides</w:t>
-      </w:r>
-    </w:p>
-    <w:p>
-      <w:pPr>
-        <w:ind w:firstLine="0"/>
-      </w:pPr>
-      <w:r>
-        <w:t xml:space="preserve">Comparons les formules de spécificités sur les hautes fréquences. </w:t>
-      </w:r>
-      <w:r>
-        <w:t>Soi</w:t>
-      </w:r>
-      <w:r>
-        <w:t>ent plus de 7000</w:t>
-      </w:r>
-      <w:r>
-        <w:t xml:space="preserve"> chapitres de romans avec les mots grammaticaux</w:t>
-      </w:r>
-      <w:r>
-        <w:t>. D</w:t>
-      </w:r>
-      <w:r>
-        <w:t>es listes de mots-clés sont ordonnés par différentes formules, observons le ran</w:t>
-      </w:r>
-      <w:r>
-        <w:t>g</w:t>
-      </w:r>
-      <w:r>
-        <w:t xml:space="preserve"> </w:t>
-      </w:r>
-      <w:r>
-        <w:t>médian</w:t>
-      </w:r>
-      <w:r>
-        <w:t xml:space="preserve"> de mots très fréquents comme </w:t>
-      </w:r>
-      <w:r>
-        <w:rPr>
-          <w:i/>
-          <w:iCs/>
-        </w:rPr>
-        <w:t>le, de, un, être, et, que…</w:t>
-      </w:r>
-      <w:r>
-        <w:t xml:space="preserve"> ; mais aussi plus bas dans la liste comme : </w:t>
-      </w:r>
-      <w:r>
-        <w:rPr>
-          <w:i/>
-          <w:iCs/>
-        </w:rPr>
-        <w:t>dire, voir, aller, savoir, venir…</w:t>
-      </w:r>
-    </w:p>
-    <w:p>
-      <w:pPr>
-        <w:ind w:firstLine="0"/>
-      </w:pPr>
-    </w:p>
-    <w:p>
-      <w:pPr>
-        <w:ind w:firstLine="0"/>
-      </w:pPr>
-      <w:r>
-        <w:t xml:space="preserve">Graphique 4. Rang </w:t>
-      </w:r>
-      <w:r>
-        <w:t>médian</w:t>
-      </w:r>
-      <w:r>
-        <w:t xml:space="preserve"> </w:t>
-      </w:r>
-      <w:r>
-        <w:t xml:space="preserve">des mots les plus fréquents avec </w:t>
-      </w:r>
-      <w:r>
-        <w:t>« boîte à moustache</w:t>
-      </w:r>
-      <w:r>
-        <w:t>s »</w:t>
-      </w:r>
-      <w:r>
-        <w:t>.</w:t>
-      </w:r>
-    </w:p>
-    <w:p>
-      <w:pPr>
-        <w:ind w:firstLine="0"/>
-      </w:pPr>
-      <w:r>
-        <w:rPr>
-          <w:noProof/>
-        </w:rPr>
-        <w:lastRenderedPageBreak/>
         <w:drawing>
           <wp:anchor distT="0" distB="0" distL="114300" distR="114300" simplePos="0" relativeHeight="251672576" behindDoc="0" locked="0" layoutInCell="1" allowOverlap="1" wp14:anchorId="338A2090" wp14:editId="6D866471">
             <wp:simplePos x="0" y="0"/>
@@ -10721,7 +8244,7 @@
                     </pic:cNvPicPr>
                   </pic:nvPicPr>
                   <pic:blipFill>
-                    <a:blip r:embed="rId14" cstate="print">
+                    <a:blip r:embed="rId13" cstate="print">
                       <a:extLst>
                         <a:ext uri="{28A0092B-C50C-407E-A947-70E740481C1C}">
                           <a14:useLocalDpi xmlns:a14="http://schemas.microsoft.com/office/drawing/2010/main" val="0"/>
@@ -10982,7 +8505,7 @@
                     </pic:cNvPicPr>
                   </pic:nvPicPr>
                   <pic:blipFill>
-                    <a:blip r:embed="rId15">
+                    <a:blip r:embed="rId14">
                       <a:extLst>
                         <a:ext uri="{28A0092B-C50C-407E-A947-70E740481C1C}">
                           <a14:useLocalDpi xmlns:a14="http://schemas.microsoft.com/office/drawing/2010/main" val="0"/>
@@ -12101,7 +9624,7 @@
         <w:noBreakHyphen/>
         <w:t xml:space="preserve">33. </w:t>
       </w:r>
-      <w:hyperlink r:id="rId16" w:history="1">
+      <w:hyperlink r:id="rId15" w:history="1">
         <w:r>
           <w:rPr>
             <w:rStyle w:val="Hyperlink"/>
@@ -12142,7 +9665,7 @@
         <w:noBreakHyphen/>
         <w:t xml:space="preserve">29. </w:t>
       </w:r>
-      <w:hyperlink r:id="rId17" w:history="1">
+      <w:hyperlink r:id="rId16" w:history="1">
         <w:r>
           <w:rPr>
             <w:rStyle w:val="Hyperlink"/>
@@ -12196,7 +9719,7 @@
         <w:noBreakHyphen/>
         <w:t xml:space="preserve">74. </w:t>
       </w:r>
-      <w:hyperlink r:id="rId18" w:history="1">
+      <w:hyperlink r:id="rId17" w:history="1">
         <w:r>
           <w:rPr>
             <w:rStyle w:val="Hyperlink"/>
@@ -12223,7 +9746,7 @@
       <w:r>
         <w:t xml:space="preserve"> [Universität Stuttgart]. </w:t>
       </w:r>
-      <w:hyperlink r:id="rId19" w:history="1">
+      <w:hyperlink r:id="rId18" w:history="1">
         <w:r>
           <w:rPr>
             <w:rStyle w:val="Hyperlink"/>
@@ -12263,13 +9786,27 @@
         <w:noBreakHyphen/>
         <w:t xml:space="preserve">205. </w:t>
       </w:r>
-      <w:hyperlink r:id="rId20" w:history="1">
+      <w:hyperlink r:id="rId19" w:history="1">
         <w:r>
           <w:rPr>
             <w:rStyle w:val="Hyperlink"/>
             <w:lang w:val="fr-CH"/>
           </w:rPr>
-          <w:t>https://osf.io/cy6mw/overview</w:t>
+          <w:t>https://osf.io/cy6mw/overv</w:t>
+        </w:r>
+        <w:r>
+          <w:rPr>
+            <w:rStyle w:val="Hyperlink"/>
+            <w:lang w:val="fr-CH"/>
+          </w:rPr>
+          <w:t>i</w:t>
+        </w:r>
+        <w:r>
+          <w:rPr>
+            <w:rStyle w:val="Hyperlink"/>
+            <w:lang w:val="fr-CH"/>
+          </w:rPr>
+          <w:t>ew</w:t>
         </w:r>
       </w:hyperlink>
     </w:p>
@@ -12294,7 +9831,7 @@
         <w:noBreakHyphen/>
         <w:t xml:space="preserve">398). Institute for Digital Enhancement of Cognitive Development, Waseda University. </w:t>
       </w:r>
-      <w:hyperlink r:id="rId21" w:history="1">
+      <w:hyperlink r:id="rId20" w:history="1">
         <w:r>
           <w:rPr>
             <w:rStyle w:val="Hyperlink"/>
@@ -12334,7 +9871,7 @@
         <w:noBreakHyphen/>
         <w:t xml:space="preserve">55. </w:t>
       </w:r>
-      <w:hyperlink r:id="rId22" w:history="1">
+      <w:hyperlink r:id="rId21" w:history="1">
         <w:r>
           <w:rPr>
             <w:rStyle w:val="Hyperlink"/>
@@ -12391,7 +9928,7 @@
         <w:noBreakHyphen/>
         <w:t xml:space="preserve">165. </w:t>
       </w:r>
-      <w:hyperlink r:id="rId23" w:history="1">
+      <w:hyperlink r:id="rId22" w:history="1">
         <w:r>
           <w:rPr>
             <w:rStyle w:val="Hyperlink"/>
@@ -12428,7 +9965,7 @@
         </w:rPr>
         <w:t xml:space="preserve">. Dunod. Paris. </w:t>
       </w:r>
-      <w:hyperlink r:id="rId24" w:history="1">
+      <w:hyperlink r:id="rId23" w:history="1">
         <w:r>
           <w:rPr>
             <w:rStyle w:val="Hyperlink"/>
@@ -12503,7 +10040,7 @@
         <w:noBreakHyphen/>
         <w:t xml:space="preserve">712). Presses universitaires de Louvain. </w:t>
       </w:r>
-      <w:hyperlink r:id="rId25" w:history="1">
+      <w:hyperlink r:id="rId24" w:history="1">
         <w:r>
           <w:rPr>
             <w:rStyle w:val="Hyperlink"/>
@@ -12590,7 +10127,7 @@
         <w:noBreakHyphen/>
         <w:t xml:space="preserve">398. </w:t>
       </w:r>
-      <w:hyperlink r:id="rId26" w:history="1">
+      <w:hyperlink r:id="rId25" w:history="1">
         <w:r>
           <w:rPr>
             <w:rStyle w:val="Hyperlink"/>
@@ -12626,7 +10163,7 @@
       <w:r>
         <w:t xml:space="preserve">(4), 20:1-20:38. </w:t>
       </w:r>
-      <w:hyperlink r:id="rId27" w:history="1">
+      <w:hyperlink r:id="rId26" w:history="1">
         <w:r>
           <w:rPr>
             <w:rStyle w:val="Hyperlink"/>
@@ -12636,7 +10173,7 @@
       </w:hyperlink>
     </w:p>
     <w:sectPr>
-      <w:footerReference w:type="default" r:id="rId28"/>
+      <w:footerReference w:type="default" r:id="rId27"/>
       <w:pgSz w:w="11906" w:h="16838"/>
       <w:pgMar w:top="1417" w:right="1417" w:bottom="1417" w:left="1417" w:header="708" w:footer="708" w:gutter="0"/>
       <w:cols w:space="708"/>

</xml_diff>